<commit_message>
Matchs Toussaint Gr9-10: ajout colonnes week-ends (24-25/10 et 31/10-01/11)
Grille etendue a 9 jours: Sam 24/10 -> Dim 01/11. Seul match de week-end
programme a ce jour: Gentchev - Oree Messieurs 3, dim 25/10 13h00. Les
autres week-ends restent NC (prochains tours a programmer).

Co-Authored-By: Claude Opus 4.8 <noreply@anthropic.com>
Claude-Session: https://claude.ai/code/session_013WShXcCyBkE1H1x1qzmtZK
</commit_message>
<xml_diff>
--- a/Liste_des_matchs_Toussaint_Gr9-10.docx
+++ b/Liste_des_matchs_Toussaint_Gr9-10.docx
@@ -75,7 +75,7 @@
           <w:sz w:val="20"/>
           <w:szCs w:val="20"/>
         </w:rPr>
-        <w:t xml:space="preserve">Semaine du 26 au 30 octobre 2026 – Groupes 9 &amp; 10 (Compétition)</w:t>
+        <w:t xml:space="preserve">Semaine du 26 au 30 octobre 2026 (week-ends 24-25/10 et 31/10-01/11 inclus) – Groupes 9 &amp; 10 (Compétition)</w:t>
       </w:r>
     </w:p>
     <w:p>
@@ -95,7 +95,7 @@
     </w:p>
     <w:tbl>
       <w:tblPr>
-        <w:tblW w:type="dxa" w:w="13950"/>
+        <w:tblW w:type="dxa" w:w="15701"/>
         <w:tblBorders>
           <w:top w:val="single" w:color="AAAAAA" w:sz="4"/>
           <w:left w:val="single" w:color="AAAAAA" w:sz="4"/>
@@ -106,13 +106,17 @@
         </w:tblBorders>
       </w:tblPr>
       <w:tblGrid>
-        <w:gridCol w:w="3050"/>
-        <w:gridCol w:w="3750"/>
-        <w:gridCol w:w="1430"/>
-        <w:gridCol w:w="1430"/>
-        <w:gridCol w:w="1430"/>
-        <w:gridCol w:w="1430"/>
-        <w:gridCol w:w="1430"/>
+        <w:gridCol w:w="2100"/>
+        <w:gridCol w:w="2900"/>
+        <w:gridCol w:w="1189"/>
+        <w:gridCol w:w="1189"/>
+        <w:gridCol w:w="1189"/>
+        <w:gridCol w:w="1189"/>
+        <w:gridCol w:w="1189"/>
+        <w:gridCol w:w="1189"/>
+        <w:gridCol w:w="1189"/>
+        <w:gridCol w:w="1189"/>
+        <w:gridCol w:w="1189"/>
       </w:tblGrid>
       <w:tr>
         <w:trPr>
@@ -120,7 +124,7 @@
         </w:trPr>
         <w:tc>
           <w:tcPr>
-            <w:tcW w:type="dxa" w:w="3050"/>
+            <w:tcW w:type="dxa" w:w="2100"/>
             <w:shd w:fill="4E6E1F" w:color="auto" w:val="clear"/>
             <w:vAlign w:val="center"/>
           </w:tcPr>
@@ -145,7 +149,7 @@
         </w:tc>
         <w:tc>
           <w:tcPr>
-            <w:tcW w:type="dxa" w:w="3750"/>
+            <w:tcW w:type="dxa" w:w="2900"/>
             <w:shd w:fill="4E6E1F" w:color="auto" w:val="clear"/>
             <w:vAlign w:val="center"/>
           </w:tcPr>
@@ -170,7 +174,7 @@
         </w:tc>
         <w:tc>
           <w:tcPr>
-            <w:tcW w:type="dxa" w:w="1430"/>
+            <w:tcW w:type="dxa" w:w="1189"/>
             <w:shd w:fill="4E6E1F" w:color="auto" w:val="clear"/>
             <w:vAlign w:val="center"/>
           </w:tcPr>
@@ -189,13 +193,63 @@
                 <w:sz w:val="18"/>
                 <w:szCs w:val="18"/>
               </w:rPr>
+              <w:t xml:space="preserve">Sam 24/10</w:t>
+            </w:r>
+          </w:p>
+        </w:tc>
+        <w:tc>
+          <w:tcPr>
+            <w:tcW w:type="dxa" w:w="1189"/>
+            <w:shd w:fill="4E6E1F" w:color="auto" w:val="clear"/>
+            <w:vAlign w:val="center"/>
+          </w:tcPr>
+          <w:p>
+            <w:pPr>
+              <w:spacing w:after="0" w:line="240"/>
+              <w:jc w:val="center"/>
+            </w:pPr>
+            <w:r>
+              <w:rPr>
+                <w:b/>
+                <w:bCs/>
+                <w:i w:val="false"/>
+                <w:iCs w:val="false"/>
+                <w:color w:val="FFFFFF"/>
+                <w:sz w:val="18"/>
+                <w:szCs w:val="18"/>
+              </w:rPr>
+              <w:t xml:space="preserve">Dim 25/10</w:t>
+            </w:r>
+          </w:p>
+        </w:tc>
+        <w:tc>
+          <w:tcPr>
+            <w:tcW w:type="dxa" w:w="1189"/>
+            <w:shd w:fill="4E6E1F" w:color="auto" w:val="clear"/>
+            <w:vAlign w:val="center"/>
+          </w:tcPr>
+          <w:p>
+            <w:pPr>
+              <w:spacing w:after="0" w:line="240"/>
+              <w:jc w:val="center"/>
+            </w:pPr>
+            <w:r>
+              <w:rPr>
+                <w:b/>
+                <w:bCs/>
+                <w:i w:val="false"/>
+                <w:iCs w:val="false"/>
+                <w:color w:val="FFFFFF"/>
+                <w:sz w:val="18"/>
+                <w:szCs w:val="18"/>
+              </w:rPr>
               <w:t xml:space="preserve">Lun 26/10</w:t>
             </w:r>
           </w:p>
         </w:tc>
         <w:tc>
           <w:tcPr>
-            <w:tcW w:type="dxa" w:w="1430"/>
+            <w:tcW w:type="dxa" w:w="1189"/>
             <w:shd w:fill="4E6E1F" w:color="auto" w:val="clear"/>
             <w:vAlign w:val="center"/>
           </w:tcPr>
@@ -220,7 +274,7 @@
         </w:tc>
         <w:tc>
           <w:tcPr>
-            <w:tcW w:type="dxa" w:w="1430"/>
+            <w:tcW w:type="dxa" w:w="1189"/>
             <w:shd w:fill="4E6E1F" w:color="auto" w:val="clear"/>
             <w:vAlign w:val="center"/>
           </w:tcPr>
@@ -245,7 +299,7 @@
         </w:tc>
         <w:tc>
           <w:tcPr>
-            <w:tcW w:type="dxa" w:w="1430"/>
+            <w:tcW w:type="dxa" w:w="1189"/>
             <w:shd w:fill="4E6E1F" w:color="auto" w:val="clear"/>
             <w:vAlign w:val="center"/>
           </w:tcPr>
@@ -270,7 +324,7 @@
         </w:tc>
         <w:tc>
           <w:tcPr>
-            <w:tcW w:type="dxa" w:w="1430"/>
+            <w:tcW w:type="dxa" w:w="1189"/>
             <w:shd w:fill="4E6E1F" w:color="auto" w:val="clear"/>
             <w:vAlign w:val="center"/>
           </w:tcPr>
@@ -290,6 +344,56 @@
                 <w:szCs w:val="18"/>
               </w:rPr>
               <w:t xml:space="preserve">Ven 30/10</w:t>
+            </w:r>
+          </w:p>
+        </w:tc>
+        <w:tc>
+          <w:tcPr>
+            <w:tcW w:type="dxa" w:w="1189"/>
+            <w:shd w:fill="4E6E1F" w:color="auto" w:val="clear"/>
+            <w:vAlign w:val="center"/>
+          </w:tcPr>
+          <w:p>
+            <w:pPr>
+              <w:spacing w:after="0" w:line="240"/>
+              <w:jc w:val="center"/>
+            </w:pPr>
+            <w:r>
+              <w:rPr>
+                <w:b/>
+                <w:bCs/>
+                <w:i w:val="false"/>
+                <w:iCs w:val="false"/>
+                <w:color w:val="FFFFFF"/>
+                <w:sz w:val="18"/>
+                <w:szCs w:val="18"/>
+              </w:rPr>
+              <w:t xml:space="preserve">Sam 31/10</w:t>
+            </w:r>
+          </w:p>
+        </w:tc>
+        <w:tc>
+          <w:tcPr>
+            <w:tcW w:type="dxa" w:w="1189"/>
+            <w:shd w:fill="4E6E1F" w:color="auto" w:val="clear"/>
+            <w:vAlign w:val="center"/>
+          </w:tcPr>
+          <w:p>
+            <w:pPr>
+              <w:spacing w:after="0" w:line="240"/>
+              <w:jc w:val="center"/>
+            </w:pPr>
+            <w:r>
+              <w:rPr>
+                <w:b/>
+                <w:bCs/>
+                <w:i w:val="false"/>
+                <w:iCs w:val="false"/>
+                <w:color w:val="FFFFFF"/>
+                <w:sz w:val="18"/>
+                <w:szCs w:val="18"/>
+              </w:rPr>
+              <w:t xml:space="preserve">Dim 01/11</w:t>
             </w:r>
           </w:p>
         </w:tc>
@@ -300,7 +404,7 @@
         </w:trPr>
         <w:tc>
           <w:tcPr>
-            <w:tcW w:type="dxa" w:w="3050"/>
+            <w:tcW w:type="dxa" w:w="2100"/>
             <w:vMerge w:val="restart"/>
             <w:vAlign w:val="center"/>
           </w:tcPr>
@@ -337,7 +441,7 @@
         </w:tc>
         <w:tc>
           <w:tcPr>
-            <w:tcW w:type="dxa" w:w="3750"/>
+            <w:tcW w:type="dxa" w:w="2900"/>
             <w:vAlign w:val="center"/>
           </w:tcPr>
           <w:p>
@@ -355,7 +459,21 @@
         </w:tc>
         <w:tc>
           <w:tcPr>
-            <w:tcW w:type="dxa" w:w="1430"/>
+            <w:tcW w:type="dxa" w:w="1189"/>
+            <w:vAlign w:val="center"/>
+          </w:tcPr>
+          <w:p/>
+        </w:tc>
+        <w:tc>
+          <w:tcPr>
+            <w:tcW w:type="dxa" w:w="1189"/>
+            <w:vAlign w:val="center"/>
+          </w:tcPr>
+          <w:p/>
+        </w:tc>
+        <w:tc>
+          <w:tcPr>
+            <w:tcW w:type="dxa" w:w="1189"/>
             <w:vAlign w:val="center"/>
           </w:tcPr>
           <w:p>
@@ -370,8 +488,8 @@
                 <w:i w:val="false"/>
                 <w:iCs w:val="false"/>
                 <w:color w:val="7FA02A"/>
-                <w:sz w:val="18"/>
-                <w:szCs w:val="18"/>
+                <w:sz w:val="16"/>
+                <w:szCs w:val="16"/>
               </w:rPr>
               <w:t xml:space="preserve">15h00</w:t>
             </w:r>
@@ -379,28 +497,42 @@
         </w:tc>
         <w:tc>
           <w:tcPr>
-            <w:tcW w:type="dxa" w:w="1430"/>
-            <w:vAlign w:val="center"/>
-          </w:tcPr>
-          <w:p/>
-        </w:tc>
-        <w:tc>
-          <w:tcPr>
-            <w:tcW w:type="dxa" w:w="1430"/>
-            <w:vAlign w:val="center"/>
-          </w:tcPr>
-          <w:p/>
-        </w:tc>
-        <w:tc>
-          <w:tcPr>
-            <w:tcW w:type="dxa" w:w="1430"/>
-            <w:vAlign w:val="center"/>
-          </w:tcPr>
-          <w:p/>
-        </w:tc>
-        <w:tc>
-          <w:tcPr>
-            <w:tcW w:type="dxa" w:w="1430"/>
+            <w:tcW w:type="dxa" w:w="1189"/>
+            <w:vAlign w:val="center"/>
+          </w:tcPr>
+          <w:p/>
+        </w:tc>
+        <w:tc>
+          <w:tcPr>
+            <w:tcW w:type="dxa" w:w="1189"/>
+            <w:vAlign w:val="center"/>
+          </w:tcPr>
+          <w:p/>
+        </w:tc>
+        <w:tc>
+          <w:tcPr>
+            <w:tcW w:type="dxa" w:w="1189"/>
+            <w:vAlign w:val="center"/>
+          </w:tcPr>
+          <w:p/>
+        </w:tc>
+        <w:tc>
+          <w:tcPr>
+            <w:tcW w:type="dxa" w:w="1189"/>
+            <w:vAlign w:val="center"/>
+          </w:tcPr>
+          <w:p/>
+        </w:tc>
+        <w:tc>
+          <w:tcPr>
+            <w:tcW w:type="dxa" w:w="1189"/>
+            <w:vAlign w:val="center"/>
+          </w:tcPr>
+          <w:p/>
+        </w:tc>
+        <w:tc>
+          <w:tcPr>
+            <w:tcW w:type="dxa" w:w="1189"/>
             <w:vAlign w:val="center"/>
           </w:tcPr>
           <w:p/>
@@ -418,7 +550,7 @@
         </w:tc>
         <w:tc>
           <w:tcPr>
-            <w:tcW w:type="dxa" w:w="3750"/>
+            <w:tcW w:type="dxa" w:w="2900"/>
             <w:vAlign w:val="center"/>
           </w:tcPr>
           <w:p>
@@ -436,14 +568,28 @@
         </w:tc>
         <w:tc>
           <w:tcPr>
-            <w:tcW w:type="dxa" w:w="1430"/>
-            <w:vAlign w:val="center"/>
-          </w:tcPr>
-          <w:p/>
-        </w:tc>
-        <w:tc>
-          <w:tcPr>
-            <w:tcW w:type="dxa" w:w="1430"/>
+            <w:tcW w:type="dxa" w:w="1189"/>
+            <w:vAlign w:val="center"/>
+          </w:tcPr>
+          <w:p/>
+        </w:tc>
+        <w:tc>
+          <w:tcPr>
+            <w:tcW w:type="dxa" w:w="1189"/>
+            <w:vAlign w:val="center"/>
+          </w:tcPr>
+          <w:p/>
+        </w:tc>
+        <w:tc>
+          <w:tcPr>
+            <w:tcW w:type="dxa" w:w="1189"/>
+            <w:vAlign w:val="center"/>
+          </w:tcPr>
+          <w:p/>
+        </w:tc>
+        <w:tc>
+          <w:tcPr>
+            <w:tcW w:type="dxa" w:w="1189"/>
             <w:vAlign w:val="center"/>
           </w:tcPr>
           <w:p>
@@ -458,8 +604,8 @@
                 <w:i w:val="false"/>
                 <w:iCs w:val="false"/>
                 <w:color w:val="7FA02A"/>
-                <w:sz w:val="18"/>
-                <w:szCs w:val="18"/>
+                <w:sz w:val="16"/>
+                <w:szCs w:val="16"/>
               </w:rPr>
               <w:t xml:space="preserve">16h00</w:t>
             </w:r>
@@ -476,8 +622,8 @@
                 <w:i w:val="false"/>
                 <w:iCs w:val="false"/>
                 <w:color w:val="7FA02A"/>
-                <w:sz w:val="18"/>
-                <w:szCs w:val="18"/>
+                <w:sz w:val="16"/>
+                <w:szCs w:val="16"/>
               </w:rPr>
               <w:t xml:space="preserve">(vs Neefs)</w:t>
             </w:r>
@@ -485,21 +631,35 @@
         </w:tc>
         <w:tc>
           <w:tcPr>
-            <w:tcW w:type="dxa" w:w="1430"/>
-            <w:vAlign w:val="center"/>
-          </w:tcPr>
-          <w:p/>
-        </w:tc>
-        <w:tc>
-          <w:tcPr>
-            <w:tcW w:type="dxa" w:w="1430"/>
-            <w:vAlign w:val="center"/>
-          </w:tcPr>
-          <w:p/>
-        </w:tc>
-        <w:tc>
-          <w:tcPr>
-            <w:tcW w:type="dxa" w:w="1430"/>
+            <w:tcW w:type="dxa" w:w="1189"/>
+            <w:vAlign w:val="center"/>
+          </w:tcPr>
+          <w:p/>
+        </w:tc>
+        <w:tc>
+          <w:tcPr>
+            <w:tcW w:type="dxa" w:w="1189"/>
+            <w:vAlign w:val="center"/>
+          </w:tcPr>
+          <w:p/>
+        </w:tc>
+        <w:tc>
+          <w:tcPr>
+            <w:tcW w:type="dxa" w:w="1189"/>
+            <w:vAlign w:val="center"/>
+          </w:tcPr>
+          <w:p/>
+        </w:tc>
+        <w:tc>
+          <w:tcPr>
+            <w:tcW w:type="dxa" w:w="1189"/>
+            <w:vAlign w:val="center"/>
+          </w:tcPr>
+          <w:p/>
+        </w:tc>
+        <w:tc>
+          <w:tcPr>
+            <w:tcW w:type="dxa" w:w="1189"/>
             <w:vAlign w:val="center"/>
           </w:tcPr>
           <w:p/>
@@ -517,7 +677,7 @@
         </w:tc>
         <w:tc>
           <w:tcPr>
-            <w:tcW w:type="dxa" w:w="3750"/>
+            <w:tcW w:type="dxa" w:w="2900"/>
             <w:shd w:fill="F2F2F2" w:color="auto" w:val="clear"/>
             <w:vAlign w:val="center"/>
           </w:tcPr>
@@ -546,35 +706,63 @@
         </w:tc>
         <w:tc>
           <w:tcPr>
-            <w:tcW w:type="dxa" w:w="1430"/>
-            <w:vAlign w:val="center"/>
-          </w:tcPr>
-          <w:p/>
-        </w:tc>
-        <w:tc>
-          <w:tcPr>
-            <w:tcW w:type="dxa" w:w="1430"/>
-            <w:vAlign w:val="center"/>
-          </w:tcPr>
-          <w:p/>
-        </w:tc>
-        <w:tc>
-          <w:tcPr>
-            <w:tcW w:type="dxa" w:w="1430"/>
-            <w:vAlign w:val="center"/>
-          </w:tcPr>
-          <w:p/>
-        </w:tc>
-        <w:tc>
-          <w:tcPr>
-            <w:tcW w:type="dxa" w:w="1430"/>
-            <w:vAlign w:val="center"/>
-          </w:tcPr>
-          <w:p/>
-        </w:tc>
-        <w:tc>
-          <w:tcPr>
-            <w:tcW w:type="dxa" w:w="1430"/>
+            <w:tcW w:type="dxa" w:w="1189"/>
+            <w:vAlign w:val="center"/>
+          </w:tcPr>
+          <w:p/>
+        </w:tc>
+        <w:tc>
+          <w:tcPr>
+            <w:tcW w:type="dxa" w:w="1189"/>
+            <w:vAlign w:val="center"/>
+          </w:tcPr>
+          <w:p/>
+        </w:tc>
+        <w:tc>
+          <w:tcPr>
+            <w:tcW w:type="dxa" w:w="1189"/>
+            <w:vAlign w:val="center"/>
+          </w:tcPr>
+          <w:p/>
+        </w:tc>
+        <w:tc>
+          <w:tcPr>
+            <w:tcW w:type="dxa" w:w="1189"/>
+            <w:vAlign w:val="center"/>
+          </w:tcPr>
+          <w:p/>
+        </w:tc>
+        <w:tc>
+          <w:tcPr>
+            <w:tcW w:type="dxa" w:w="1189"/>
+            <w:vAlign w:val="center"/>
+          </w:tcPr>
+          <w:p/>
+        </w:tc>
+        <w:tc>
+          <w:tcPr>
+            <w:tcW w:type="dxa" w:w="1189"/>
+            <w:vAlign w:val="center"/>
+          </w:tcPr>
+          <w:p/>
+        </w:tc>
+        <w:tc>
+          <w:tcPr>
+            <w:tcW w:type="dxa" w:w="1189"/>
+            <w:vAlign w:val="center"/>
+          </w:tcPr>
+          <w:p/>
+        </w:tc>
+        <w:tc>
+          <w:tcPr>
+            <w:tcW w:type="dxa" w:w="1189"/>
+            <w:vAlign w:val="center"/>
+          </w:tcPr>
+          <w:p/>
+        </w:tc>
+        <w:tc>
+          <w:tcPr>
+            <w:tcW w:type="dxa" w:w="1189"/>
             <w:vAlign w:val="center"/>
           </w:tcPr>
           <w:p/>
@@ -586,7 +774,7 @@
         </w:trPr>
         <w:tc>
           <w:tcPr>
-            <w:tcW w:type="dxa" w:w="3050"/>
+            <w:tcW w:type="dxa" w:w="2100"/>
             <w:vAlign w:val="center"/>
           </w:tcPr>
           <w:p>
@@ -622,7 +810,7 @@
         </w:tc>
         <w:tc>
           <w:tcPr>
-            <w:tcW w:type="dxa" w:w="3750"/>
+            <w:tcW w:type="dxa" w:w="2900"/>
             <w:vAlign w:val="center"/>
           </w:tcPr>
           <w:p>
@@ -646,35 +834,63 @@
         </w:tc>
         <w:tc>
           <w:tcPr>
-            <w:tcW w:type="dxa" w:w="1430"/>
-            <w:vAlign w:val="center"/>
-          </w:tcPr>
-          <w:p/>
-        </w:tc>
-        <w:tc>
-          <w:tcPr>
-            <w:tcW w:type="dxa" w:w="1430"/>
-            <w:vAlign w:val="center"/>
-          </w:tcPr>
-          <w:p/>
-        </w:tc>
-        <w:tc>
-          <w:tcPr>
-            <w:tcW w:type="dxa" w:w="1430"/>
-            <w:vAlign w:val="center"/>
-          </w:tcPr>
-          <w:p/>
-        </w:tc>
-        <w:tc>
-          <w:tcPr>
-            <w:tcW w:type="dxa" w:w="1430"/>
-            <w:vAlign w:val="center"/>
-          </w:tcPr>
-          <w:p/>
-        </w:tc>
-        <w:tc>
-          <w:tcPr>
-            <w:tcW w:type="dxa" w:w="1430"/>
+            <w:tcW w:type="dxa" w:w="1189"/>
+            <w:vAlign w:val="center"/>
+          </w:tcPr>
+          <w:p/>
+        </w:tc>
+        <w:tc>
+          <w:tcPr>
+            <w:tcW w:type="dxa" w:w="1189"/>
+            <w:vAlign w:val="center"/>
+          </w:tcPr>
+          <w:p/>
+        </w:tc>
+        <w:tc>
+          <w:tcPr>
+            <w:tcW w:type="dxa" w:w="1189"/>
+            <w:vAlign w:val="center"/>
+          </w:tcPr>
+          <w:p/>
+        </w:tc>
+        <w:tc>
+          <w:tcPr>
+            <w:tcW w:type="dxa" w:w="1189"/>
+            <w:vAlign w:val="center"/>
+          </w:tcPr>
+          <w:p/>
+        </w:tc>
+        <w:tc>
+          <w:tcPr>
+            <w:tcW w:type="dxa" w:w="1189"/>
+            <w:vAlign w:val="center"/>
+          </w:tcPr>
+          <w:p/>
+        </w:tc>
+        <w:tc>
+          <w:tcPr>
+            <w:tcW w:type="dxa" w:w="1189"/>
+            <w:vAlign w:val="center"/>
+          </w:tcPr>
+          <w:p/>
+        </w:tc>
+        <w:tc>
+          <w:tcPr>
+            <w:tcW w:type="dxa" w:w="1189"/>
+            <w:vAlign w:val="center"/>
+          </w:tcPr>
+          <w:p/>
+        </w:tc>
+        <w:tc>
+          <w:tcPr>
+            <w:tcW w:type="dxa" w:w="1189"/>
+            <w:vAlign w:val="center"/>
+          </w:tcPr>
+          <w:p/>
+        </w:tc>
+        <w:tc>
+          <w:tcPr>
+            <w:tcW w:type="dxa" w:w="1189"/>
             <w:vAlign w:val="center"/>
           </w:tcPr>
           <w:p/>
@@ -686,7 +902,7 @@
         </w:trPr>
         <w:tc>
           <w:tcPr>
-            <w:tcW w:type="dxa" w:w="3050"/>
+            <w:tcW w:type="dxa" w:w="2100"/>
             <w:vAlign w:val="center"/>
           </w:tcPr>
           <w:p>
@@ -722,7 +938,7 @@
         </w:tc>
         <w:tc>
           <w:tcPr>
-            <w:tcW w:type="dxa" w:w="3750"/>
+            <w:tcW w:type="dxa" w:w="2900"/>
             <w:vAlign w:val="center"/>
           </w:tcPr>
           <w:p>
@@ -740,21 +956,35 @@
         </w:tc>
         <w:tc>
           <w:tcPr>
-            <w:tcW w:type="dxa" w:w="1430"/>
-            <w:vAlign w:val="center"/>
-          </w:tcPr>
-          <w:p/>
-        </w:tc>
-        <w:tc>
-          <w:tcPr>
-            <w:tcW w:type="dxa" w:w="1430"/>
-            <w:vAlign w:val="center"/>
-          </w:tcPr>
-          <w:p/>
-        </w:tc>
-        <w:tc>
-          <w:tcPr>
-            <w:tcW w:type="dxa" w:w="1430"/>
+            <w:tcW w:type="dxa" w:w="1189"/>
+            <w:vAlign w:val="center"/>
+          </w:tcPr>
+          <w:p/>
+        </w:tc>
+        <w:tc>
+          <w:tcPr>
+            <w:tcW w:type="dxa" w:w="1189"/>
+            <w:vAlign w:val="center"/>
+          </w:tcPr>
+          <w:p/>
+        </w:tc>
+        <w:tc>
+          <w:tcPr>
+            <w:tcW w:type="dxa" w:w="1189"/>
+            <w:vAlign w:val="center"/>
+          </w:tcPr>
+          <w:p/>
+        </w:tc>
+        <w:tc>
+          <w:tcPr>
+            <w:tcW w:type="dxa" w:w="1189"/>
+            <w:vAlign w:val="center"/>
+          </w:tcPr>
+          <w:p/>
+        </w:tc>
+        <w:tc>
+          <w:tcPr>
+            <w:tcW w:type="dxa" w:w="1189"/>
             <w:vAlign w:val="center"/>
           </w:tcPr>
           <w:p>
@@ -769,8 +999,8 @@
                 <w:i w:val="false"/>
                 <w:iCs w:val="false"/>
                 <w:color w:val="7FA02A"/>
-                <w:sz w:val="18"/>
-                <w:szCs w:val="18"/>
+                <w:sz w:val="16"/>
+                <w:szCs w:val="16"/>
               </w:rPr>
               <w:t xml:space="preserve">entre 12h00 et 14h30</w:t>
             </w:r>
@@ -787,8 +1017,8 @@
                 <w:i w:val="false"/>
                 <w:iCs w:val="false"/>
                 <w:color w:val="7FA02A"/>
-                <w:sz w:val="18"/>
-                <w:szCs w:val="18"/>
+                <w:sz w:val="16"/>
+                <w:szCs w:val="16"/>
               </w:rPr>
               <w:t xml:space="preserve">(poules : Ridaoui, Bhat,</w:t>
             </w:r>
@@ -805,8 +1035,8 @@
                 <w:i w:val="false"/>
                 <w:iCs w:val="false"/>
                 <w:color w:val="7FA02A"/>
-                <w:sz w:val="18"/>
-                <w:szCs w:val="18"/>
+                <w:sz w:val="16"/>
+                <w:szCs w:val="16"/>
               </w:rPr>
               <w:t xml:space="preserve">Chalude, Gaubitch)</w:t>
             </w:r>
@@ -814,14 +1044,28 @@
         </w:tc>
         <w:tc>
           <w:tcPr>
-            <w:tcW w:type="dxa" w:w="1430"/>
-            <w:vAlign w:val="center"/>
-          </w:tcPr>
-          <w:p/>
-        </w:tc>
-        <w:tc>
-          <w:tcPr>
-            <w:tcW w:type="dxa" w:w="1430"/>
+            <w:tcW w:type="dxa" w:w="1189"/>
+            <w:vAlign w:val="center"/>
+          </w:tcPr>
+          <w:p/>
+        </w:tc>
+        <w:tc>
+          <w:tcPr>
+            <w:tcW w:type="dxa" w:w="1189"/>
+            <w:vAlign w:val="center"/>
+          </w:tcPr>
+          <w:p/>
+        </w:tc>
+        <w:tc>
+          <w:tcPr>
+            <w:tcW w:type="dxa" w:w="1189"/>
+            <w:vAlign w:val="center"/>
+          </w:tcPr>
+          <w:p/>
+        </w:tc>
+        <w:tc>
+          <w:tcPr>
+            <w:tcW w:type="dxa" w:w="1189"/>
             <w:vAlign w:val="center"/>
           </w:tcPr>
           <w:p/>
@@ -833,7 +1077,7 @@
         </w:trPr>
         <w:tc>
           <w:tcPr>
-            <w:tcW w:type="dxa" w:w="3050"/>
+            <w:tcW w:type="dxa" w:w="2100"/>
             <w:vAlign w:val="center"/>
           </w:tcPr>
           <w:p>
@@ -869,7 +1113,7 @@
         </w:tc>
         <w:tc>
           <w:tcPr>
-            <w:tcW w:type="dxa" w:w="3750"/>
+            <w:tcW w:type="dxa" w:w="2900"/>
             <w:vAlign w:val="center"/>
           </w:tcPr>
           <w:p>
@@ -893,35 +1137,63 @@
         </w:tc>
         <w:tc>
           <w:tcPr>
-            <w:tcW w:type="dxa" w:w="1430"/>
-            <w:vAlign w:val="center"/>
-          </w:tcPr>
-          <w:p/>
-        </w:tc>
-        <w:tc>
-          <w:tcPr>
-            <w:tcW w:type="dxa" w:w="1430"/>
-            <w:vAlign w:val="center"/>
-          </w:tcPr>
-          <w:p/>
-        </w:tc>
-        <w:tc>
-          <w:tcPr>
-            <w:tcW w:type="dxa" w:w="1430"/>
-            <w:vAlign w:val="center"/>
-          </w:tcPr>
-          <w:p/>
-        </w:tc>
-        <w:tc>
-          <w:tcPr>
-            <w:tcW w:type="dxa" w:w="1430"/>
-            <w:vAlign w:val="center"/>
-          </w:tcPr>
-          <w:p/>
-        </w:tc>
-        <w:tc>
-          <w:tcPr>
-            <w:tcW w:type="dxa" w:w="1430"/>
+            <w:tcW w:type="dxa" w:w="1189"/>
+            <w:vAlign w:val="center"/>
+          </w:tcPr>
+          <w:p/>
+        </w:tc>
+        <w:tc>
+          <w:tcPr>
+            <w:tcW w:type="dxa" w:w="1189"/>
+            <w:vAlign w:val="center"/>
+          </w:tcPr>
+          <w:p/>
+        </w:tc>
+        <w:tc>
+          <w:tcPr>
+            <w:tcW w:type="dxa" w:w="1189"/>
+            <w:vAlign w:val="center"/>
+          </w:tcPr>
+          <w:p/>
+        </w:tc>
+        <w:tc>
+          <w:tcPr>
+            <w:tcW w:type="dxa" w:w="1189"/>
+            <w:vAlign w:val="center"/>
+          </w:tcPr>
+          <w:p/>
+        </w:tc>
+        <w:tc>
+          <w:tcPr>
+            <w:tcW w:type="dxa" w:w="1189"/>
+            <w:vAlign w:val="center"/>
+          </w:tcPr>
+          <w:p/>
+        </w:tc>
+        <w:tc>
+          <w:tcPr>
+            <w:tcW w:type="dxa" w:w="1189"/>
+            <w:vAlign w:val="center"/>
+          </w:tcPr>
+          <w:p/>
+        </w:tc>
+        <w:tc>
+          <w:tcPr>
+            <w:tcW w:type="dxa" w:w="1189"/>
+            <w:vAlign w:val="center"/>
+          </w:tcPr>
+          <w:p/>
+        </w:tc>
+        <w:tc>
+          <w:tcPr>
+            <w:tcW w:type="dxa" w:w="1189"/>
+            <w:vAlign w:val="center"/>
+          </w:tcPr>
+          <w:p/>
+        </w:tc>
+        <w:tc>
+          <w:tcPr>
+            <w:tcW w:type="dxa" w:w="1189"/>
             <w:vAlign w:val="center"/>
           </w:tcPr>
           <w:p/>
@@ -933,7 +1205,7 @@
         </w:trPr>
         <w:tc>
           <w:tcPr>
-            <w:tcW w:type="dxa" w:w="3050"/>
+            <w:tcW w:type="dxa" w:w="2100"/>
             <w:vAlign w:val="center"/>
           </w:tcPr>
           <w:p>
@@ -969,7 +1241,7 @@
         </w:tc>
         <w:tc>
           <w:tcPr>
-            <w:tcW w:type="dxa" w:w="3750"/>
+            <w:tcW w:type="dxa" w:w="2900"/>
             <w:vAlign w:val="center"/>
           </w:tcPr>
           <w:p>
@@ -987,7 +1259,21 @@
         </w:tc>
         <w:tc>
           <w:tcPr>
-            <w:tcW w:type="dxa" w:w="1430"/>
+            <w:tcW w:type="dxa" w:w="1189"/>
+            <w:vAlign w:val="center"/>
+          </w:tcPr>
+          <w:p/>
+        </w:tc>
+        <w:tc>
+          <w:tcPr>
+            <w:tcW w:type="dxa" w:w="1189"/>
+            <w:vAlign w:val="center"/>
+          </w:tcPr>
+          <w:p/>
+        </w:tc>
+        <w:tc>
+          <w:tcPr>
+            <w:tcW w:type="dxa" w:w="1189"/>
             <w:vAlign w:val="center"/>
           </w:tcPr>
           <w:p>
@@ -1002,8 +1288,8 @@
                 <w:i w:val="false"/>
                 <w:iCs w:val="false"/>
                 <w:color w:val="7FA02A"/>
-                <w:sz w:val="18"/>
-                <w:szCs w:val="18"/>
+                <w:sz w:val="16"/>
+                <w:szCs w:val="16"/>
               </w:rPr>
               <w:t xml:space="preserve">12h00</w:t>
             </w:r>
@@ -1020,8 +1306,8 @@
                 <w:i w:val="false"/>
                 <w:iCs w:val="false"/>
                 <w:color w:val="7FA02A"/>
-                <w:sz w:val="18"/>
-                <w:szCs w:val="18"/>
+                <w:sz w:val="16"/>
+                <w:szCs w:val="16"/>
               </w:rPr>
               <w:t xml:space="preserve">(vs Catto)</w:t>
             </w:r>
@@ -1029,28 +1315,42 @@
         </w:tc>
         <w:tc>
           <w:tcPr>
-            <w:tcW w:type="dxa" w:w="1430"/>
-            <w:vAlign w:val="center"/>
-          </w:tcPr>
-          <w:p/>
-        </w:tc>
-        <w:tc>
-          <w:tcPr>
-            <w:tcW w:type="dxa" w:w="1430"/>
-            <w:vAlign w:val="center"/>
-          </w:tcPr>
-          <w:p/>
-        </w:tc>
-        <w:tc>
-          <w:tcPr>
-            <w:tcW w:type="dxa" w:w="1430"/>
-            <w:vAlign w:val="center"/>
-          </w:tcPr>
-          <w:p/>
-        </w:tc>
-        <w:tc>
-          <w:tcPr>
-            <w:tcW w:type="dxa" w:w="1430"/>
+            <w:tcW w:type="dxa" w:w="1189"/>
+            <w:vAlign w:val="center"/>
+          </w:tcPr>
+          <w:p/>
+        </w:tc>
+        <w:tc>
+          <w:tcPr>
+            <w:tcW w:type="dxa" w:w="1189"/>
+            <w:vAlign w:val="center"/>
+          </w:tcPr>
+          <w:p/>
+        </w:tc>
+        <w:tc>
+          <w:tcPr>
+            <w:tcW w:type="dxa" w:w="1189"/>
+            <w:vAlign w:val="center"/>
+          </w:tcPr>
+          <w:p/>
+        </w:tc>
+        <w:tc>
+          <w:tcPr>
+            <w:tcW w:type="dxa" w:w="1189"/>
+            <w:vAlign w:val="center"/>
+          </w:tcPr>
+          <w:p/>
+        </w:tc>
+        <w:tc>
+          <w:tcPr>
+            <w:tcW w:type="dxa" w:w="1189"/>
+            <w:vAlign w:val="center"/>
+          </w:tcPr>
+          <w:p/>
+        </w:tc>
+        <w:tc>
+          <w:tcPr>
+            <w:tcW w:type="dxa" w:w="1189"/>
             <w:vAlign w:val="center"/>
           </w:tcPr>
           <w:p/>
@@ -1062,7 +1362,7 @@
         </w:trPr>
         <w:tc>
           <w:tcPr>
-            <w:tcW w:type="dxa" w:w="3050"/>
+            <w:tcW w:type="dxa" w:w="2100"/>
             <w:vMerge w:val="restart"/>
             <w:vAlign w:val="center"/>
           </w:tcPr>
@@ -1099,7 +1399,7 @@
         </w:tc>
         <w:tc>
           <w:tcPr>
-            <w:tcW w:type="dxa" w:w="3750"/>
+            <w:tcW w:type="dxa" w:w="2900"/>
             <w:shd w:fill="F2F2F2" w:color="auto" w:val="clear"/>
             <w:vAlign w:val="center"/>
           </w:tcPr>
@@ -1128,35 +1428,63 @@
         </w:tc>
         <w:tc>
           <w:tcPr>
-            <w:tcW w:type="dxa" w:w="1430"/>
-            <w:vAlign w:val="center"/>
-          </w:tcPr>
-          <w:p/>
-        </w:tc>
-        <w:tc>
-          <w:tcPr>
-            <w:tcW w:type="dxa" w:w="1430"/>
-            <w:vAlign w:val="center"/>
-          </w:tcPr>
-          <w:p/>
-        </w:tc>
-        <w:tc>
-          <w:tcPr>
-            <w:tcW w:type="dxa" w:w="1430"/>
-            <w:vAlign w:val="center"/>
-          </w:tcPr>
-          <w:p/>
-        </w:tc>
-        <w:tc>
-          <w:tcPr>
-            <w:tcW w:type="dxa" w:w="1430"/>
-            <w:vAlign w:val="center"/>
-          </w:tcPr>
-          <w:p/>
-        </w:tc>
-        <w:tc>
-          <w:tcPr>
-            <w:tcW w:type="dxa" w:w="1430"/>
+            <w:tcW w:type="dxa" w:w="1189"/>
+            <w:vAlign w:val="center"/>
+          </w:tcPr>
+          <w:p/>
+        </w:tc>
+        <w:tc>
+          <w:tcPr>
+            <w:tcW w:type="dxa" w:w="1189"/>
+            <w:vAlign w:val="center"/>
+          </w:tcPr>
+          <w:p/>
+        </w:tc>
+        <w:tc>
+          <w:tcPr>
+            <w:tcW w:type="dxa" w:w="1189"/>
+            <w:vAlign w:val="center"/>
+          </w:tcPr>
+          <w:p/>
+        </w:tc>
+        <w:tc>
+          <w:tcPr>
+            <w:tcW w:type="dxa" w:w="1189"/>
+            <w:vAlign w:val="center"/>
+          </w:tcPr>
+          <w:p/>
+        </w:tc>
+        <w:tc>
+          <w:tcPr>
+            <w:tcW w:type="dxa" w:w="1189"/>
+            <w:vAlign w:val="center"/>
+          </w:tcPr>
+          <w:p/>
+        </w:tc>
+        <w:tc>
+          <w:tcPr>
+            <w:tcW w:type="dxa" w:w="1189"/>
+            <w:vAlign w:val="center"/>
+          </w:tcPr>
+          <w:p/>
+        </w:tc>
+        <w:tc>
+          <w:tcPr>
+            <w:tcW w:type="dxa" w:w="1189"/>
+            <w:vAlign w:val="center"/>
+          </w:tcPr>
+          <w:p/>
+        </w:tc>
+        <w:tc>
+          <w:tcPr>
+            <w:tcW w:type="dxa" w:w="1189"/>
+            <w:vAlign w:val="center"/>
+          </w:tcPr>
+          <w:p/>
+        </w:tc>
+        <w:tc>
+          <w:tcPr>
+            <w:tcW w:type="dxa" w:w="1189"/>
             <w:vAlign w:val="center"/>
           </w:tcPr>
           <w:p/>
@@ -1174,7 +1502,7 @@
         </w:tc>
         <w:tc>
           <w:tcPr>
-            <w:tcW w:type="dxa" w:w="3750"/>
+            <w:tcW w:type="dxa" w:w="2900"/>
             <w:shd w:fill="F2F2F2" w:color="auto" w:val="clear"/>
             <w:vAlign w:val="center"/>
           </w:tcPr>
@@ -1203,35 +1531,63 @@
         </w:tc>
         <w:tc>
           <w:tcPr>
-            <w:tcW w:type="dxa" w:w="1430"/>
-            <w:vAlign w:val="center"/>
-          </w:tcPr>
-          <w:p/>
-        </w:tc>
-        <w:tc>
-          <w:tcPr>
-            <w:tcW w:type="dxa" w:w="1430"/>
-            <w:vAlign w:val="center"/>
-          </w:tcPr>
-          <w:p/>
-        </w:tc>
-        <w:tc>
-          <w:tcPr>
-            <w:tcW w:type="dxa" w:w="1430"/>
-            <w:vAlign w:val="center"/>
-          </w:tcPr>
-          <w:p/>
-        </w:tc>
-        <w:tc>
-          <w:tcPr>
-            <w:tcW w:type="dxa" w:w="1430"/>
-            <w:vAlign w:val="center"/>
-          </w:tcPr>
-          <w:p/>
-        </w:tc>
-        <w:tc>
-          <w:tcPr>
-            <w:tcW w:type="dxa" w:w="1430"/>
+            <w:tcW w:type="dxa" w:w="1189"/>
+            <w:vAlign w:val="center"/>
+          </w:tcPr>
+          <w:p/>
+        </w:tc>
+        <w:tc>
+          <w:tcPr>
+            <w:tcW w:type="dxa" w:w="1189"/>
+            <w:vAlign w:val="center"/>
+          </w:tcPr>
+          <w:p/>
+        </w:tc>
+        <w:tc>
+          <w:tcPr>
+            <w:tcW w:type="dxa" w:w="1189"/>
+            <w:vAlign w:val="center"/>
+          </w:tcPr>
+          <w:p/>
+        </w:tc>
+        <w:tc>
+          <w:tcPr>
+            <w:tcW w:type="dxa" w:w="1189"/>
+            <w:vAlign w:val="center"/>
+          </w:tcPr>
+          <w:p/>
+        </w:tc>
+        <w:tc>
+          <w:tcPr>
+            <w:tcW w:type="dxa" w:w="1189"/>
+            <w:vAlign w:val="center"/>
+          </w:tcPr>
+          <w:p/>
+        </w:tc>
+        <w:tc>
+          <w:tcPr>
+            <w:tcW w:type="dxa" w:w="1189"/>
+            <w:vAlign w:val="center"/>
+          </w:tcPr>
+          <w:p/>
+        </w:tc>
+        <w:tc>
+          <w:tcPr>
+            <w:tcW w:type="dxa" w:w="1189"/>
+            <w:vAlign w:val="center"/>
+          </w:tcPr>
+          <w:p/>
+        </w:tc>
+        <w:tc>
+          <w:tcPr>
+            <w:tcW w:type="dxa" w:w="1189"/>
+            <w:vAlign w:val="center"/>
+          </w:tcPr>
+          <w:p/>
+        </w:tc>
+        <w:tc>
+          <w:tcPr>
+            <w:tcW w:type="dxa" w:w="1189"/>
             <w:vAlign w:val="center"/>
           </w:tcPr>
           <w:p/>
@@ -1255,7 +1611,7 @@
     </w:p>
     <w:tbl>
       <w:tblPr>
-        <w:tblW w:type="dxa" w:w="13950"/>
+        <w:tblW w:type="dxa" w:w="15701"/>
         <w:tblBorders>
           <w:top w:val="single" w:color="AAAAAA" w:sz="4"/>
           <w:left w:val="single" w:color="AAAAAA" w:sz="4"/>
@@ -1266,13 +1622,17 @@
         </w:tblBorders>
       </w:tblPr>
       <w:tblGrid>
-        <w:gridCol w:w="3050"/>
-        <w:gridCol w:w="3750"/>
-        <w:gridCol w:w="1430"/>
-        <w:gridCol w:w="1430"/>
-        <w:gridCol w:w="1430"/>
-        <w:gridCol w:w="1430"/>
-        <w:gridCol w:w="1430"/>
+        <w:gridCol w:w="2100"/>
+        <w:gridCol w:w="2900"/>
+        <w:gridCol w:w="1189"/>
+        <w:gridCol w:w="1189"/>
+        <w:gridCol w:w="1189"/>
+        <w:gridCol w:w="1189"/>
+        <w:gridCol w:w="1189"/>
+        <w:gridCol w:w="1189"/>
+        <w:gridCol w:w="1189"/>
+        <w:gridCol w:w="1189"/>
+        <w:gridCol w:w="1189"/>
       </w:tblGrid>
       <w:tr>
         <w:trPr>
@@ -1280,7 +1640,7 @@
         </w:trPr>
         <w:tc>
           <w:tcPr>
-            <w:tcW w:type="dxa" w:w="3050"/>
+            <w:tcW w:type="dxa" w:w="2100"/>
             <w:shd w:fill="4E6E1F" w:color="auto" w:val="clear"/>
             <w:vAlign w:val="center"/>
           </w:tcPr>
@@ -1305,7 +1665,7 @@
         </w:tc>
         <w:tc>
           <w:tcPr>
-            <w:tcW w:type="dxa" w:w="3750"/>
+            <w:tcW w:type="dxa" w:w="2900"/>
             <w:shd w:fill="4E6E1F" w:color="auto" w:val="clear"/>
             <w:vAlign w:val="center"/>
           </w:tcPr>
@@ -1330,7 +1690,7 @@
         </w:tc>
         <w:tc>
           <w:tcPr>
-            <w:tcW w:type="dxa" w:w="1430"/>
+            <w:tcW w:type="dxa" w:w="1189"/>
             <w:shd w:fill="4E6E1F" w:color="auto" w:val="clear"/>
             <w:vAlign w:val="center"/>
           </w:tcPr>
@@ -1349,13 +1709,63 @@
                 <w:sz w:val="18"/>
                 <w:szCs w:val="18"/>
               </w:rPr>
+              <w:t xml:space="preserve">Sam 24/10</w:t>
+            </w:r>
+          </w:p>
+        </w:tc>
+        <w:tc>
+          <w:tcPr>
+            <w:tcW w:type="dxa" w:w="1189"/>
+            <w:shd w:fill="4E6E1F" w:color="auto" w:val="clear"/>
+            <w:vAlign w:val="center"/>
+          </w:tcPr>
+          <w:p>
+            <w:pPr>
+              <w:spacing w:after="0" w:line="240"/>
+              <w:jc w:val="center"/>
+            </w:pPr>
+            <w:r>
+              <w:rPr>
+                <w:b/>
+                <w:bCs/>
+                <w:i w:val="false"/>
+                <w:iCs w:val="false"/>
+                <w:color w:val="FFFFFF"/>
+                <w:sz w:val="18"/>
+                <w:szCs w:val="18"/>
+              </w:rPr>
+              <w:t xml:space="preserve">Dim 25/10</w:t>
+            </w:r>
+          </w:p>
+        </w:tc>
+        <w:tc>
+          <w:tcPr>
+            <w:tcW w:type="dxa" w:w="1189"/>
+            <w:shd w:fill="4E6E1F" w:color="auto" w:val="clear"/>
+            <w:vAlign w:val="center"/>
+          </w:tcPr>
+          <w:p>
+            <w:pPr>
+              <w:spacing w:after="0" w:line="240"/>
+              <w:jc w:val="center"/>
+            </w:pPr>
+            <w:r>
+              <w:rPr>
+                <w:b/>
+                <w:bCs/>
+                <w:i w:val="false"/>
+                <w:iCs w:val="false"/>
+                <w:color w:val="FFFFFF"/>
+                <w:sz w:val="18"/>
+                <w:szCs w:val="18"/>
+              </w:rPr>
               <w:t xml:space="preserve">Lun 26/10</w:t>
             </w:r>
           </w:p>
         </w:tc>
         <w:tc>
           <w:tcPr>
-            <w:tcW w:type="dxa" w:w="1430"/>
+            <w:tcW w:type="dxa" w:w="1189"/>
             <w:shd w:fill="4E6E1F" w:color="auto" w:val="clear"/>
             <w:vAlign w:val="center"/>
           </w:tcPr>
@@ -1380,7 +1790,7 @@
         </w:tc>
         <w:tc>
           <w:tcPr>
-            <w:tcW w:type="dxa" w:w="1430"/>
+            <w:tcW w:type="dxa" w:w="1189"/>
             <w:shd w:fill="4E6E1F" w:color="auto" w:val="clear"/>
             <w:vAlign w:val="center"/>
           </w:tcPr>
@@ -1405,7 +1815,7 @@
         </w:tc>
         <w:tc>
           <w:tcPr>
-            <w:tcW w:type="dxa" w:w="1430"/>
+            <w:tcW w:type="dxa" w:w="1189"/>
             <w:shd w:fill="4E6E1F" w:color="auto" w:val="clear"/>
             <w:vAlign w:val="center"/>
           </w:tcPr>
@@ -1430,7 +1840,7 @@
         </w:tc>
         <w:tc>
           <w:tcPr>
-            <w:tcW w:type="dxa" w:w="1430"/>
+            <w:tcW w:type="dxa" w:w="1189"/>
             <w:shd w:fill="4E6E1F" w:color="auto" w:val="clear"/>
             <w:vAlign w:val="center"/>
           </w:tcPr>
@@ -1450,6 +1860,56 @@
                 <w:szCs w:val="18"/>
               </w:rPr>
               <w:t xml:space="preserve">Ven 30/10</w:t>
+            </w:r>
+          </w:p>
+        </w:tc>
+        <w:tc>
+          <w:tcPr>
+            <w:tcW w:type="dxa" w:w="1189"/>
+            <w:shd w:fill="4E6E1F" w:color="auto" w:val="clear"/>
+            <w:vAlign w:val="center"/>
+          </w:tcPr>
+          <w:p>
+            <w:pPr>
+              <w:spacing w:after="0" w:line="240"/>
+              <w:jc w:val="center"/>
+            </w:pPr>
+            <w:r>
+              <w:rPr>
+                <w:b/>
+                <w:bCs/>
+                <w:i w:val="false"/>
+                <w:iCs w:val="false"/>
+                <w:color w:val="FFFFFF"/>
+                <w:sz w:val="18"/>
+                <w:szCs w:val="18"/>
+              </w:rPr>
+              <w:t xml:space="preserve">Sam 31/10</w:t>
+            </w:r>
+          </w:p>
+        </w:tc>
+        <w:tc>
+          <w:tcPr>
+            <w:tcW w:type="dxa" w:w="1189"/>
+            <w:shd w:fill="4E6E1F" w:color="auto" w:val="clear"/>
+            <w:vAlign w:val="center"/>
+          </w:tcPr>
+          <w:p>
+            <w:pPr>
+              <w:spacing w:after="0" w:line="240"/>
+              <w:jc w:val="center"/>
+            </w:pPr>
+            <w:r>
+              <w:rPr>
+                <w:b/>
+                <w:bCs/>
+                <w:i w:val="false"/>
+                <w:iCs w:val="false"/>
+                <w:color w:val="FFFFFF"/>
+                <w:sz w:val="18"/>
+                <w:szCs w:val="18"/>
+              </w:rPr>
+              <w:t xml:space="preserve">Dim 01/11</w:t>
             </w:r>
           </w:p>
         </w:tc>
@@ -1460,7 +1920,7 @@
         </w:trPr>
         <w:tc>
           <w:tcPr>
-            <w:tcW w:type="dxa" w:w="3050"/>
+            <w:tcW w:type="dxa" w:w="2100"/>
             <w:vMerge w:val="restart"/>
             <w:vAlign w:val="center"/>
           </w:tcPr>
@@ -1497,7 +1957,7 @@
         </w:tc>
         <w:tc>
           <w:tcPr>
-            <w:tcW w:type="dxa" w:w="3750"/>
+            <w:tcW w:type="dxa" w:w="2900"/>
             <w:shd w:fill="F2F2F2" w:color="auto" w:val="clear"/>
             <w:vAlign w:val="center"/>
           </w:tcPr>
@@ -1526,35 +1986,63 @@
         </w:tc>
         <w:tc>
           <w:tcPr>
-            <w:tcW w:type="dxa" w:w="1430"/>
-            <w:vAlign w:val="center"/>
-          </w:tcPr>
-          <w:p/>
-        </w:tc>
-        <w:tc>
-          <w:tcPr>
-            <w:tcW w:type="dxa" w:w="1430"/>
-            <w:vAlign w:val="center"/>
-          </w:tcPr>
-          <w:p/>
-        </w:tc>
-        <w:tc>
-          <w:tcPr>
-            <w:tcW w:type="dxa" w:w="1430"/>
-            <w:vAlign w:val="center"/>
-          </w:tcPr>
-          <w:p/>
-        </w:tc>
-        <w:tc>
-          <w:tcPr>
-            <w:tcW w:type="dxa" w:w="1430"/>
-            <w:vAlign w:val="center"/>
-          </w:tcPr>
-          <w:p/>
-        </w:tc>
-        <w:tc>
-          <w:tcPr>
-            <w:tcW w:type="dxa" w:w="1430"/>
+            <w:tcW w:type="dxa" w:w="1189"/>
+            <w:vAlign w:val="center"/>
+          </w:tcPr>
+          <w:p/>
+        </w:tc>
+        <w:tc>
+          <w:tcPr>
+            <w:tcW w:type="dxa" w:w="1189"/>
+            <w:vAlign w:val="center"/>
+          </w:tcPr>
+          <w:p/>
+        </w:tc>
+        <w:tc>
+          <w:tcPr>
+            <w:tcW w:type="dxa" w:w="1189"/>
+            <w:vAlign w:val="center"/>
+          </w:tcPr>
+          <w:p/>
+        </w:tc>
+        <w:tc>
+          <w:tcPr>
+            <w:tcW w:type="dxa" w:w="1189"/>
+            <w:vAlign w:val="center"/>
+          </w:tcPr>
+          <w:p/>
+        </w:tc>
+        <w:tc>
+          <w:tcPr>
+            <w:tcW w:type="dxa" w:w="1189"/>
+            <w:vAlign w:val="center"/>
+          </w:tcPr>
+          <w:p/>
+        </w:tc>
+        <w:tc>
+          <w:tcPr>
+            <w:tcW w:type="dxa" w:w="1189"/>
+            <w:vAlign w:val="center"/>
+          </w:tcPr>
+          <w:p/>
+        </w:tc>
+        <w:tc>
+          <w:tcPr>
+            <w:tcW w:type="dxa" w:w="1189"/>
+            <w:vAlign w:val="center"/>
+          </w:tcPr>
+          <w:p/>
+        </w:tc>
+        <w:tc>
+          <w:tcPr>
+            <w:tcW w:type="dxa" w:w="1189"/>
+            <w:vAlign w:val="center"/>
+          </w:tcPr>
+          <w:p/>
+        </w:tc>
+        <w:tc>
+          <w:tcPr>
+            <w:tcW w:type="dxa" w:w="1189"/>
             <w:vAlign w:val="center"/>
           </w:tcPr>
           <w:p/>
@@ -1572,7 +2060,7 @@
         </w:tc>
         <w:tc>
           <w:tcPr>
-            <w:tcW w:type="dxa" w:w="3750"/>
+            <w:tcW w:type="dxa" w:w="2900"/>
             <w:shd w:fill="F2F2F2" w:color="auto" w:val="clear"/>
             <w:vAlign w:val="center"/>
           </w:tcPr>
@@ -1601,35 +2089,63 @@
         </w:tc>
         <w:tc>
           <w:tcPr>
-            <w:tcW w:type="dxa" w:w="1430"/>
-            <w:vAlign w:val="center"/>
-          </w:tcPr>
-          <w:p/>
-        </w:tc>
-        <w:tc>
-          <w:tcPr>
-            <w:tcW w:type="dxa" w:w="1430"/>
-            <w:vAlign w:val="center"/>
-          </w:tcPr>
-          <w:p/>
-        </w:tc>
-        <w:tc>
-          <w:tcPr>
-            <w:tcW w:type="dxa" w:w="1430"/>
-            <w:vAlign w:val="center"/>
-          </w:tcPr>
-          <w:p/>
-        </w:tc>
-        <w:tc>
-          <w:tcPr>
-            <w:tcW w:type="dxa" w:w="1430"/>
-            <w:vAlign w:val="center"/>
-          </w:tcPr>
-          <w:p/>
-        </w:tc>
-        <w:tc>
-          <w:tcPr>
-            <w:tcW w:type="dxa" w:w="1430"/>
+            <w:tcW w:type="dxa" w:w="1189"/>
+            <w:vAlign w:val="center"/>
+          </w:tcPr>
+          <w:p/>
+        </w:tc>
+        <w:tc>
+          <w:tcPr>
+            <w:tcW w:type="dxa" w:w="1189"/>
+            <w:vAlign w:val="center"/>
+          </w:tcPr>
+          <w:p/>
+        </w:tc>
+        <w:tc>
+          <w:tcPr>
+            <w:tcW w:type="dxa" w:w="1189"/>
+            <w:vAlign w:val="center"/>
+          </w:tcPr>
+          <w:p/>
+        </w:tc>
+        <w:tc>
+          <w:tcPr>
+            <w:tcW w:type="dxa" w:w="1189"/>
+            <w:vAlign w:val="center"/>
+          </w:tcPr>
+          <w:p/>
+        </w:tc>
+        <w:tc>
+          <w:tcPr>
+            <w:tcW w:type="dxa" w:w="1189"/>
+            <w:vAlign w:val="center"/>
+          </w:tcPr>
+          <w:p/>
+        </w:tc>
+        <w:tc>
+          <w:tcPr>
+            <w:tcW w:type="dxa" w:w="1189"/>
+            <w:vAlign w:val="center"/>
+          </w:tcPr>
+          <w:p/>
+        </w:tc>
+        <w:tc>
+          <w:tcPr>
+            <w:tcW w:type="dxa" w:w="1189"/>
+            <w:vAlign w:val="center"/>
+          </w:tcPr>
+          <w:p/>
+        </w:tc>
+        <w:tc>
+          <w:tcPr>
+            <w:tcW w:type="dxa" w:w="1189"/>
+            <w:vAlign w:val="center"/>
+          </w:tcPr>
+          <w:p/>
+        </w:tc>
+        <w:tc>
+          <w:tcPr>
+            <w:tcW w:type="dxa" w:w="1189"/>
             <w:vAlign w:val="center"/>
           </w:tcPr>
           <w:p/>
@@ -1641,7 +2157,7 @@
         </w:trPr>
         <w:tc>
           <w:tcPr>
-            <w:tcW w:type="dxa" w:w="3050"/>
+            <w:tcW w:type="dxa" w:w="2100"/>
             <w:vMerge w:val="restart"/>
             <w:vAlign w:val="center"/>
           </w:tcPr>
@@ -1678,7 +2194,7 @@
         </w:tc>
         <w:tc>
           <w:tcPr>
-            <w:tcW w:type="dxa" w:w="3750"/>
+            <w:tcW w:type="dxa" w:w="2900"/>
             <w:shd w:fill="F2F2F2" w:color="auto" w:val="clear"/>
             <w:vAlign w:val="center"/>
           </w:tcPr>
@@ -1707,35 +2223,63 @@
         </w:tc>
         <w:tc>
           <w:tcPr>
-            <w:tcW w:type="dxa" w:w="1430"/>
-            <w:vAlign w:val="center"/>
-          </w:tcPr>
-          <w:p/>
-        </w:tc>
-        <w:tc>
-          <w:tcPr>
-            <w:tcW w:type="dxa" w:w="1430"/>
-            <w:vAlign w:val="center"/>
-          </w:tcPr>
-          <w:p/>
-        </w:tc>
-        <w:tc>
-          <w:tcPr>
-            <w:tcW w:type="dxa" w:w="1430"/>
-            <w:vAlign w:val="center"/>
-          </w:tcPr>
-          <w:p/>
-        </w:tc>
-        <w:tc>
-          <w:tcPr>
-            <w:tcW w:type="dxa" w:w="1430"/>
-            <w:vAlign w:val="center"/>
-          </w:tcPr>
-          <w:p/>
-        </w:tc>
-        <w:tc>
-          <w:tcPr>
-            <w:tcW w:type="dxa" w:w="1430"/>
+            <w:tcW w:type="dxa" w:w="1189"/>
+            <w:vAlign w:val="center"/>
+          </w:tcPr>
+          <w:p/>
+        </w:tc>
+        <w:tc>
+          <w:tcPr>
+            <w:tcW w:type="dxa" w:w="1189"/>
+            <w:vAlign w:val="center"/>
+          </w:tcPr>
+          <w:p/>
+        </w:tc>
+        <w:tc>
+          <w:tcPr>
+            <w:tcW w:type="dxa" w:w="1189"/>
+            <w:vAlign w:val="center"/>
+          </w:tcPr>
+          <w:p/>
+        </w:tc>
+        <w:tc>
+          <w:tcPr>
+            <w:tcW w:type="dxa" w:w="1189"/>
+            <w:vAlign w:val="center"/>
+          </w:tcPr>
+          <w:p/>
+        </w:tc>
+        <w:tc>
+          <w:tcPr>
+            <w:tcW w:type="dxa" w:w="1189"/>
+            <w:vAlign w:val="center"/>
+          </w:tcPr>
+          <w:p/>
+        </w:tc>
+        <w:tc>
+          <w:tcPr>
+            <w:tcW w:type="dxa" w:w="1189"/>
+            <w:vAlign w:val="center"/>
+          </w:tcPr>
+          <w:p/>
+        </w:tc>
+        <w:tc>
+          <w:tcPr>
+            <w:tcW w:type="dxa" w:w="1189"/>
+            <w:vAlign w:val="center"/>
+          </w:tcPr>
+          <w:p/>
+        </w:tc>
+        <w:tc>
+          <w:tcPr>
+            <w:tcW w:type="dxa" w:w="1189"/>
+            <w:vAlign w:val="center"/>
+          </w:tcPr>
+          <w:p/>
+        </w:tc>
+        <w:tc>
+          <w:tcPr>
+            <w:tcW w:type="dxa" w:w="1189"/>
             <w:vAlign w:val="center"/>
           </w:tcPr>
           <w:p/>
@@ -1753,8 +2297,7 @@
         </w:tc>
         <w:tc>
           <w:tcPr>
-            <w:tcW w:type="dxa" w:w="3750"/>
-            <w:shd w:fill="F2F2F2" w:color="auto" w:val="clear"/>
+            <w:tcW w:type="dxa" w:w="2900"/>
             <w:vAlign w:val="center"/>
           </w:tcPr>
           <w:p>
@@ -1768,49 +2311,84 @@
               </w:rPr>
               <w:t xml:space="preserve">ORÉE – Messieurs 3</w:t>
             </w:r>
-            <w:r>
-              <w:rPr>
-                <w:b/>
-                <w:bCs/>
-                <w:color w:val="C0392B"/>
-                <w:sz w:val="18"/>
-                <w:szCs w:val="18"/>
-              </w:rPr>
-              <w:t xml:space="preserve">  — NC</w:t>
-            </w:r>
-          </w:p>
-        </w:tc>
-        <w:tc>
-          <w:tcPr>
-            <w:tcW w:type="dxa" w:w="1430"/>
-            <w:vAlign w:val="center"/>
-          </w:tcPr>
-          <w:p/>
-        </w:tc>
-        <w:tc>
-          <w:tcPr>
-            <w:tcW w:type="dxa" w:w="1430"/>
-            <w:vAlign w:val="center"/>
-          </w:tcPr>
-          <w:p/>
-        </w:tc>
-        <w:tc>
-          <w:tcPr>
-            <w:tcW w:type="dxa" w:w="1430"/>
-            <w:vAlign w:val="center"/>
-          </w:tcPr>
-          <w:p/>
-        </w:tc>
-        <w:tc>
-          <w:tcPr>
-            <w:tcW w:type="dxa" w:w="1430"/>
-            <w:vAlign w:val="center"/>
-          </w:tcPr>
-          <w:p/>
-        </w:tc>
-        <w:tc>
-          <w:tcPr>
-            <w:tcW w:type="dxa" w:w="1430"/>
+          </w:p>
+        </w:tc>
+        <w:tc>
+          <w:tcPr>
+            <w:tcW w:type="dxa" w:w="1189"/>
+            <w:vAlign w:val="center"/>
+          </w:tcPr>
+          <w:p/>
+        </w:tc>
+        <w:tc>
+          <w:tcPr>
+            <w:tcW w:type="dxa" w:w="1189"/>
+            <w:vAlign w:val="center"/>
+          </w:tcPr>
+          <w:p>
+            <w:pPr>
+              <w:spacing w:after="0" w:line="240"/>
+              <w:jc w:val="center"/>
+            </w:pPr>
+            <w:r>
+              <w:rPr>
+                <w:b/>
+                <w:bCs/>
+                <w:i w:val="false"/>
+                <w:iCs w:val="false"/>
+                <w:color w:val="7FA02A"/>
+                <w:sz w:val="16"/>
+                <w:szCs w:val="16"/>
+              </w:rPr>
+              <w:t xml:space="preserve">13h00</w:t>
+            </w:r>
+          </w:p>
+        </w:tc>
+        <w:tc>
+          <w:tcPr>
+            <w:tcW w:type="dxa" w:w="1189"/>
+            <w:vAlign w:val="center"/>
+          </w:tcPr>
+          <w:p/>
+        </w:tc>
+        <w:tc>
+          <w:tcPr>
+            <w:tcW w:type="dxa" w:w="1189"/>
+            <w:vAlign w:val="center"/>
+          </w:tcPr>
+          <w:p/>
+        </w:tc>
+        <w:tc>
+          <w:tcPr>
+            <w:tcW w:type="dxa" w:w="1189"/>
+            <w:vAlign w:val="center"/>
+          </w:tcPr>
+          <w:p/>
+        </w:tc>
+        <w:tc>
+          <w:tcPr>
+            <w:tcW w:type="dxa" w:w="1189"/>
+            <w:vAlign w:val="center"/>
+          </w:tcPr>
+          <w:p/>
+        </w:tc>
+        <w:tc>
+          <w:tcPr>
+            <w:tcW w:type="dxa" w:w="1189"/>
+            <w:vAlign w:val="center"/>
+          </w:tcPr>
+          <w:p/>
+        </w:tc>
+        <w:tc>
+          <w:tcPr>
+            <w:tcW w:type="dxa" w:w="1189"/>
+            <w:vAlign w:val="center"/>
+          </w:tcPr>
+          <w:p/>
+        </w:tc>
+        <w:tc>
+          <w:tcPr>
+            <w:tcW w:type="dxa" w:w="1189"/>
             <w:vAlign w:val="center"/>
           </w:tcPr>
           <w:p/>
@@ -1828,7 +2406,7 @@
         </w:tc>
         <w:tc>
           <w:tcPr>
-            <w:tcW w:type="dxa" w:w="3750"/>
+            <w:tcW w:type="dxa" w:w="2900"/>
             <w:shd w:fill="F2F2F2" w:color="auto" w:val="clear"/>
             <w:vAlign w:val="center"/>
           </w:tcPr>
@@ -1857,35 +2435,63 @@
         </w:tc>
         <w:tc>
           <w:tcPr>
-            <w:tcW w:type="dxa" w:w="1430"/>
-            <w:vAlign w:val="center"/>
-          </w:tcPr>
-          <w:p/>
-        </w:tc>
-        <w:tc>
-          <w:tcPr>
-            <w:tcW w:type="dxa" w:w="1430"/>
-            <w:vAlign w:val="center"/>
-          </w:tcPr>
-          <w:p/>
-        </w:tc>
-        <w:tc>
-          <w:tcPr>
-            <w:tcW w:type="dxa" w:w="1430"/>
-            <w:vAlign w:val="center"/>
-          </w:tcPr>
-          <w:p/>
-        </w:tc>
-        <w:tc>
-          <w:tcPr>
-            <w:tcW w:type="dxa" w:w="1430"/>
-            <w:vAlign w:val="center"/>
-          </w:tcPr>
-          <w:p/>
-        </w:tc>
-        <w:tc>
-          <w:tcPr>
-            <w:tcW w:type="dxa" w:w="1430"/>
+            <w:tcW w:type="dxa" w:w="1189"/>
+            <w:vAlign w:val="center"/>
+          </w:tcPr>
+          <w:p/>
+        </w:tc>
+        <w:tc>
+          <w:tcPr>
+            <w:tcW w:type="dxa" w:w="1189"/>
+            <w:vAlign w:val="center"/>
+          </w:tcPr>
+          <w:p/>
+        </w:tc>
+        <w:tc>
+          <w:tcPr>
+            <w:tcW w:type="dxa" w:w="1189"/>
+            <w:vAlign w:val="center"/>
+          </w:tcPr>
+          <w:p/>
+        </w:tc>
+        <w:tc>
+          <w:tcPr>
+            <w:tcW w:type="dxa" w:w="1189"/>
+            <w:vAlign w:val="center"/>
+          </w:tcPr>
+          <w:p/>
+        </w:tc>
+        <w:tc>
+          <w:tcPr>
+            <w:tcW w:type="dxa" w:w="1189"/>
+            <w:vAlign w:val="center"/>
+          </w:tcPr>
+          <w:p/>
+        </w:tc>
+        <w:tc>
+          <w:tcPr>
+            <w:tcW w:type="dxa" w:w="1189"/>
+            <w:vAlign w:val="center"/>
+          </w:tcPr>
+          <w:p/>
+        </w:tc>
+        <w:tc>
+          <w:tcPr>
+            <w:tcW w:type="dxa" w:w="1189"/>
+            <w:vAlign w:val="center"/>
+          </w:tcPr>
+          <w:p/>
+        </w:tc>
+        <w:tc>
+          <w:tcPr>
+            <w:tcW w:type="dxa" w:w="1189"/>
+            <w:vAlign w:val="center"/>
+          </w:tcPr>
+          <w:p/>
+        </w:tc>
+        <w:tc>
+          <w:tcPr>
+            <w:tcW w:type="dxa" w:w="1189"/>
             <w:vAlign w:val="center"/>
           </w:tcPr>
           <w:p/>
@@ -1897,7 +2503,7 @@
         </w:trPr>
         <w:tc>
           <w:tcPr>
-            <w:tcW w:type="dxa" w:w="3050"/>
+            <w:tcW w:type="dxa" w:w="2100"/>
             <w:vMerge w:val="restart"/>
             <w:vAlign w:val="center"/>
           </w:tcPr>
@@ -1934,7 +2540,7 @@
         </w:tc>
         <w:tc>
           <w:tcPr>
-            <w:tcW w:type="dxa" w:w="3750"/>
+            <w:tcW w:type="dxa" w:w="2900"/>
             <w:vAlign w:val="center"/>
           </w:tcPr>
           <w:p>
@@ -1952,7 +2558,21 @@
         </w:tc>
         <w:tc>
           <w:tcPr>
-            <w:tcW w:type="dxa" w:w="1430"/>
+            <w:tcW w:type="dxa" w:w="1189"/>
+            <w:vAlign w:val="center"/>
+          </w:tcPr>
+          <w:p/>
+        </w:tc>
+        <w:tc>
+          <w:tcPr>
+            <w:tcW w:type="dxa" w:w="1189"/>
+            <w:vAlign w:val="center"/>
+          </w:tcPr>
+          <w:p/>
+        </w:tc>
+        <w:tc>
+          <w:tcPr>
+            <w:tcW w:type="dxa" w:w="1189"/>
             <w:vAlign w:val="center"/>
           </w:tcPr>
           <w:p>
@@ -1967,8 +2587,8 @@
                 <w:i w:val="false"/>
                 <w:iCs w:val="false"/>
                 <w:color w:val="7FA02A"/>
-                <w:sz w:val="18"/>
-                <w:szCs w:val="18"/>
+                <w:sz w:val="16"/>
+                <w:szCs w:val="16"/>
               </w:rPr>
               <w:t xml:space="preserve">12h15</w:t>
             </w:r>
@@ -1985,8 +2605,8 @@
                 <w:i w:val="false"/>
                 <w:iCs w:val="false"/>
                 <w:color w:val="7FA02A"/>
-                <w:sz w:val="18"/>
-                <w:szCs w:val="18"/>
+                <w:sz w:val="16"/>
+                <w:szCs w:val="16"/>
               </w:rPr>
               <w:t xml:space="preserve">(vs Gabre)</w:t>
             </w:r>
@@ -1994,28 +2614,42 @@
         </w:tc>
         <w:tc>
           <w:tcPr>
-            <w:tcW w:type="dxa" w:w="1430"/>
-            <w:vAlign w:val="center"/>
-          </w:tcPr>
-          <w:p/>
-        </w:tc>
-        <w:tc>
-          <w:tcPr>
-            <w:tcW w:type="dxa" w:w="1430"/>
-            <w:vAlign w:val="center"/>
-          </w:tcPr>
-          <w:p/>
-        </w:tc>
-        <w:tc>
-          <w:tcPr>
-            <w:tcW w:type="dxa" w:w="1430"/>
-            <w:vAlign w:val="center"/>
-          </w:tcPr>
-          <w:p/>
-        </w:tc>
-        <w:tc>
-          <w:tcPr>
-            <w:tcW w:type="dxa" w:w="1430"/>
+            <w:tcW w:type="dxa" w:w="1189"/>
+            <w:vAlign w:val="center"/>
+          </w:tcPr>
+          <w:p/>
+        </w:tc>
+        <w:tc>
+          <w:tcPr>
+            <w:tcW w:type="dxa" w:w="1189"/>
+            <w:vAlign w:val="center"/>
+          </w:tcPr>
+          <w:p/>
+        </w:tc>
+        <w:tc>
+          <w:tcPr>
+            <w:tcW w:type="dxa" w:w="1189"/>
+            <w:vAlign w:val="center"/>
+          </w:tcPr>
+          <w:p/>
+        </w:tc>
+        <w:tc>
+          <w:tcPr>
+            <w:tcW w:type="dxa" w:w="1189"/>
+            <w:vAlign w:val="center"/>
+          </w:tcPr>
+          <w:p/>
+        </w:tc>
+        <w:tc>
+          <w:tcPr>
+            <w:tcW w:type="dxa" w:w="1189"/>
+            <w:vAlign w:val="center"/>
+          </w:tcPr>
+          <w:p/>
+        </w:tc>
+        <w:tc>
+          <w:tcPr>
+            <w:tcW w:type="dxa" w:w="1189"/>
             <w:vAlign w:val="center"/>
           </w:tcPr>
           <w:p/>
@@ -2033,7 +2667,7 @@
         </w:tc>
         <w:tc>
           <w:tcPr>
-            <w:tcW w:type="dxa" w:w="3750"/>
+            <w:tcW w:type="dxa" w:w="2900"/>
             <w:vAlign w:val="center"/>
           </w:tcPr>
           <w:p>
@@ -2051,21 +2685,35 @@
         </w:tc>
         <w:tc>
           <w:tcPr>
-            <w:tcW w:type="dxa" w:w="1430"/>
-            <w:vAlign w:val="center"/>
-          </w:tcPr>
-          <w:p/>
-        </w:tc>
-        <w:tc>
-          <w:tcPr>
-            <w:tcW w:type="dxa" w:w="1430"/>
-            <w:vAlign w:val="center"/>
-          </w:tcPr>
-          <w:p/>
-        </w:tc>
-        <w:tc>
-          <w:tcPr>
-            <w:tcW w:type="dxa" w:w="1430"/>
+            <w:tcW w:type="dxa" w:w="1189"/>
+            <w:vAlign w:val="center"/>
+          </w:tcPr>
+          <w:p/>
+        </w:tc>
+        <w:tc>
+          <w:tcPr>
+            <w:tcW w:type="dxa" w:w="1189"/>
+            <w:vAlign w:val="center"/>
+          </w:tcPr>
+          <w:p/>
+        </w:tc>
+        <w:tc>
+          <w:tcPr>
+            <w:tcW w:type="dxa" w:w="1189"/>
+            <w:vAlign w:val="center"/>
+          </w:tcPr>
+          <w:p/>
+        </w:tc>
+        <w:tc>
+          <w:tcPr>
+            <w:tcW w:type="dxa" w:w="1189"/>
+            <w:vAlign w:val="center"/>
+          </w:tcPr>
+          <w:p/>
+        </w:tc>
+        <w:tc>
+          <w:tcPr>
+            <w:tcW w:type="dxa" w:w="1189"/>
             <w:vAlign w:val="center"/>
           </w:tcPr>
           <w:p>
@@ -2080,8 +2728,8 @@
                 <w:i w:val="false"/>
                 <w:iCs w:val="false"/>
                 <w:color w:val="7FA02A"/>
-                <w:sz w:val="18"/>
-                <w:szCs w:val="18"/>
+                <w:sz w:val="16"/>
+                <w:szCs w:val="16"/>
               </w:rPr>
               <w:t xml:space="preserve">12h00 (vs Gabre)</w:t>
             </w:r>
@@ -2098,8 +2746,8 @@
                 <w:i w:val="false"/>
                 <w:iCs w:val="false"/>
                 <w:color w:val="7FA02A"/>
-                <w:sz w:val="18"/>
-                <w:szCs w:val="18"/>
+                <w:sz w:val="16"/>
+                <w:szCs w:val="16"/>
               </w:rPr>
               <w:t xml:space="preserve">12h45 (vs Magaz)</w:t>
             </w:r>
@@ -2107,14 +2755,28 @@
         </w:tc>
         <w:tc>
           <w:tcPr>
-            <w:tcW w:type="dxa" w:w="1430"/>
-            <w:vAlign w:val="center"/>
-          </w:tcPr>
-          <w:p/>
-        </w:tc>
-        <w:tc>
-          <w:tcPr>
-            <w:tcW w:type="dxa" w:w="1430"/>
+            <w:tcW w:type="dxa" w:w="1189"/>
+            <w:vAlign w:val="center"/>
+          </w:tcPr>
+          <w:p/>
+        </w:tc>
+        <w:tc>
+          <w:tcPr>
+            <w:tcW w:type="dxa" w:w="1189"/>
+            <w:vAlign w:val="center"/>
+          </w:tcPr>
+          <w:p/>
+        </w:tc>
+        <w:tc>
+          <w:tcPr>
+            <w:tcW w:type="dxa" w:w="1189"/>
+            <w:vAlign w:val="center"/>
+          </w:tcPr>
+          <w:p/>
+        </w:tc>
+        <w:tc>
+          <w:tcPr>
+            <w:tcW w:type="dxa" w:w="1189"/>
             <w:vAlign w:val="center"/>
           </w:tcPr>
           <w:p/>
@@ -2126,7 +2788,7 @@
         </w:trPr>
         <w:tc>
           <w:tcPr>
-            <w:tcW w:type="dxa" w:w="3050"/>
+            <w:tcW w:type="dxa" w:w="2100"/>
             <w:vAlign w:val="center"/>
           </w:tcPr>
           <w:p>
@@ -2162,7 +2824,7 @@
         </w:tc>
         <w:tc>
           <w:tcPr>
-            <w:tcW w:type="dxa" w:w="3750"/>
+            <w:tcW w:type="dxa" w:w="2900"/>
             <w:vAlign w:val="center"/>
           </w:tcPr>
           <w:p>
@@ -2180,7 +2842,21 @@
         </w:tc>
         <w:tc>
           <w:tcPr>
-            <w:tcW w:type="dxa" w:w="1430"/>
+            <w:tcW w:type="dxa" w:w="1189"/>
+            <w:vAlign w:val="center"/>
+          </w:tcPr>
+          <w:p/>
+        </w:tc>
+        <w:tc>
+          <w:tcPr>
+            <w:tcW w:type="dxa" w:w="1189"/>
+            <w:vAlign w:val="center"/>
+          </w:tcPr>
+          <w:p/>
+        </w:tc>
+        <w:tc>
+          <w:tcPr>
+            <w:tcW w:type="dxa" w:w="1189"/>
             <w:vAlign w:val="center"/>
           </w:tcPr>
           <w:p>
@@ -2195,8 +2871,8 @@
                 <w:i w:val="false"/>
                 <w:iCs w:val="false"/>
                 <w:color w:val="7FA02A"/>
-                <w:sz w:val="18"/>
-                <w:szCs w:val="18"/>
+                <w:sz w:val="16"/>
+                <w:szCs w:val="16"/>
               </w:rPr>
               <w:t xml:space="preserve">13h00</w:t>
             </w:r>
@@ -2213,8 +2889,8 @@
                 <w:i w:val="false"/>
                 <w:iCs w:val="false"/>
                 <w:color w:val="7FA02A"/>
-                <w:sz w:val="18"/>
-                <w:szCs w:val="18"/>
+                <w:sz w:val="16"/>
+                <w:szCs w:val="16"/>
               </w:rPr>
               <w:t xml:space="preserve">(vs Dupont-Certain)</w:t>
             </w:r>
@@ -2222,28 +2898,42 @@
         </w:tc>
         <w:tc>
           <w:tcPr>
-            <w:tcW w:type="dxa" w:w="1430"/>
-            <w:vAlign w:val="center"/>
-          </w:tcPr>
-          <w:p/>
-        </w:tc>
-        <w:tc>
-          <w:tcPr>
-            <w:tcW w:type="dxa" w:w="1430"/>
-            <w:vAlign w:val="center"/>
-          </w:tcPr>
-          <w:p/>
-        </w:tc>
-        <w:tc>
-          <w:tcPr>
-            <w:tcW w:type="dxa" w:w="1430"/>
-            <w:vAlign w:val="center"/>
-          </w:tcPr>
-          <w:p/>
-        </w:tc>
-        <w:tc>
-          <w:tcPr>
-            <w:tcW w:type="dxa" w:w="1430"/>
+            <w:tcW w:type="dxa" w:w="1189"/>
+            <w:vAlign w:val="center"/>
+          </w:tcPr>
+          <w:p/>
+        </w:tc>
+        <w:tc>
+          <w:tcPr>
+            <w:tcW w:type="dxa" w:w="1189"/>
+            <w:vAlign w:val="center"/>
+          </w:tcPr>
+          <w:p/>
+        </w:tc>
+        <w:tc>
+          <w:tcPr>
+            <w:tcW w:type="dxa" w:w="1189"/>
+            <w:vAlign w:val="center"/>
+          </w:tcPr>
+          <w:p/>
+        </w:tc>
+        <w:tc>
+          <w:tcPr>
+            <w:tcW w:type="dxa" w:w="1189"/>
+            <w:vAlign w:val="center"/>
+          </w:tcPr>
+          <w:p/>
+        </w:tc>
+        <w:tc>
+          <w:tcPr>
+            <w:tcW w:type="dxa" w:w="1189"/>
+            <w:vAlign w:val="center"/>
+          </w:tcPr>
+          <w:p/>
+        </w:tc>
+        <w:tc>
+          <w:tcPr>
+            <w:tcW w:type="dxa" w:w="1189"/>
             <w:vAlign w:val="center"/>
           </w:tcPr>
           <w:p/>
@@ -2255,7 +2945,7 @@
         </w:trPr>
         <w:tc>
           <w:tcPr>
-            <w:tcW w:type="dxa" w:w="3050"/>
+            <w:tcW w:type="dxa" w:w="2100"/>
             <w:vAlign w:val="center"/>
           </w:tcPr>
           <w:p>
@@ -2291,7 +2981,7 @@
         </w:tc>
         <w:tc>
           <w:tcPr>
-            <w:tcW w:type="dxa" w:w="3750"/>
+            <w:tcW w:type="dxa" w:w="2900"/>
             <w:vAlign w:val="center"/>
           </w:tcPr>
           <w:p>
@@ -2315,35 +3005,63 @@
         </w:tc>
         <w:tc>
           <w:tcPr>
-            <w:tcW w:type="dxa" w:w="1430"/>
-            <w:vAlign w:val="center"/>
-          </w:tcPr>
-          <w:p/>
-        </w:tc>
-        <w:tc>
-          <w:tcPr>
-            <w:tcW w:type="dxa" w:w="1430"/>
-            <w:vAlign w:val="center"/>
-          </w:tcPr>
-          <w:p/>
-        </w:tc>
-        <w:tc>
-          <w:tcPr>
-            <w:tcW w:type="dxa" w:w="1430"/>
-            <w:vAlign w:val="center"/>
-          </w:tcPr>
-          <w:p/>
-        </w:tc>
-        <w:tc>
-          <w:tcPr>
-            <w:tcW w:type="dxa" w:w="1430"/>
-            <w:vAlign w:val="center"/>
-          </w:tcPr>
-          <w:p/>
-        </w:tc>
-        <w:tc>
-          <w:tcPr>
-            <w:tcW w:type="dxa" w:w="1430"/>
+            <w:tcW w:type="dxa" w:w="1189"/>
+            <w:vAlign w:val="center"/>
+          </w:tcPr>
+          <w:p/>
+        </w:tc>
+        <w:tc>
+          <w:tcPr>
+            <w:tcW w:type="dxa" w:w="1189"/>
+            <w:vAlign w:val="center"/>
+          </w:tcPr>
+          <w:p/>
+        </w:tc>
+        <w:tc>
+          <w:tcPr>
+            <w:tcW w:type="dxa" w:w="1189"/>
+            <w:vAlign w:val="center"/>
+          </w:tcPr>
+          <w:p/>
+        </w:tc>
+        <w:tc>
+          <w:tcPr>
+            <w:tcW w:type="dxa" w:w="1189"/>
+            <w:vAlign w:val="center"/>
+          </w:tcPr>
+          <w:p/>
+        </w:tc>
+        <w:tc>
+          <w:tcPr>
+            <w:tcW w:type="dxa" w:w="1189"/>
+            <w:vAlign w:val="center"/>
+          </w:tcPr>
+          <w:p/>
+        </w:tc>
+        <w:tc>
+          <w:tcPr>
+            <w:tcW w:type="dxa" w:w="1189"/>
+            <w:vAlign w:val="center"/>
+          </w:tcPr>
+          <w:p/>
+        </w:tc>
+        <w:tc>
+          <w:tcPr>
+            <w:tcW w:type="dxa" w:w="1189"/>
+            <w:vAlign w:val="center"/>
+          </w:tcPr>
+          <w:p/>
+        </w:tc>
+        <w:tc>
+          <w:tcPr>
+            <w:tcW w:type="dxa" w:w="1189"/>
+            <w:vAlign w:val="center"/>
+          </w:tcPr>
+          <w:p/>
+        </w:tc>
+        <w:tc>
+          <w:tcPr>
+            <w:tcW w:type="dxa" w:w="1189"/>
             <w:vAlign w:val="center"/>
           </w:tcPr>
           <w:p/>
@@ -2355,7 +3073,7 @@
         </w:trPr>
         <w:tc>
           <w:tcPr>
-            <w:tcW w:type="dxa" w:w="3050"/>
+            <w:tcW w:type="dxa" w:w="2100"/>
             <w:vMerge w:val="restart"/>
             <w:vAlign w:val="center"/>
           </w:tcPr>
@@ -2392,7 +3110,7 @@
         </w:tc>
         <w:tc>
           <w:tcPr>
-            <w:tcW w:type="dxa" w:w="3750"/>
+            <w:tcW w:type="dxa" w:w="2900"/>
             <w:shd w:fill="F2F2F2" w:color="auto" w:val="clear"/>
             <w:vAlign w:val="center"/>
           </w:tcPr>
@@ -2421,35 +3139,63 @@
         </w:tc>
         <w:tc>
           <w:tcPr>
-            <w:tcW w:type="dxa" w:w="1430"/>
-            <w:vAlign w:val="center"/>
-          </w:tcPr>
-          <w:p/>
-        </w:tc>
-        <w:tc>
-          <w:tcPr>
-            <w:tcW w:type="dxa" w:w="1430"/>
-            <w:vAlign w:val="center"/>
-          </w:tcPr>
-          <w:p/>
-        </w:tc>
-        <w:tc>
-          <w:tcPr>
-            <w:tcW w:type="dxa" w:w="1430"/>
-            <w:vAlign w:val="center"/>
-          </w:tcPr>
-          <w:p/>
-        </w:tc>
-        <w:tc>
-          <w:tcPr>
-            <w:tcW w:type="dxa" w:w="1430"/>
-            <w:vAlign w:val="center"/>
-          </w:tcPr>
-          <w:p/>
-        </w:tc>
-        <w:tc>
-          <w:tcPr>
-            <w:tcW w:type="dxa" w:w="1430"/>
+            <w:tcW w:type="dxa" w:w="1189"/>
+            <w:vAlign w:val="center"/>
+          </w:tcPr>
+          <w:p/>
+        </w:tc>
+        <w:tc>
+          <w:tcPr>
+            <w:tcW w:type="dxa" w:w="1189"/>
+            <w:vAlign w:val="center"/>
+          </w:tcPr>
+          <w:p/>
+        </w:tc>
+        <w:tc>
+          <w:tcPr>
+            <w:tcW w:type="dxa" w:w="1189"/>
+            <w:vAlign w:val="center"/>
+          </w:tcPr>
+          <w:p/>
+        </w:tc>
+        <w:tc>
+          <w:tcPr>
+            <w:tcW w:type="dxa" w:w="1189"/>
+            <w:vAlign w:val="center"/>
+          </w:tcPr>
+          <w:p/>
+        </w:tc>
+        <w:tc>
+          <w:tcPr>
+            <w:tcW w:type="dxa" w:w="1189"/>
+            <w:vAlign w:val="center"/>
+          </w:tcPr>
+          <w:p/>
+        </w:tc>
+        <w:tc>
+          <w:tcPr>
+            <w:tcW w:type="dxa" w:w="1189"/>
+            <w:vAlign w:val="center"/>
+          </w:tcPr>
+          <w:p/>
+        </w:tc>
+        <w:tc>
+          <w:tcPr>
+            <w:tcW w:type="dxa" w:w="1189"/>
+            <w:vAlign w:val="center"/>
+          </w:tcPr>
+          <w:p/>
+        </w:tc>
+        <w:tc>
+          <w:tcPr>
+            <w:tcW w:type="dxa" w:w="1189"/>
+            <w:vAlign w:val="center"/>
+          </w:tcPr>
+          <w:p/>
+        </w:tc>
+        <w:tc>
+          <w:tcPr>
+            <w:tcW w:type="dxa" w:w="1189"/>
             <w:vAlign w:val="center"/>
           </w:tcPr>
           <w:p/>
@@ -2467,7 +3213,7 @@
         </w:tc>
         <w:tc>
           <w:tcPr>
-            <w:tcW w:type="dxa" w:w="3750"/>
+            <w:tcW w:type="dxa" w:w="2900"/>
             <w:shd w:fill="F2F2F2" w:color="auto" w:val="clear"/>
             <w:vAlign w:val="center"/>
           </w:tcPr>
@@ -2496,35 +3242,63 @@
         </w:tc>
         <w:tc>
           <w:tcPr>
-            <w:tcW w:type="dxa" w:w="1430"/>
-            <w:vAlign w:val="center"/>
-          </w:tcPr>
-          <w:p/>
-        </w:tc>
-        <w:tc>
-          <w:tcPr>
-            <w:tcW w:type="dxa" w:w="1430"/>
-            <w:vAlign w:val="center"/>
-          </w:tcPr>
-          <w:p/>
-        </w:tc>
-        <w:tc>
-          <w:tcPr>
-            <w:tcW w:type="dxa" w:w="1430"/>
-            <w:vAlign w:val="center"/>
-          </w:tcPr>
-          <w:p/>
-        </w:tc>
-        <w:tc>
-          <w:tcPr>
-            <w:tcW w:type="dxa" w:w="1430"/>
-            <w:vAlign w:val="center"/>
-          </w:tcPr>
-          <w:p/>
-        </w:tc>
-        <w:tc>
-          <w:tcPr>
-            <w:tcW w:type="dxa" w:w="1430"/>
+            <w:tcW w:type="dxa" w:w="1189"/>
+            <w:vAlign w:val="center"/>
+          </w:tcPr>
+          <w:p/>
+        </w:tc>
+        <w:tc>
+          <w:tcPr>
+            <w:tcW w:type="dxa" w:w="1189"/>
+            <w:vAlign w:val="center"/>
+          </w:tcPr>
+          <w:p/>
+        </w:tc>
+        <w:tc>
+          <w:tcPr>
+            <w:tcW w:type="dxa" w:w="1189"/>
+            <w:vAlign w:val="center"/>
+          </w:tcPr>
+          <w:p/>
+        </w:tc>
+        <w:tc>
+          <w:tcPr>
+            <w:tcW w:type="dxa" w:w="1189"/>
+            <w:vAlign w:val="center"/>
+          </w:tcPr>
+          <w:p/>
+        </w:tc>
+        <w:tc>
+          <w:tcPr>
+            <w:tcW w:type="dxa" w:w="1189"/>
+            <w:vAlign w:val="center"/>
+          </w:tcPr>
+          <w:p/>
+        </w:tc>
+        <w:tc>
+          <w:tcPr>
+            <w:tcW w:type="dxa" w:w="1189"/>
+            <w:vAlign w:val="center"/>
+          </w:tcPr>
+          <w:p/>
+        </w:tc>
+        <w:tc>
+          <w:tcPr>
+            <w:tcW w:type="dxa" w:w="1189"/>
+            <w:vAlign w:val="center"/>
+          </w:tcPr>
+          <w:p/>
+        </w:tc>
+        <w:tc>
+          <w:tcPr>
+            <w:tcW w:type="dxa" w:w="1189"/>
+            <w:vAlign w:val="center"/>
+          </w:tcPr>
+          <w:p/>
+        </w:tc>
+        <w:tc>
+          <w:tcPr>
+            <w:tcW w:type="dxa" w:w="1189"/>
             <w:vAlign w:val="center"/>
           </w:tcPr>
           <w:p/>
@@ -2542,7 +3316,7 @@
         </w:tc>
         <w:tc>
           <w:tcPr>
-            <w:tcW w:type="dxa" w:w="3750"/>
+            <w:tcW w:type="dxa" w:w="2900"/>
             <w:shd w:fill="F2F2F2" w:color="auto" w:val="clear"/>
             <w:vAlign w:val="center"/>
           </w:tcPr>
@@ -2571,35 +3345,63 @@
         </w:tc>
         <w:tc>
           <w:tcPr>
-            <w:tcW w:type="dxa" w:w="1430"/>
-            <w:vAlign w:val="center"/>
-          </w:tcPr>
-          <w:p/>
-        </w:tc>
-        <w:tc>
-          <w:tcPr>
-            <w:tcW w:type="dxa" w:w="1430"/>
-            <w:vAlign w:val="center"/>
-          </w:tcPr>
-          <w:p/>
-        </w:tc>
-        <w:tc>
-          <w:tcPr>
-            <w:tcW w:type="dxa" w:w="1430"/>
-            <w:vAlign w:val="center"/>
-          </w:tcPr>
-          <w:p/>
-        </w:tc>
-        <w:tc>
-          <w:tcPr>
-            <w:tcW w:type="dxa" w:w="1430"/>
-            <w:vAlign w:val="center"/>
-          </w:tcPr>
-          <w:p/>
-        </w:tc>
-        <w:tc>
-          <w:tcPr>
-            <w:tcW w:type="dxa" w:w="1430"/>
+            <w:tcW w:type="dxa" w:w="1189"/>
+            <w:vAlign w:val="center"/>
+          </w:tcPr>
+          <w:p/>
+        </w:tc>
+        <w:tc>
+          <w:tcPr>
+            <w:tcW w:type="dxa" w:w="1189"/>
+            <w:vAlign w:val="center"/>
+          </w:tcPr>
+          <w:p/>
+        </w:tc>
+        <w:tc>
+          <w:tcPr>
+            <w:tcW w:type="dxa" w:w="1189"/>
+            <w:vAlign w:val="center"/>
+          </w:tcPr>
+          <w:p/>
+        </w:tc>
+        <w:tc>
+          <w:tcPr>
+            <w:tcW w:type="dxa" w:w="1189"/>
+            <w:vAlign w:val="center"/>
+          </w:tcPr>
+          <w:p/>
+        </w:tc>
+        <w:tc>
+          <w:tcPr>
+            <w:tcW w:type="dxa" w:w="1189"/>
+            <w:vAlign w:val="center"/>
+          </w:tcPr>
+          <w:p/>
+        </w:tc>
+        <w:tc>
+          <w:tcPr>
+            <w:tcW w:type="dxa" w:w="1189"/>
+            <w:vAlign w:val="center"/>
+          </w:tcPr>
+          <w:p/>
+        </w:tc>
+        <w:tc>
+          <w:tcPr>
+            <w:tcW w:type="dxa" w:w="1189"/>
+            <w:vAlign w:val="center"/>
+          </w:tcPr>
+          <w:p/>
+        </w:tc>
+        <w:tc>
+          <w:tcPr>
+            <w:tcW w:type="dxa" w:w="1189"/>
+            <w:vAlign w:val="center"/>
+          </w:tcPr>
+          <w:p/>
+        </w:tc>
+        <w:tc>
+          <w:tcPr>
+            <w:tcW w:type="dxa" w:w="1189"/>
             <w:vAlign w:val="center"/>
           </w:tcPr>
           <w:p/>
@@ -2638,7 +3440,7 @@
     </w:p>
     <w:sectPr>
       <w:pgSz w:w="16838" w:h="11906" w:orient="landscape"/>
-      <w:pgMar w:top="720" w:right="1440" w:bottom="720" w:left="1440" w:header="708" w:footer="708" w:gutter="0"/>
+      <w:pgMar w:top="567" w:right="567" w:bottom="567" w:left="567" w:header="708" w:footer="708" w:gutter="0"/>
       <w:pgNumType/>
       <w:docGrid w:linePitch="360"/>
     </w:sectPr>

</xml_diff>

<commit_message>
Matchs Toussaint Gr9-10: retrait du tournoi Lambermont + Mason sans tournoi
- Tournoi Lambermont (Brabant) retire (il se termine).
- Rafael Mason (aff. 1123010): aucun tournoi en cours -> liste sans match.
- Matthis Nogues n'avait que Lambermont -> ajoute aux sans match.
Tournois restants: Le Parc, Set Wahis, Castle Club, Oree, Primerose.

Co-Authored-By: Claude Opus 4.8 <noreply@anthropic.com>
Claude-Session: https://claude.ai/code/session_013WShXcCyBkE1H1x1qzmtZK
</commit_message>
<xml_diff>
--- a/Liste_des_matchs_Toussaint_Gr9-10.docx
+++ b/Liste_des_matchs_Toussaint_Gr9-10.docx
@@ -2857,1140 +2857,6 @@
           <w:sz w:val="24"/>
           <w:szCs w:val="24"/>
         </w:rPr>
-        <w:t xml:space="preserve">Tournoi : LAMBERMONT (Brabant)</w:t>
-      </w:r>
-    </w:p>
-    <w:tbl>
-      <w:tblPr>
-        <w:tblW w:type="dxa" w:w="10792"/>
-        <w:tblBorders>
-          <w:top w:val="single" w:color="auto" w:sz="4"/>
-          <w:left w:val="single" w:color="auto" w:sz="4"/>
-          <w:bottom w:val="single" w:color="auto" w:sz="4"/>
-          <w:right w:val="single" w:color="auto" w:sz="4"/>
-          <w:insideH w:val="single" w:color="auto" w:sz="4"/>
-          <w:insideV w:val="single" w:color="auto" w:sz="4"/>
-        </w:tblBorders>
-      </w:tblPr>
-      <w:tblGrid>
-        <w:gridCol w:w="1900"/>
-        <w:gridCol w:w="988"/>
-        <w:gridCol w:w="988"/>
-        <w:gridCol w:w="988"/>
-        <w:gridCol w:w="988"/>
-        <w:gridCol w:w="988"/>
-        <w:gridCol w:w="988"/>
-        <w:gridCol w:w="988"/>
-        <w:gridCol w:w="988"/>
-        <w:gridCol w:w="988"/>
-      </w:tblGrid>
-      <w:tr>
-        <w:trPr>
-          <w:tblHeader/>
-        </w:trPr>
-        <w:tc>
-          <w:tcPr>
-            <w:tcW w:type="dxa" w:w="1900"/>
-            <w:tcMar>
-              <w:top w:type="dxa" w:w="20"/>
-              <w:left w:type="dxa" w:w="60"/>
-              <w:bottom w:type="dxa" w:w="20"/>
-              <w:right w:type="dxa" w:w="40"/>
-            </w:tcMar>
-            <w:vAlign w:val="center"/>
-          </w:tcPr>
-          <w:p>
-            <w:pPr>
-              <w:spacing w:after="0" w:line="220"/>
-              <w:jc w:val="left"/>
-            </w:pPr>
-            <w:r>
-              <w:rPr>
-                <w:b/>
-                <w:bCs/>
-                <w:sz w:val="18"/>
-                <w:szCs w:val="18"/>
-              </w:rPr>
-              <w:t xml:space="preserve">Nom + cat</w:t>
-            </w:r>
-          </w:p>
-        </w:tc>
-        <w:tc>
-          <w:tcPr>
-            <w:tcW w:type="dxa" w:w="988"/>
-            <w:tcMar>
-              <w:top w:type="dxa" w:w="20"/>
-              <w:left w:type="dxa" w:w="60"/>
-              <w:bottom w:type="dxa" w:w="20"/>
-              <w:right w:type="dxa" w:w="40"/>
-            </w:tcMar>
-            <w:vAlign w:val="center"/>
-          </w:tcPr>
-          <w:p>
-            <w:pPr>
-              <w:spacing w:after="0" w:line="220"/>
-              <w:jc w:val="center"/>
-            </w:pPr>
-            <w:r>
-              <w:rPr>
-                <w:b/>
-                <w:bCs/>
-                <w:sz w:val="13"/>
-                <w:szCs w:val="13"/>
-              </w:rPr>
-              <w:t xml:space="preserve">Sam 24/10</w:t>
-            </w:r>
-          </w:p>
-        </w:tc>
-        <w:tc>
-          <w:tcPr>
-            <w:tcW w:type="dxa" w:w="988"/>
-            <w:tcMar>
-              <w:top w:type="dxa" w:w="20"/>
-              <w:left w:type="dxa" w:w="60"/>
-              <w:bottom w:type="dxa" w:w="20"/>
-              <w:right w:type="dxa" w:w="40"/>
-            </w:tcMar>
-            <w:vAlign w:val="center"/>
-          </w:tcPr>
-          <w:p>
-            <w:pPr>
-              <w:spacing w:after="0" w:line="220"/>
-              <w:jc w:val="center"/>
-            </w:pPr>
-            <w:r>
-              <w:rPr>
-                <w:b/>
-                <w:bCs/>
-                <w:sz w:val="13"/>
-                <w:szCs w:val="13"/>
-              </w:rPr>
-              <w:t xml:space="preserve">Dim 25/10</w:t>
-            </w:r>
-          </w:p>
-        </w:tc>
-        <w:tc>
-          <w:tcPr>
-            <w:tcW w:type="dxa" w:w="988"/>
-            <w:tcMar>
-              <w:top w:type="dxa" w:w="20"/>
-              <w:left w:type="dxa" w:w="60"/>
-              <w:bottom w:type="dxa" w:w="20"/>
-              <w:right w:type="dxa" w:w="40"/>
-            </w:tcMar>
-            <w:vAlign w:val="center"/>
-          </w:tcPr>
-          <w:p>
-            <w:pPr>
-              <w:spacing w:after="0" w:line="220"/>
-              <w:jc w:val="center"/>
-            </w:pPr>
-            <w:r>
-              <w:rPr>
-                <w:b/>
-                <w:bCs/>
-                <w:sz w:val="13"/>
-                <w:szCs w:val="13"/>
-              </w:rPr>
-              <w:t xml:space="preserve">Lun 26/10</w:t>
-            </w:r>
-          </w:p>
-        </w:tc>
-        <w:tc>
-          <w:tcPr>
-            <w:tcW w:type="dxa" w:w="988"/>
-            <w:tcMar>
-              <w:top w:type="dxa" w:w="20"/>
-              <w:left w:type="dxa" w:w="60"/>
-              <w:bottom w:type="dxa" w:w="20"/>
-              <w:right w:type="dxa" w:w="40"/>
-            </w:tcMar>
-            <w:vAlign w:val="center"/>
-          </w:tcPr>
-          <w:p>
-            <w:pPr>
-              <w:spacing w:after="0" w:line="220"/>
-              <w:jc w:val="center"/>
-            </w:pPr>
-            <w:r>
-              <w:rPr>
-                <w:b/>
-                <w:bCs/>
-                <w:sz w:val="13"/>
-                <w:szCs w:val="13"/>
-              </w:rPr>
-              <w:t xml:space="preserve">Mar 27/10</w:t>
-            </w:r>
-          </w:p>
-        </w:tc>
-        <w:tc>
-          <w:tcPr>
-            <w:tcW w:type="dxa" w:w="988"/>
-            <w:tcMar>
-              <w:top w:type="dxa" w:w="20"/>
-              <w:left w:type="dxa" w:w="60"/>
-              <w:bottom w:type="dxa" w:w="20"/>
-              <w:right w:type="dxa" w:w="40"/>
-            </w:tcMar>
-            <w:vAlign w:val="center"/>
-          </w:tcPr>
-          <w:p>
-            <w:pPr>
-              <w:spacing w:after="0" w:line="220"/>
-              <w:jc w:val="center"/>
-            </w:pPr>
-            <w:r>
-              <w:rPr>
-                <w:b/>
-                <w:bCs/>
-                <w:sz w:val="13"/>
-                <w:szCs w:val="13"/>
-              </w:rPr>
-              <w:t xml:space="preserve">Mer 28/10</w:t>
-            </w:r>
-          </w:p>
-        </w:tc>
-        <w:tc>
-          <w:tcPr>
-            <w:tcW w:type="dxa" w:w="988"/>
-            <w:tcMar>
-              <w:top w:type="dxa" w:w="20"/>
-              <w:left w:type="dxa" w:w="60"/>
-              <w:bottom w:type="dxa" w:w="20"/>
-              <w:right w:type="dxa" w:w="40"/>
-            </w:tcMar>
-            <w:vAlign w:val="center"/>
-          </w:tcPr>
-          <w:p>
-            <w:pPr>
-              <w:spacing w:after="0" w:line="220"/>
-              <w:jc w:val="center"/>
-            </w:pPr>
-            <w:r>
-              <w:rPr>
-                <w:b/>
-                <w:bCs/>
-                <w:sz w:val="13"/>
-                <w:szCs w:val="13"/>
-              </w:rPr>
-              <w:t xml:space="preserve">Jeu 29/10</w:t>
-            </w:r>
-          </w:p>
-        </w:tc>
-        <w:tc>
-          <w:tcPr>
-            <w:tcW w:type="dxa" w:w="988"/>
-            <w:tcMar>
-              <w:top w:type="dxa" w:w="20"/>
-              <w:left w:type="dxa" w:w="60"/>
-              <w:bottom w:type="dxa" w:w="20"/>
-              <w:right w:type="dxa" w:w="40"/>
-            </w:tcMar>
-            <w:vAlign w:val="center"/>
-          </w:tcPr>
-          <w:p>
-            <w:pPr>
-              <w:spacing w:after="0" w:line="220"/>
-              <w:jc w:val="center"/>
-            </w:pPr>
-            <w:r>
-              <w:rPr>
-                <w:b/>
-                <w:bCs/>
-                <w:sz w:val="13"/>
-                <w:szCs w:val="13"/>
-              </w:rPr>
-              <w:t xml:space="preserve">Ven 30/10</w:t>
-            </w:r>
-          </w:p>
-        </w:tc>
-        <w:tc>
-          <w:tcPr>
-            <w:tcW w:type="dxa" w:w="988"/>
-            <w:tcMar>
-              <w:top w:type="dxa" w:w="20"/>
-              <w:left w:type="dxa" w:w="60"/>
-              <w:bottom w:type="dxa" w:w="20"/>
-              <w:right w:type="dxa" w:w="40"/>
-            </w:tcMar>
-            <w:vAlign w:val="center"/>
-          </w:tcPr>
-          <w:p>
-            <w:pPr>
-              <w:spacing w:after="0" w:line="220"/>
-              <w:jc w:val="center"/>
-            </w:pPr>
-            <w:r>
-              <w:rPr>
-                <w:b/>
-                <w:bCs/>
-                <w:sz w:val="13"/>
-                <w:szCs w:val="13"/>
-              </w:rPr>
-              <w:t xml:space="preserve">Sam 31/10</w:t>
-            </w:r>
-          </w:p>
-        </w:tc>
-        <w:tc>
-          <w:tcPr>
-            <w:tcW w:type="dxa" w:w="988"/>
-            <w:tcMar>
-              <w:top w:type="dxa" w:w="20"/>
-              <w:left w:type="dxa" w:w="60"/>
-              <w:bottom w:type="dxa" w:w="20"/>
-              <w:right w:type="dxa" w:w="40"/>
-            </w:tcMar>
-            <w:vAlign w:val="center"/>
-          </w:tcPr>
-          <w:p>
-            <w:pPr>
-              <w:spacing w:after="0" w:line="220"/>
-              <w:jc w:val="center"/>
-            </w:pPr>
-            <w:r>
-              <w:rPr>
-                <w:b/>
-                <w:bCs/>
-                <w:sz w:val="13"/>
-                <w:szCs w:val="13"/>
-              </w:rPr>
-              <w:t xml:space="preserve">Dim 01/11</w:t>
-            </w:r>
-          </w:p>
-        </w:tc>
-      </w:tr>
-      <w:tr>
-        <w:trPr>
-          <w:cantSplit/>
-        </w:trPr>
-        <w:tc>
-          <w:tcPr>
-            <w:tcW w:type="dxa" w:w="1900"/>
-            <w:tcMar>
-              <w:top w:type="dxa" w:w="20"/>
-              <w:left w:type="dxa" w:w="60"/>
-              <w:bottom w:type="dxa" w:w="20"/>
-              <w:right w:type="dxa" w:w="40"/>
-            </w:tcMar>
-            <w:vAlign w:val="center"/>
-          </w:tcPr>
-          <w:p>
-            <w:pPr>
-              <w:spacing w:after="0" w:line="220"/>
-              <w:jc w:val="left"/>
-            </w:pPr>
-            <w:r>
-              <w:rPr>
-                <w:b w:val="false"/>
-                <w:bCs w:val="false"/>
-                <w:sz w:val="18"/>
-                <w:szCs w:val="18"/>
-              </w:rPr>
-              <w:t xml:space="preserve">Matthis 11.1</w:t>
-            </w:r>
-          </w:p>
-        </w:tc>
-        <w:tc>
-          <w:tcPr>
-            <w:tcW w:type="dxa" w:w="988"/>
-            <w:tcMar>
-              <w:top w:type="dxa" w:w="20"/>
-              <w:left w:type="dxa" w:w="60"/>
-              <w:bottom w:type="dxa" w:w="20"/>
-              <w:right w:type="dxa" w:w="40"/>
-            </w:tcMar>
-            <w:vAlign w:val="center"/>
-          </w:tcPr>
-          <w:p/>
-        </w:tc>
-        <w:tc>
-          <w:tcPr>
-            <w:tcW w:type="dxa" w:w="988"/>
-            <w:tcMar>
-              <w:top w:type="dxa" w:w="20"/>
-              <w:left w:type="dxa" w:w="60"/>
-              <w:bottom w:type="dxa" w:w="20"/>
-              <w:right w:type="dxa" w:w="40"/>
-            </w:tcMar>
-            <w:vAlign w:val="center"/>
-          </w:tcPr>
-          <w:p/>
-        </w:tc>
-        <w:tc>
-          <w:tcPr>
-            <w:tcW w:type="dxa" w:w="988"/>
-            <w:tcMar>
-              <w:top w:type="dxa" w:w="20"/>
-              <w:left w:type="dxa" w:w="60"/>
-              <w:bottom w:type="dxa" w:w="20"/>
-              <w:right w:type="dxa" w:w="40"/>
-            </w:tcMar>
-            <w:vAlign w:val="center"/>
-          </w:tcPr>
-          <w:p>
-            <w:pPr>
-              <w:spacing w:after="0" w:line="220"/>
-              <w:jc w:val="center"/>
-            </w:pPr>
-            <w:r>
-              <w:rPr>
-                <w:b w:val="false"/>
-                <w:bCs w:val="false"/>
-                <w:color w:val="C0392B"/>
-                <w:sz w:val="16"/>
-                <w:szCs w:val="16"/>
-              </w:rPr>
-              <w:t xml:space="preserve">NC</w:t>
-            </w:r>
-          </w:p>
-        </w:tc>
-        <w:tc>
-          <w:tcPr>
-            <w:tcW w:type="dxa" w:w="988"/>
-            <w:tcMar>
-              <w:top w:type="dxa" w:w="20"/>
-              <w:left w:type="dxa" w:w="60"/>
-              <w:bottom w:type="dxa" w:w="20"/>
-              <w:right w:type="dxa" w:w="40"/>
-            </w:tcMar>
-            <w:vAlign w:val="center"/>
-          </w:tcPr>
-          <w:p/>
-        </w:tc>
-        <w:tc>
-          <w:tcPr>
-            <w:tcW w:type="dxa" w:w="988"/>
-            <w:tcMar>
-              <w:top w:type="dxa" w:w="20"/>
-              <w:left w:type="dxa" w:w="60"/>
-              <w:bottom w:type="dxa" w:w="20"/>
-              <w:right w:type="dxa" w:w="40"/>
-            </w:tcMar>
-            <w:vAlign w:val="center"/>
-          </w:tcPr>
-          <w:p/>
-        </w:tc>
-        <w:tc>
-          <w:tcPr>
-            <w:tcW w:type="dxa" w:w="988"/>
-            <w:tcMar>
-              <w:top w:type="dxa" w:w="20"/>
-              <w:left w:type="dxa" w:w="60"/>
-              <w:bottom w:type="dxa" w:w="20"/>
-              <w:right w:type="dxa" w:w="40"/>
-            </w:tcMar>
-            <w:vAlign w:val="center"/>
-          </w:tcPr>
-          <w:p/>
-        </w:tc>
-        <w:tc>
-          <w:tcPr>
-            <w:tcW w:type="dxa" w:w="988"/>
-            <w:tcMar>
-              <w:top w:type="dxa" w:w="20"/>
-              <w:left w:type="dxa" w:w="60"/>
-              <w:bottom w:type="dxa" w:w="20"/>
-              <w:right w:type="dxa" w:w="40"/>
-            </w:tcMar>
-            <w:vAlign w:val="center"/>
-          </w:tcPr>
-          <w:p/>
-        </w:tc>
-        <w:tc>
-          <w:tcPr>
-            <w:tcW w:type="dxa" w:w="988"/>
-            <w:tcMar>
-              <w:top w:type="dxa" w:w="20"/>
-              <w:left w:type="dxa" w:w="60"/>
-              <w:bottom w:type="dxa" w:w="20"/>
-              <w:right w:type="dxa" w:w="40"/>
-            </w:tcMar>
-            <w:vAlign w:val="center"/>
-          </w:tcPr>
-          <w:p/>
-        </w:tc>
-        <w:tc>
-          <w:tcPr>
-            <w:tcW w:type="dxa" w:w="988"/>
-            <w:tcMar>
-              <w:top w:type="dxa" w:w="20"/>
-              <w:left w:type="dxa" w:w="60"/>
-              <w:bottom w:type="dxa" w:w="20"/>
-              <w:right w:type="dxa" w:w="40"/>
-            </w:tcMar>
-            <w:vAlign w:val="center"/>
-          </w:tcPr>
-          <w:p/>
-        </w:tc>
-      </w:tr>
-      <w:tr>
-        <w:trPr>
-          <w:cantSplit/>
-        </w:trPr>
-        <w:tc>
-          <w:tcPr>
-            <w:tcW w:type="dxa" w:w="1900"/>
-            <w:tcMar>
-              <w:top w:type="dxa" w:w="20"/>
-              <w:left w:type="dxa" w:w="60"/>
-              <w:bottom w:type="dxa" w:w="20"/>
-              <w:right w:type="dxa" w:w="40"/>
-            </w:tcMar>
-            <w:vAlign w:val="center"/>
-          </w:tcPr>
-          <w:p>
-            <w:pPr>
-              <w:spacing w:after="0" w:line="220"/>
-              <w:jc w:val="left"/>
-            </w:pPr>
-            <w:r>
-              <w:rPr>
-                <w:b w:val="false"/>
-                <w:bCs w:val="false"/>
-                <w:sz w:val="18"/>
-                <w:szCs w:val="18"/>
-              </w:rPr>
-              <w:t xml:space="preserve">Matthis 13.2</w:t>
-            </w:r>
-          </w:p>
-        </w:tc>
-        <w:tc>
-          <w:tcPr>
-            <w:tcW w:type="dxa" w:w="988"/>
-            <w:tcMar>
-              <w:top w:type="dxa" w:w="20"/>
-              <w:left w:type="dxa" w:w="60"/>
-              <w:bottom w:type="dxa" w:w="20"/>
-              <w:right w:type="dxa" w:w="40"/>
-            </w:tcMar>
-            <w:vAlign w:val="center"/>
-          </w:tcPr>
-          <w:p/>
-        </w:tc>
-        <w:tc>
-          <w:tcPr>
-            <w:tcW w:type="dxa" w:w="988"/>
-            <w:tcMar>
-              <w:top w:type="dxa" w:w="20"/>
-              <w:left w:type="dxa" w:w="60"/>
-              <w:bottom w:type="dxa" w:w="20"/>
-              <w:right w:type="dxa" w:w="40"/>
-            </w:tcMar>
-            <w:vAlign w:val="center"/>
-          </w:tcPr>
-          <w:p/>
-        </w:tc>
-        <w:tc>
-          <w:tcPr>
-            <w:tcW w:type="dxa" w:w="988"/>
-            <w:tcMar>
-              <w:top w:type="dxa" w:w="20"/>
-              <w:left w:type="dxa" w:w="60"/>
-              <w:bottom w:type="dxa" w:w="20"/>
-              <w:right w:type="dxa" w:w="40"/>
-            </w:tcMar>
-            <w:vAlign w:val="center"/>
-          </w:tcPr>
-          <w:p>
-            <w:pPr>
-              <w:spacing w:after="0" w:line="220"/>
-              <w:jc w:val="center"/>
-            </w:pPr>
-            <w:r>
-              <w:rPr>
-                <w:b w:val="false"/>
-                <w:bCs w:val="false"/>
-                <w:color w:val="C0392B"/>
-                <w:sz w:val="16"/>
-                <w:szCs w:val="16"/>
-              </w:rPr>
-              <w:t xml:space="preserve">NC</w:t>
-            </w:r>
-          </w:p>
-        </w:tc>
-        <w:tc>
-          <w:tcPr>
-            <w:tcW w:type="dxa" w:w="988"/>
-            <w:tcMar>
-              <w:top w:type="dxa" w:w="20"/>
-              <w:left w:type="dxa" w:w="60"/>
-              <w:bottom w:type="dxa" w:w="20"/>
-              <w:right w:type="dxa" w:w="40"/>
-            </w:tcMar>
-            <w:vAlign w:val="center"/>
-          </w:tcPr>
-          <w:p/>
-        </w:tc>
-        <w:tc>
-          <w:tcPr>
-            <w:tcW w:type="dxa" w:w="988"/>
-            <w:tcMar>
-              <w:top w:type="dxa" w:w="20"/>
-              <w:left w:type="dxa" w:w="60"/>
-              <w:bottom w:type="dxa" w:w="20"/>
-              <w:right w:type="dxa" w:w="40"/>
-            </w:tcMar>
-            <w:vAlign w:val="center"/>
-          </w:tcPr>
-          <w:p/>
-        </w:tc>
-        <w:tc>
-          <w:tcPr>
-            <w:tcW w:type="dxa" w:w="988"/>
-            <w:tcMar>
-              <w:top w:type="dxa" w:w="20"/>
-              <w:left w:type="dxa" w:w="60"/>
-              <w:bottom w:type="dxa" w:w="20"/>
-              <w:right w:type="dxa" w:w="40"/>
-            </w:tcMar>
-            <w:vAlign w:val="center"/>
-          </w:tcPr>
-          <w:p/>
-        </w:tc>
-        <w:tc>
-          <w:tcPr>
-            <w:tcW w:type="dxa" w:w="988"/>
-            <w:tcMar>
-              <w:top w:type="dxa" w:w="20"/>
-              <w:left w:type="dxa" w:w="60"/>
-              <w:bottom w:type="dxa" w:w="20"/>
-              <w:right w:type="dxa" w:w="40"/>
-            </w:tcMar>
-            <w:vAlign w:val="center"/>
-          </w:tcPr>
-          <w:p/>
-        </w:tc>
-        <w:tc>
-          <w:tcPr>
-            <w:tcW w:type="dxa" w:w="988"/>
-            <w:tcMar>
-              <w:top w:type="dxa" w:w="20"/>
-              <w:left w:type="dxa" w:w="60"/>
-              <w:bottom w:type="dxa" w:w="20"/>
-              <w:right w:type="dxa" w:w="40"/>
-            </w:tcMar>
-            <w:vAlign w:val="center"/>
-          </w:tcPr>
-          <w:p/>
-        </w:tc>
-        <w:tc>
-          <w:tcPr>
-            <w:tcW w:type="dxa" w:w="988"/>
-            <w:tcMar>
-              <w:top w:type="dxa" w:w="20"/>
-              <w:left w:type="dxa" w:w="60"/>
-              <w:bottom w:type="dxa" w:w="20"/>
-              <w:right w:type="dxa" w:w="40"/>
-            </w:tcMar>
-            <w:vAlign w:val="center"/>
-          </w:tcPr>
-          <w:p/>
-        </w:tc>
-      </w:tr>
-      <w:tr>
-        <w:trPr>
-          <w:cantSplit/>
-        </w:trPr>
-        <w:tc>
-          <w:tcPr>
-            <w:tcW w:type="dxa" w:w="1900"/>
-            <w:tcMar>
-              <w:top w:type="dxa" w:w="20"/>
-              <w:left w:type="dxa" w:w="60"/>
-              <w:bottom w:type="dxa" w:w="20"/>
-              <w:right w:type="dxa" w:w="40"/>
-            </w:tcMar>
-            <w:vAlign w:val="center"/>
-          </w:tcPr>
-          <w:p>
-            <w:pPr>
-              <w:spacing w:after="0" w:line="220"/>
-              <w:jc w:val="left"/>
-            </w:pPr>
-            <w:r>
-              <w:rPr>
-                <w:b w:val="false"/>
-                <w:bCs w:val="false"/>
-                <w:sz w:val="18"/>
-                <w:szCs w:val="18"/>
-              </w:rPr>
-              <w:t xml:space="preserve">Maxim M4</w:t>
-            </w:r>
-          </w:p>
-        </w:tc>
-        <w:tc>
-          <w:tcPr>
-            <w:tcW w:type="dxa" w:w="988"/>
-            <w:tcMar>
-              <w:top w:type="dxa" w:w="20"/>
-              <w:left w:type="dxa" w:w="60"/>
-              <w:bottom w:type="dxa" w:w="20"/>
-              <w:right w:type="dxa" w:w="40"/>
-            </w:tcMar>
-            <w:vAlign w:val="center"/>
-          </w:tcPr>
-          <w:p/>
-        </w:tc>
-        <w:tc>
-          <w:tcPr>
-            <w:tcW w:type="dxa" w:w="988"/>
-            <w:tcMar>
-              <w:top w:type="dxa" w:w="20"/>
-              <w:left w:type="dxa" w:w="60"/>
-              <w:bottom w:type="dxa" w:w="20"/>
-              <w:right w:type="dxa" w:w="40"/>
-            </w:tcMar>
-            <w:vAlign w:val="center"/>
-          </w:tcPr>
-          <w:p/>
-        </w:tc>
-        <w:tc>
-          <w:tcPr>
-            <w:tcW w:type="dxa" w:w="988"/>
-            <w:tcMar>
-              <w:top w:type="dxa" w:w="20"/>
-              <w:left w:type="dxa" w:w="60"/>
-              <w:bottom w:type="dxa" w:w="20"/>
-              <w:right w:type="dxa" w:w="40"/>
-            </w:tcMar>
-            <w:vAlign w:val="center"/>
-          </w:tcPr>
-          <w:p>
-            <w:pPr>
-              <w:spacing w:after="0" w:line="220"/>
-              <w:jc w:val="center"/>
-            </w:pPr>
-            <w:r>
-              <w:rPr>
-                <w:b w:val="false"/>
-                <w:bCs w:val="false"/>
-                <w:color w:val="C0392B"/>
-                <w:sz w:val="16"/>
-                <w:szCs w:val="16"/>
-              </w:rPr>
-              <w:t xml:space="preserve">NC</w:t>
-            </w:r>
-          </w:p>
-        </w:tc>
-        <w:tc>
-          <w:tcPr>
-            <w:tcW w:type="dxa" w:w="988"/>
-            <w:tcMar>
-              <w:top w:type="dxa" w:w="20"/>
-              <w:left w:type="dxa" w:w="60"/>
-              <w:bottom w:type="dxa" w:w="20"/>
-              <w:right w:type="dxa" w:w="40"/>
-            </w:tcMar>
-            <w:vAlign w:val="center"/>
-          </w:tcPr>
-          <w:p/>
-        </w:tc>
-        <w:tc>
-          <w:tcPr>
-            <w:tcW w:type="dxa" w:w="988"/>
-            <w:tcMar>
-              <w:top w:type="dxa" w:w="20"/>
-              <w:left w:type="dxa" w:w="60"/>
-              <w:bottom w:type="dxa" w:w="20"/>
-              <w:right w:type="dxa" w:w="40"/>
-            </w:tcMar>
-            <w:vAlign w:val="center"/>
-          </w:tcPr>
-          <w:p/>
-        </w:tc>
-        <w:tc>
-          <w:tcPr>
-            <w:tcW w:type="dxa" w:w="988"/>
-            <w:tcMar>
-              <w:top w:type="dxa" w:w="20"/>
-              <w:left w:type="dxa" w:w="60"/>
-              <w:bottom w:type="dxa" w:w="20"/>
-              <w:right w:type="dxa" w:w="40"/>
-            </w:tcMar>
-            <w:vAlign w:val="center"/>
-          </w:tcPr>
-          <w:p/>
-        </w:tc>
-        <w:tc>
-          <w:tcPr>
-            <w:tcW w:type="dxa" w:w="988"/>
-            <w:tcMar>
-              <w:top w:type="dxa" w:w="20"/>
-              <w:left w:type="dxa" w:w="60"/>
-              <w:bottom w:type="dxa" w:w="20"/>
-              <w:right w:type="dxa" w:w="40"/>
-            </w:tcMar>
-            <w:vAlign w:val="center"/>
-          </w:tcPr>
-          <w:p/>
-        </w:tc>
-        <w:tc>
-          <w:tcPr>
-            <w:tcW w:type="dxa" w:w="988"/>
-            <w:tcMar>
-              <w:top w:type="dxa" w:w="20"/>
-              <w:left w:type="dxa" w:w="60"/>
-              <w:bottom w:type="dxa" w:w="20"/>
-              <w:right w:type="dxa" w:w="40"/>
-            </w:tcMar>
-            <w:vAlign w:val="center"/>
-          </w:tcPr>
-          <w:p/>
-        </w:tc>
-        <w:tc>
-          <w:tcPr>
-            <w:tcW w:type="dxa" w:w="988"/>
-            <w:tcMar>
-              <w:top w:type="dxa" w:w="20"/>
-              <w:left w:type="dxa" w:w="60"/>
-              <w:bottom w:type="dxa" w:w="20"/>
-              <w:right w:type="dxa" w:w="40"/>
-            </w:tcMar>
-            <w:vAlign w:val="center"/>
-          </w:tcPr>
-          <w:p/>
-        </w:tc>
-      </w:tr>
-      <w:tr>
-        <w:trPr>
-          <w:cantSplit/>
-        </w:trPr>
-        <w:tc>
-          <w:tcPr>
-            <w:tcW w:type="dxa" w:w="1900"/>
-            <w:tcMar>
-              <w:top w:type="dxa" w:w="20"/>
-              <w:left w:type="dxa" w:w="60"/>
-              <w:bottom w:type="dxa" w:w="20"/>
-              <w:right w:type="dxa" w:w="40"/>
-            </w:tcMar>
-            <w:vAlign w:val="center"/>
-          </w:tcPr>
-          <w:p>
-            <w:pPr>
-              <w:spacing w:after="0" w:line="220"/>
-              <w:jc w:val="left"/>
-            </w:pPr>
-            <w:r>
-              <w:rPr>
-                <w:b w:val="false"/>
-                <w:bCs w:val="false"/>
-                <w:sz w:val="18"/>
-                <w:szCs w:val="18"/>
-              </w:rPr>
-              <w:t xml:space="preserve">Martin M3</w:t>
-            </w:r>
-          </w:p>
-        </w:tc>
-        <w:tc>
-          <w:tcPr>
-            <w:tcW w:type="dxa" w:w="988"/>
-            <w:tcMar>
-              <w:top w:type="dxa" w:w="20"/>
-              <w:left w:type="dxa" w:w="60"/>
-              <w:bottom w:type="dxa" w:w="20"/>
-              <w:right w:type="dxa" w:w="40"/>
-            </w:tcMar>
-            <w:vAlign w:val="center"/>
-          </w:tcPr>
-          <w:p/>
-        </w:tc>
-        <w:tc>
-          <w:tcPr>
-            <w:tcW w:type="dxa" w:w="988"/>
-            <w:tcMar>
-              <w:top w:type="dxa" w:w="20"/>
-              <w:left w:type="dxa" w:w="60"/>
-              <w:bottom w:type="dxa" w:w="20"/>
-              <w:right w:type="dxa" w:w="40"/>
-            </w:tcMar>
-            <w:vAlign w:val="center"/>
-          </w:tcPr>
-          <w:p/>
-        </w:tc>
-        <w:tc>
-          <w:tcPr>
-            <w:tcW w:type="dxa" w:w="988"/>
-            <w:tcMar>
-              <w:top w:type="dxa" w:w="20"/>
-              <w:left w:type="dxa" w:w="60"/>
-              <w:bottom w:type="dxa" w:w="20"/>
-              <w:right w:type="dxa" w:w="40"/>
-            </w:tcMar>
-            <w:vAlign w:val="center"/>
-          </w:tcPr>
-          <w:p>
-            <w:pPr>
-              <w:spacing w:after="0" w:line="220"/>
-              <w:jc w:val="center"/>
-            </w:pPr>
-            <w:r>
-              <w:rPr>
-                <w:b w:val="false"/>
-                <w:bCs w:val="false"/>
-                <w:color w:val="C0392B"/>
-                <w:sz w:val="16"/>
-                <w:szCs w:val="16"/>
-              </w:rPr>
-              <w:t xml:space="preserve">NC</w:t>
-            </w:r>
-          </w:p>
-        </w:tc>
-        <w:tc>
-          <w:tcPr>
-            <w:tcW w:type="dxa" w:w="988"/>
-            <w:tcMar>
-              <w:top w:type="dxa" w:w="20"/>
-              <w:left w:type="dxa" w:w="60"/>
-              <w:bottom w:type="dxa" w:w="20"/>
-              <w:right w:type="dxa" w:w="40"/>
-            </w:tcMar>
-            <w:vAlign w:val="center"/>
-          </w:tcPr>
-          <w:p/>
-        </w:tc>
-        <w:tc>
-          <w:tcPr>
-            <w:tcW w:type="dxa" w:w="988"/>
-            <w:tcMar>
-              <w:top w:type="dxa" w:w="20"/>
-              <w:left w:type="dxa" w:w="60"/>
-              <w:bottom w:type="dxa" w:w="20"/>
-              <w:right w:type="dxa" w:w="40"/>
-            </w:tcMar>
-            <w:vAlign w:val="center"/>
-          </w:tcPr>
-          <w:p/>
-        </w:tc>
-        <w:tc>
-          <w:tcPr>
-            <w:tcW w:type="dxa" w:w="988"/>
-            <w:tcMar>
-              <w:top w:type="dxa" w:w="20"/>
-              <w:left w:type="dxa" w:w="60"/>
-              <w:bottom w:type="dxa" w:w="20"/>
-              <w:right w:type="dxa" w:w="40"/>
-            </w:tcMar>
-            <w:vAlign w:val="center"/>
-          </w:tcPr>
-          <w:p/>
-        </w:tc>
-        <w:tc>
-          <w:tcPr>
-            <w:tcW w:type="dxa" w:w="988"/>
-            <w:tcMar>
-              <w:top w:type="dxa" w:w="20"/>
-              <w:left w:type="dxa" w:w="60"/>
-              <w:bottom w:type="dxa" w:w="20"/>
-              <w:right w:type="dxa" w:w="40"/>
-            </w:tcMar>
-            <w:vAlign w:val="center"/>
-          </w:tcPr>
-          <w:p/>
-        </w:tc>
-        <w:tc>
-          <w:tcPr>
-            <w:tcW w:type="dxa" w:w="988"/>
-            <w:tcMar>
-              <w:top w:type="dxa" w:w="20"/>
-              <w:left w:type="dxa" w:w="60"/>
-              <w:bottom w:type="dxa" w:w="20"/>
-              <w:right w:type="dxa" w:w="40"/>
-            </w:tcMar>
-            <w:vAlign w:val="center"/>
-          </w:tcPr>
-          <w:p/>
-        </w:tc>
-        <w:tc>
-          <w:tcPr>
-            <w:tcW w:type="dxa" w:w="988"/>
-            <w:tcMar>
-              <w:top w:type="dxa" w:w="20"/>
-              <w:left w:type="dxa" w:w="60"/>
-              <w:bottom w:type="dxa" w:w="20"/>
-              <w:right w:type="dxa" w:w="40"/>
-            </w:tcMar>
-            <w:vAlign w:val="center"/>
-          </w:tcPr>
-          <w:p/>
-        </w:tc>
-      </w:tr>
-      <w:tr>
-        <w:trPr>
-          <w:cantSplit/>
-        </w:trPr>
-        <w:tc>
-          <w:tcPr>
-            <w:tcW w:type="dxa" w:w="1900"/>
-            <w:tcMar>
-              <w:top w:type="dxa" w:w="20"/>
-              <w:left w:type="dxa" w:w="60"/>
-              <w:bottom w:type="dxa" w:w="20"/>
-              <w:right w:type="dxa" w:w="40"/>
-            </w:tcMar>
-            <w:vAlign w:val="center"/>
-          </w:tcPr>
-          <w:p>
-            <w:pPr>
-              <w:spacing w:after="0" w:line="220"/>
-              <w:jc w:val="left"/>
-            </w:pPr>
-            <w:r>
-              <w:rPr>
-                <w:b w:val="false"/>
-                <w:bCs w:val="false"/>
-                <w:sz w:val="18"/>
-                <w:szCs w:val="18"/>
-              </w:rPr>
-              <w:t xml:space="preserve">Gaspard 13.1</w:t>
-            </w:r>
-          </w:p>
-        </w:tc>
-        <w:tc>
-          <w:tcPr>
-            <w:tcW w:type="dxa" w:w="988"/>
-            <w:tcMar>
-              <w:top w:type="dxa" w:w="20"/>
-              <w:left w:type="dxa" w:w="60"/>
-              <w:bottom w:type="dxa" w:w="20"/>
-              <w:right w:type="dxa" w:w="40"/>
-            </w:tcMar>
-            <w:vAlign w:val="center"/>
-          </w:tcPr>
-          <w:p/>
-        </w:tc>
-        <w:tc>
-          <w:tcPr>
-            <w:tcW w:type="dxa" w:w="988"/>
-            <w:tcMar>
-              <w:top w:type="dxa" w:w="20"/>
-              <w:left w:type="dxa" w:w="60"/>
-              <w:bottom w:type="dxa" w:w="20"/>
-              <w:right w:type="dxa" w:w="40"/>
-            </w:tcMar>
-            <w:vAlign w:val="center"/>
-          </w:tcPr>
-          <w:p/>
-        </w:tc>
-        <w:tc>
-          <w:tcPr>
-            <w:tcW w:type="dxa" w:w="988"/>
-            <w:tcMar>
-              <w:top w:type="dxa" w:w="20"/>
-              <w:left w:type="dxa" w:w="60"/>
-              <w:bottom w:type="dxa" w:w="20"/>
-              <w:right w:type="dxa" w:w="40"/>
-            </w:tcMar>
-            <w:vAlign w:val="center"/>
-          </w:tcPr>
-          <w:p>
-            <w:pPr>
-              <w:spacing w:after="0" w:line="220"/>
-              <w:jc w:val="center"/>
-            </w:pPr>
-            <w:r>
-              <w:rPr>
-                <w:b w:val="false"/>
-                <w:bCs w:val="false"/>
-                <w:color w:val="C0392B"/>
-                <w:sz w:val="16"/>
-                <w:szCs w:val="16"/>
-              </w:rPr>
-              <w:t xml:space="preserve">NC</w:t>
-            </w:r>
-          </w:p>
-        </w:tc>
-        <w:tc>
-          <w:tcPr>
-            <w:tcW w:type="dxa" w:w="988"/>
-            <w:tcMar>
-              <w:top w:type="dxa" w:w="20"/>
-              <w:left w:type="dxa" w:w="60"/>
-              <w:bottom w:type="dxa" w:w="20"/>
-              <w:right w:type="dxa" w:w="40"/>
-            </w:tcMar>
-            <w:vAlign w:val="center"/>
-          </w:tcPr>
-          <w:p/>
-        </w:tc>
-        <w:tc>
-          <w:tcPr>
-            <w:tcW w:type="dxa" w:w="988"/>
-            <w:tcMar>
-              <w:top w:type="dxa" w:w="20"/>
-              <w:left w:type="dxa" w:w="60"/>
-              <w:bottom w:type="dxa" w:w="20"/>
-              <w:right w:type="dxa" w:w="40"/>
-            </w:tcMar>
-            <w:vAlign w:val="center"/>
-          </w:tcPr>
-          <w:p/>
-        </w:tc>
-        <w:tc>
-          <w:tcPr>
-            <w:tcW w:type="dxa" w:w="988"/>
-            <w:tcMar>
-              <w:top w:type="dxa" w:w="20"/>
-              <w:left w:type="dxa" w:w="60"/>
-              <w:bottom w:type="dxa" w:w="20"/>
-              <w:right w:type="dxa" w:w="40"/>
-            </w:tcMar>
-            <w:vAlign w:val="center"/>
-          </w:tcPr>
-          <w:p/>
-        </w:tc>
-        <w:tc>
-          <w:tcPr>
-            <w:tcW w:type="dxa" w:w="988"/>
-            <w:tcMar>
-              <w:top w:type="dxa" w:w="20"/>
-              <w:left w:type="dxa" w:w="60"/>
-              <w:bottom w:type="dxa" w:w="20"/>
-              <w:right w:type="dxa" w:w="40"/>
-            </w:tcMar>
-            <w:vAlign w:val="center"/>
-          </w:tcPr>
-          <w:p/>
-        </w:tc>
-        <w:tc>
-          <w:tcPr>
-            <w:tcW w:type="dxa" w:w="988"/>
-            <w:tcMar>
-              <w:top w:type="dxa" w:w="20"/>
-              <w:left w:type="dxa" w:w="60"/>
-              <w:bottom w:type="dxa" w:w="20"/>
-              <w:right w:type="dxa" w:w="40"/>
-            </w:tcMar>
-            <w:vAlign w:val="center"/>
-          </w:tcPr>
-          <w:p/>
-        </w:tc>
-        <w:tc>
-          <w:tcPr>
-            <w:tcW w:type="dxa" w:w="988"/>
-            <w:tcMar>
-              <w:top w:type="dxa" w:w="20"/>
-              <w:left w:type="dxa" w:w="60"/>
-              <w:bottom w:type="dxa" w:w="20"/>
-              <w:right w:type="dxa" w:w="40"/>
-            </w:tcMar>
-            <w:vAlign w:val="center"/>
-          </w:tcPr>
-          <w:p/>
-        </w:tc>
-      </w:tr>
-    </w:tbl>
-    <w:p>
-      <w:pPr>
-        <w:spacing w:after="60" w:before="200"/>
-      </w:pPr>
-      <w:r>
-        <w:rPr>
-          <w:b/>
-          <w:bCs/>
-          <w:sz w:val="24"/>
-          <w:szCs w:val="24"/>
-        </w:rPr>
         <w:t xml:space="preserve">Tournoi : ORÉE</w:t>
       </w:r>
     </w:p>
@@ -5111,7 +3977,7 @@
           <w:sz w:val="15"/>
           <w:szCs w:val="15"/>
         </w:rPr>
-        <w:t xml:space="preserve">Sans match cette semaine : Max (Dordelli, G9), On Lys (Sindabizera, G10). — Rafael (Mason, G9) : introuvable sur AFT (n° d'affiliation à vérifier).</w:t>
+        <w:t xml:space="preserve">Sans match cette semaine : Max (Dordelli, G9), Matthis (Noguès, G9), Rafael (Mason, G9), On Lys (Sindabizera, G10).</w:t>
       </w:r>
     </w:p>
     <w:p>

</xml_diff>

<commit_message>
Matchs Toussaint Gr9-10: MAJ horaires (23/10) + ajout Samy Cherqi
- Ajout Samy Cherqi (aff. 1111776) a Set Wahis - 11 ans G2: mar 27/10 14h30.
- Mouton Florentin (Castle Club 11G2) reprogramme: jeu 29/10 10h00 (etait lun).
- Mouton Simon (Castle Club Msg4): lun 26/10 12h00 (etait 13h00).
- Releve AFT du 23/10/2026.

Co-Authored-By: Claude Opus 4.8 <noreply@anthropic.com>
Claude-Session: https://claude.ai/code/session_013WShXcCyBkE1H1x1qzmtZK
</commit_message>
<xml_diff>
--- a/Liste_des_matchs_Toussaint_Gr9-10.docx
+++ b/Liste_des_matchs_Toussaint_Gr9-10.docx
@@ -1399,6 +1399,169 @@
                 <w:sz w:val="18"/>
                 <w:szCs w:val="18"/>
               </w:rPr>
+              <w:t xml:space="preserve">Samy 11.2</w:t>
+            </w:r>
+          </w:p>
+        </w:tc>
+        <w:tc>
+          <w:tcPr>
+            <w:tcW w:type="dxa" w:w="988"/>
+            <w:tcMar>
+              <w:top w:type="dxa" w:w="20"/>
+              <w:left w:type="dxa" w:w="60"/>
+              <w:bottom w:type="dxa" w:w="20"/>
+              <w:right w:type="dxa" w:w="40"/>
+            </w:tcMar>
+            <w:vAlign w:val="center"/>
+          </w:tcPr>
+          <w:p/>
+        </w:tc>
+        <w:tc>
+          <w:tcPr>
+            <w:tcW w:type="dxa" w:w="988"/>
+            <w:tcMar>
+              <w:top w:type="dxa" w:w="20"/>
+              <w:left w:type="dxa" w:w="60"/>
+              <w:bottom w:type="dxa" w:w="20"/>
+              <w:right w:type="dxa" w:w="40"/>
+            </w:tcMar>
+            <w:vAlign w:val="center"/>
+          </w:tcPr>
+          <w:p/>
+        </w:tc>
+        <w:tc>
+          <w:tcPr>
+            <w:tcW w:type="dxa" w:w="988"/>
+            <w:tcMar>
+              <w:top w:type="dxa" w:w="20"/>
+              <w:left w:type="dxa" w:w="60"/>
+              <w:bottom w:type="dxa" w:w="20"/>
+              <w:right w:type="dxa" w:w="40"/>
+            </w:tcMar>
+            <w:vAlign w:val="center"/>
+          </w:tcPr>
+          <w:p/>
+        </w:tc>
+        <w:tc>
+          <w:tcPr>
+            <w:tcW w:type="dxa" w:w="988"/>
+            <w:tcMar>
+              <w:top w:type="dxa" w:w="20"/>
+              <w:left w:type="dxa" w:w="60"/>
+              <w:bottom w:type="dxa" w:w="20"/>
+              <w:right w:type="dxa" w:w="40"/>
+            </w:tcMar>
+            <w:vAlign w:val="center"/>
+          </w:tcPr>
+          <w:p>
+            <w:pPr>
+              <w:spacing w:after="0" w:line="220"/>
+              <w:jc w:val="center"/>
+            </w:pPr>
+            <w:r>
+              <w:rPr>
+                <w:b/>
+                <w:bCs/>
+                <w:sz w:val="16"/>
+                <w:szCs w:val="16"/>
+              </w:rPr>
+              <w:t xml:space="preserve">14.30</w:t>
+            </w:r>
+          </w:p>
+        </w:tc>
+        <w:tc>
+          <w:tcPr>
+            <w:tcW w:type="dxa" w:w="988"/>
+            <w:tcMar>
+              <w:top w:type="dxa" w:w="20"/>
+              <w:left w:type="dxa" w:w="60"/>
+              <w:bottom w:type="dxa" w:w="20"/>
+              <w:right w:type="dxa" w:w="40"/>
+            </w:tcMar>
+            <w:vAlign w:val="center"/>
+          </w:tcPr>
+          <w:p/>
+        </w:tc>
+        <w:tc>
+          <w:tcPr>
+            <w:tcW w:type="dxa" w:w="988"/>
+            <w:tcMar>
+              <w:top w:type="dxa" w:w="20"/>
+              <w:left w:type="dxa" w:w="60"/>
+              <w:bottom w:type="dxa" w:w="20"/>
+              <w:right w:type="dxa" w:w="40"/>
+            </w:tcMar>
+            <w:vAlign w:val="center"/>
+          </w:tcPr>
+          <w:p/>
+        </w:tc>
+        <w:tc>
+          <w:tcPr>
+            <w:tcW w:type="dxa" w:w="988"/>
+            <w:tcMar>
+              <w:top w:type="dxa" w:w="20"/>
+              <w:left w:type="dxa" w:w="60"/>
+              <w:bottom w:type="dxa" w:w="20"/>
+              <w:right w:type="dxa" w:w="40"/>
+            </w:tcMar>
+            <w:vAlign w:val="center"/>
+          </w:tcPr>
+          <w:p/>
+        </w:tc>
+        <w:tc>
+          <w:tcPr>
+            <w:tcW w:type="dxa" w:w="988"/>
+            <w:tcMar>
+              <w:top w:type="dxa" w:w="20"/>
+              <w:left w:type="dxa" w:w="60"/>
+              <w:bottom w:type="dxa" w:w="20"/>
+              <w:right w:type="dxa" w:w="40"/>
+            </w:tcMar>
+            <w:vAlign w:val="center"/>
+          </w:tcPr>
+          <w:p/>
+        </w:tc>
+        <w:tc>
+          <w:tcPr>
+            <w:tcW w:type="dxa" w:w="988"/>
+            <w:tcMar>
+              <w:top w:type="dxa" w:w="20"/>
+              <w:left w:type="dxa" w:w="60"/>
+              <w:bottom w:type="dxa" w:w="20"/>
+              <w:right w:type="dxa" w:w="40"/>
+            </w:tcMar>
+            <w:vAlign w:val="center"/>
+          </w:tcPr>
+          <w:p/>
+        </w:tc>
+      </w:tr>
+      <w:tr>
+        <w:trPr>
+          <w:cantSplit/>
+        </w:trPr>
+        <w:tc>
+          <w:tcPr>
+            <w:tcW w:type="dxa" w:w="1900"/>
+            <w:tcMar>
+              <w:top w:type="dxa" w:w="20"/>
+              <w:left w:type="dxa" w:w="60"/>
+              <w:bottom w:type="dxa" w:w="20"/>
+              <w:right w:type="dxa" w:w="40"/>
+            </w:tcMar>
+            <w:vAlign w:val="center"/>
+          </w:tcPr>
+          <w:p>
+            <w:pPr>
+              <w:spacing w:after="0" w:line="220"/>
+              <w:jc w:val="left"/>
+            </w:pPr>
+            <w:r>
+              <w:rPr>
+                <w:b w:val="false"/>
+                <w:bCs w:val="false"/>
+                <w:sz w:val="18"/>
+                <w:szCs w:val="18"/>
+              </w:rPr>
               <w:t xml:space="preserve">Maxim M4</w:t>
             </w:r>
           </w:p>
@@ -2082,6 +2245,45 @@
             </w:tcMar>
             <w:vAlign w:val="center"/>
           </w:tcPr>
+          <w:p/>
+        </w:tc>
+        <w:tc>
+          <w:tcPr>
+            <w:tcW w:type="dxa" w:w="988"/>
+            <w:tcMar>
+              <w:top w:type="dxa" w:w="20"/>
+              <w:left w:type="dxa" w:w="60"/>
+              <w:bottom w:type="dxa" w:w="20"/>
+              <w:right w:type="dxa" w:w="40"/>
+            </w:tcMar>
+            <w:vAlign w:val="center"/>
+          </w:tcPr>
+          <w:p/>
+        </w:tc>
+        <w:tc>
+          <w:tcPr>
+            <w:tcW w:type="dxa" w:w="988"/>
+            <w:tcMar>
+              <w:top w:type="dxa" w:w="20"/>
+              <w:left w:type="dxa" w:w="60"/>
+              <w:bottom w:type="dxa" w:w="20"/>
+              <w:right w:type="dxa" w:w="40"/>
+            </w:tcMar>
+            <w:vAlign w:val="center"/>
+          </w:tcPr>
+          <w:p/>
+        </w:tc>
+        <w:tc>
+          <w:tcPr>
+            <w:tcW w:type="dxa" w:w="988"/>
+            <w:tcMar>
+              <w:top w:type="dxa" w:w="20"/>
+              <w:left w:type="dxa" w:w="60"/>
+              <w:bottom w:type="dxa" w:w="20"/>
+              <w:right w:type="dxa" w:w="40"/>
+            </w:tcMar>
+            <w:vAlign w:val="center"/>
+          </w:tcPr>
           <w:p>
             <w:pPr>
               <w:spacing w:after="0" w:line="220"/>
@@ -2094,48 +2296,9 @@
                 <w:sz w:val="16"/>
                 <w:szCs w:val="16"/>
               </w:rPr>
-              <w:t xml:space="preserve">12.00</w:t>
-            </w:r>
-          </w:p>
-        </w:tc>
-        <w:tc>
-          <w:tcPr>
-            <w:tcW w:type="dxa" w:w="988"/>
-            <w:tcMar>
-              <w:top w:type="dxa" w:w="20"/>
-              <w:left w:type="dxa" w:w="60"/>
-              <w:bottom w:type="dxa" w:w="20"/>
-              <w:right w:type="dxa" w:w="40"/>
-            </w:tcMar>
-            <w:vAlign w:val="center"/>
-          </w:tcPr>
-          <w:p/>
-        </w:tc>
-        <w:tc>
-          <w:tcPr>
-            <w:tcW w:type="dxa" w:w="988"/>
-            <w:tcMar>
-              <w:top w:type="dxa" w:w="20"/>
-              <w:left w:type="dxa" w:w="60"/>
-              <w:bottom w:type="dxa" w:w="20"/>
-              <w:right w:type="dxa" w:w="40"/>
-            </w:tcMar>
-            <w:vAlign w:val="center"/>
-          </w:tcPr>
-          <w:p/>
-        </w:tc>
-        <w:tc>
-          <w:tcPr>
-            <w:tcW w:type="dxa" w:w="988"/>
-            <w:tcMar>
-              <w:top w:type="dxa" w:w="20"/>
-              <w:left w:type="dxa" w:w="60"/>
-              <w:bottom w:type="dxa" w:w="20"/>
-              <w:right w:type="dxa" w:w="40"/>
-            </w:tcMar>
-            <w:vAlign w:val="center"/>
-          </w:tcPr>
-          <w:p/>
+              <w:t xml:space="preserve">10.00</w:t>
+            </w:r>
+          </w:p>
         </w:tc>
         <w:tc>
           <w:tcPr>
@@ -2598,7 +2761,7 @@
                 <w:sz w:val="16"/>
                 <w:szCs w:val="16"/>
               </w:rPr>
-              <w:t xml:space="preserve">13.00</w:t>
+              <w:t xml:space="preserve">12.00</w:t>
             </w:r>
           </w:p>
         </w:tc>
@@ -3992,7 +4155,7 @@
           <w:sz w:val="15"/>
           <w:szCs w:val="15"/>
         </w:rPr>
-        <w:t xml:space="preserve">NC = match à programmer (horaire non communiqué). Relevé AFT du 22/10/2026 ; tableaux Grade 3 (poules) inclus.</w:t>
+        <w:t xml:space="preserve">NC = match à programmer (horaire non communiqué). Relevé AFT du 23/10/2026 ; tableaux Grade 3 (poules) inclus.</w:t>
       </w:r>
     </w:p>
     <w:sectPr>

</xml_diff>

<commit_message>
Matchs Toussaint Gr9-10: retrait de la liste des joueurs sans match
Suppression de la note 'Sans match cette semaine' (Dordelli, Nogues,
Mason, Sindabizera). Ne restent que les tableaux par tournoi et la legende.

Co-Authored-By: Claude Opus 4.8 <noreply@anthropic.com>
Claude-Session: https://claude.ai/code/session_013WShXcCyBkE1H1x1qzmtZK
</commit_message>
<xml_diff>
--- a/Liste_des_matchs_Toussaint_Gr9-10.docx
+++ b/Liste_des_matchs_Toussaint_Gr9-10.docx
@@ -4131,21 +4131,6 @@
     <w:p>
       <w:pPr>
         <w:spacing w:before="180"/>
-      </w:pPr>
-      <w:r>
-        <w:rPr>
-          <w:i/>
-          <w:iCs/>
-          <w:color w:val="595959"/>
-          <w:sz w:val="15"/>
-          <w:szCs w:val="15"/>
-        </w:rPr>
-        <w:t xml:space="preserve">Sans match cette semaine : Max (Dordelli), Matthis (Noguès), Rafael (Mason), On Lys (Sindabizera).</w:t>
-      </w:r>
-    </w:p>
-    <w:p>
-      <w:pPr>
-        <w:spacing w:before="20"/>
       </w:pPr>
       <w:r>
         <w:rPr>

</xml_diff>

<commit_message>
Matchs Toussaint Gr9-10: releve du 25/10 (Oree M3 -> 11h30)
Gentchev - Oree Messieurs 3, dim 25/10 reprogramme de 13h00 a 11h30.
Reste des tournois suivis inchange; aucune elimination. Tours de la
semaine encore NC.

Co-Authored-By: Claude Opus 4.8 <noreply@anthropic.com>
Claude-Session: https://claude.ai/code/session_013WShXcCyBkE1H1x1qzmtZK
</commit_message>
<xml_diff>
--- a/Liste_des_matchs_Toussaint_Gr9-10.docx
+++ b/Liste_des_matchs_Toussaint_Gr9-10.docx
@@ -3553,7 +3553,7 @@
                 <w:sz w:val="16"/>
                 <w:szCs w:val="16"/>
               </w:rPr>
-              <w:t xml:space="preserve">13.00</w:t>
+              <w:t xml:space="preserve">11.30</w:t>
             </w:r>
           </w:p>
         </w:tc>
@@ -4140,7 +4140,7 @@
           <w:sz w:val="15"/>
           <w:szCs w:val="15"/>
         </w:rPr>
-        <w:t xml:space="preserve">NC = match à programmer (horaire non communiqué). Relevé AFT du 24/10/2026 ; tableaux Grade 3 (poules) inclus.</w:t>
+        <w:t xml:space="preserve">NC = match à programmer (horaire non communiqué). Relevé AFT du 25/10/2026 ; tableaux Grade 3 (poules) inclus.</w:t>
       </w:r>
     </w:p>
     <w:sectPr>

</xml_diff>

<commit_message>
Matchs Toussaint Gr9-10: ajout Maxim Grozdev + releve 26/10
- Ajout Maxim Grozdev (aff. 1111774): Set Wahis 9 ans G1 mar 27/10 14h00,
  Le Parc 9 ans G1 NC.
- Deux Maxim distingues: Maxim G. (Grozdev) / Maxim B. (Bekchiev).
- Gentchev a joue son Oree dimanche (dim 25 11h30 conserve); reste inchange.

Co-Authored-By: Claude Opus 4.8 <noreply@anthropic.com>
Claude-Session: https://claude.ai/code/session_013WShXcCyBkE1H1x1qzmtZK
</commit_message>
<xml_diff>
--- a/Liste_des_matchs_Toussaint_Gr9-10.docx
+++ b/Liste_des_matchs_Toussaint_Gr9-10.docx
@@ -553,6 +553,170 @@
           <w:p/>
         </w:tc>
       </w:tr>
+      <w:tr>
+        <w:trPr>
+          <w:cantSplit/>
+        </w:trPr>
+        <w:tc>
+          <w:tcPr>
+            <w:tcW w:type="dxa" w:w="1900"/>
+            <w:tcMar>
+              <w:top w:type="dxa" w:w="20"/>
+              <w:left w:type="dxa" w:w="60"/>
+              <w:bottom w:type="dxa" w:w="20"/>
+              <w:right w:type="dxa" w:w="40"/>
+            </w:tcMar>
+            <w:vAlign w:val="center"/>
+          </w:tcPr>
+          <w:p>
+            <w:pPr>
+              <w:spacing w:after="0" w:line="220"/>
+              <w:jc w:val="left"/>
+            </w:pPr>
+            <w:r>
+              <w:rPr>
+                <w:b w:val="false"/>
+                <w:bCs w:val="false"/>
+                <w:sz w:val="18"/>
+                <w:szCs w:val="18"/>
+              </w:rPr>
+              <w:t xml:space="preserve">Maxim G. 9.1</w:t>
+            </w:r>
+          </w:p>
+        </w:tc>
+        <w:tc>
+          <w:tcPr>
+            <w:tcW w:type="dxa" w:w="988"/>
+            <w:tcMar>
+              <w:top w:type="dxa" w:w="20"/>
+              <w:left w:type="dxa" w:w="60"/>
+              <w:bottom w:type="dxa" w:w="20"/>
+              <w:right w:type="dxa" w:w="40"/>
+            </w:tcMar>
+            <w:vAlign w:val="center"/>
+          </w:tcPr>
+          <w:p/>
+        </w:tc>
+        <w:tc>
+          <w:tcPr>
+            <w:tcW w:type="dxa" w:w="988"/>
+            <w:tcMar>
+              <w:top w:type="dxa" w:w="20"/>
+              <w:left w:type="dxa" w:w="60"/>
+              <w:bottom w:type="dxa" w:w="20"/>
+              <w:right w:type="dxa" w:w="40"/>
+            </w:tcMar>
+            <w:vAlign w:val="center"/>
+          </w:tcPr>
+          <w:p/>
+        </w:tc>
+        <w:tc>
+          <w:tcPr>
+            <w:tcW w:type="dxa" w:w="988"/>
+            <w:tcMar>
+              <w:top w:type="dxa" w:w="20"/>
+              <w:left w:type="dxa" w:w="60"/>
+              <w:bottom w:type="dxa" w:w="20"/>
+              <w:right w:type="dxa" w:w="40"/>
+            </w:tcMar>
+            <w:vAlign w:val="center"/>
+          </w:tcPr>
+          <w:p>
+            <w:pPr>
+              <w:spacing w:after="0" w:line="220"/>
+              <w:jc w:val="center"/>
+            </w:pPr>
+            <w:r>
+              <w:rPr>
+                <w:b w:val="false"/>
+                <w:bCs w:val="false"/>
+                <w:color w:val="C0392B"/>
+                <w:sz w:val="16"/>
+                <w:szCs w:val="16"/>
+              </w:rPr>
+              <w:t xml:space="preserve">NC</w:t>
+            </w:r>
+          </w:p>
+        </w:tc>
+        <w:tc>
+          <w:tcPr>
+            <w:tcW w:type="dxa" w:w="988"/>
+            <w:tcMar>
+              <w:top w:type="dxa" w:w="20"/>
+              <w:left w:type="dxa" w:w="60"/>
+              <w:bottom w:type="dxa" w:w="20"/>
+              <w:right w:type="dxa" w:w="40"/>
+            </w:tcMar>
+            <w:vAlign w:val="center"/>
+          </w:tcPr>
+          <w:p/>
+        </w:tc>
+        <w:tc>
+          <w:tcPr>
+            <w:tcW w:type="dxa" w:w="988"/>
+            <w:tcMar>
+              <w:top w:type="dxa" w:w="20"/>
+              <w:left w:type="dxa" w:w="60"/>
+              <w:bottom w:type="dxa" w:w="20"/>
+              <w:right w:type="dxa" w:w="40"/>
+            </w:tcMar>
+            <w:vAlign w:val="center"/>
+          </w:tcPr>
+          <w:p/>
+        </w:tc>
+        <w:tc>
+          <w:tcPr>
+            <w:tcW w:type="dxa" w:w="988"/>
+            <w:tcMar>
+              <w:top w:type="dxa" w:w="20"/>
+              <w:left w:type="dxa" w:w="60"/>
+              <w:bottom w:type="dxa" w:w="20"/>
+              <w:right w:type="dxa" w:w="40"/>
+            </w:tcMar>
+            <w:vAlign w:val="center"/>
+          </w:tcPr>
+          <w:p/>
+        </w:tc>
+        <w:tc>
+          <w:tcPr>
+            <w:tcW w:type="dxa" w:w="988"/>
+            <w:tcMar>
+              <w:top w:type="dxa" w:w="20"/>
+              <w:left w:type="dxa" w:w="60"/>
+              <w:bottom w:type="dxa" w:w="20"/>
+              <w:right w:type="dxa" w:w="40"/>
+            </w:tcMar>
+            <w:vAlign w:val="center"/>
+          </w:tcPr>
+          <w:p/>
+        </w:tc>
+        <w:tc>
+          <w:tcPr>
+            <w:tcW w:type="dxa" w:w="988"/>
+            <w:tcMar>
+              <w:top w:type="dxa" w:w="20"/>
+              <w:left w:type="dxa" w:w="60"/>
+              <w:bottom w:type="dxa" w:w="20"/>
+              <w:right w:type="dxa" w:w="40"/>
+            </w:tcMar>
+            <w:vAlign w:val="center"/>
+          </w:tcPr>
+          <w:p/>
+        </w:tc>
+        <w:tc>
+          <w:tcPr>
+            <w:tcW w:type="dxa" w:w="988"/>
+            <w:tcMar>
+              <w:top w:type="dxa" w:w="20"/>
+              <w:left w:type="dxa" w:w="60"/>
+              <w:bottom w:type="dxa" w:w="20"/>
+              <w:right w:type="dxa" w:w="40"/>
+            </w:tcMar>
+            <w:vAlign w:val="center"/>
+          </w:tcPr>
+          <w:p/>
+        </w:tc>
+      </w:tr>
     </w:tbl>
     <w:p>
       <w:pPr>
@@ -1562,7 +1726,170 @@
                 <w:sz w:val="18"/>
                 <w:szCs w:val="18"/>
               </w:rPr>
-              <w:t xml:space="preserve">Maxim M4</w:t>
+              <w:t xml:space="preserve">Maxim G. 9.1</w:t>
+            </w:r>
+          </w:p>
+        </w:tc>
+        <w:tc>
+          <w:tcPr>
+            <w:tcW w:type="dxa" w:w="988"/>
+            <w:tcMar>
+              <w:top w:type="dxa" w:w="20"/>
+              <w:left w:type="dxa" w:w="60"/>
+              <w:bottom w:type="dxa" w:w="20"/>
+              <w:right w:type="dxa" w:w="40"/>
+            </w:tcMar>
+            <w:vAlign w:val="center"/>
+          </w:tcPr>
+          <w:p/>
+        </w:tc>
+        <w:tc>
+          <w:tcPr>
+            <w:tcW w:type="dxa" w:w="988"/>
+            <w:tcMar>
+              <w:top w:type="dxa" w:w="20"/>
+              <w:left w:type="dxa" w:w="60"/>
+              <w:bottom w:type="dxa" w:w="20"/>
+              <w:right w:type="dxa" w:w="40"/>
+            </w:tcMar>
+            <w:vAlign w:val="center"/>
+          </w:tcPr>
+          <w:p/>
+        </w:tc>
+        <w:tc>
+          <w:tcPr>
+            <w:tcW w:type="dxa" w:w="988"/>
+            <w:tcMar>
+              <w:top w:type="dxa" w:w="20"/>
+              <w:left w:type="dxa" w:w="60"/>
+              <w:bottom w:type="dxa" w:w="20"/>
+              <w:right w:type="dxa" w:w="40"/>
+            </w:tcMar>
+            <w:vAlign w:val="center"/>
+          </w:tcPr>
+          <w:p/>
+        </w:tc>
+        <w:tc>
+          <w:tcPr>
+            <w:tcW w:type="dxa" w:w="988"/>
+            <w:tcMar>
+              <w:top w:type="dxa" w:w="20"/>
+              <w:left w:type="dxa" w:w="60"/>
+              <w:bottom w:type="dxa" w:w="20"/>
+              <w:right w:type="dxa" w:w="40"/>
+            </w:tcMar>
+            <w:vAlign w:val="center"/>
+          </w:tcPr>
+          <w:p>
+            <w:pPr>
+              <w:spacing w:after="0" w:line="220"/>
+              <w:jc w:val="center"/>
+            </w:pPr>
+            <w:r>
+              <w:rPr>
+                <w:b/>
+                <w:bCs/>
+                <w:sz w:val="16"/>
+                <w:szCs w:val="16"/>
+              </w:rPr>
+              <w:t xml:space="preserve">14.00</w:t>
+            </w:r>
+          </w:p>
+        </w:tc>
+        <w:tc>
+          <w:tcPr>
+            <w:tcW w:type="dxa" w:w="988"/>
+            <w:tcMar>
+              <w:top w:type="dxa" w:w="20"/>
+              <w:left w:type="dxa" w:w="60"/>
+              <w:bottom w:type="dxa" w:w="20"/>
+              <w:right w:type="dxa" w:w="40"/>
+            </w:tcMar>
+            <w:vAlign w:val="center"/>
+          </w:tcPr>
+          <w:p/>
+        </w:tc>
+        <w:tc>
+          <w:tcPr>
+            <w:tcW w:type="dxa" w:w="988"/>
+            <w:tcMar>
+              <w:top w:type="dxa" w:w="20"/>
+              <w:left w:type="dxa" w:w="60"/>
+              <w:bottom w:type="dxa" w:w="20"/>
+              <w:right w:type="dxa" w:w="40"/>
+            </w:tcMar>
+            <w:vAlign w:val="center"/>
+          </w:tcPr>
+          <w:p/>
+        </w:tc>
+        <w:tc>
+          <w:tcPr>
+            <w:tcW w:type="dxa" w:w="988"/>
+            <w:tcMar>
+              <w:top w:type="dxa" w:w="20"/>
+              <w:left w:type="dxa" w:w="60"/>
+              <w:bottom w:type="dxa" w:w="20"/>
+              <w:right w:type="dxa" w:w="40"/>
+            </w:tcMar>
+            <w:vAlign w:val="center"/>
+          </w:tcPr>
+          <w:p/>
+        </w:tc>
+        <w:tc>
+          <w:tcPr>
+            <w:tcW w:type="dxa" w:w="988"/>
+            <w:tcMar>
+              <w:top w:type="dxa" w:w="20"/>
+              <w:left w:type="dxa" w:w="60"/>
+              <w:bottom w:type="dxa" w:w="20"/>
+              <w:right w:type="dxa" w:w="40"/>
+            </w:tcMar>
+            <w:vAlign w:val="center"/>
+          </w:tcPr>
+          <w:p/>
+        </w:tc>
+        <w:tc>
+          <w:tcPr>
+            <w:tcW w:type="dxa" w:w="988"/>
+            <w:tcMar>
+              <w:top w:type="dxa" w:w="20"/>
+              <w:left w:type="dxa" w:w="60"/>
+              <w:bottom w:type="dxa" w:w="20"/>
+              <w:right w:type="dxa" w:w="40"/>
+            </w:tcMar>
+            <w:vAlign w:val="center"/>
+          </w:tcPr>
+          <w:p/>
+        </w:tc>
+      </w:tr>
+      <w:tr>
+        <w:trPr>
+          <w:cantSplit/>
+        </w:trPr>
+        <w:tc>
+          <w:tcPr>
+            <w:tcW w:type="dxa" w:w="1900"/>
+            <w:tcMar>
+              <w:top w:type="dxa" w:w="20"/>
+              <w:left w:type="dxa" w:w="60"/>
+              <w:bottom w:type="dxa" w:w="20"/>
+              <w:right w:type="dxa" w:w="40"/>
+            </w:tcMar>
+            <w:vAlign w:val="center"/>
+          </w:tcPr>
+          <w:p>
+            <w:pPr>
+              <w:spacing w:after="0" w:line="220"/>
+              <w:jc w:val="left"/>
+            </w:pPr>
+            <w:r>
+              <w:rPr>
+                <w:b w:val="false"/>
+                <w:bCs w:val="false"/>
+                <w:sz w:val="18"/>
+                <w:szCs w:val="18"/>
+              </w:rPr>
+              <w:t xml:space="preserve">Maxim B. M4</w:t>
             </w:r>
           </w:p>
         </w:tc>
@@ -3349,7 +3676,7 @@
                 <w:sz w:val="18"/>
                 <w:szCs w:val="18"/>
               </w:rPr>
-              <w:t xml:space="preserve">Maxim M4</w:t>
+              <w:t xml:space="preserve">Maxim B. M4</w:t>
             </w:r>
           </w:p>
         </w:tc>
@@ -4140,7 +4467,7 @@
           <w:sz w:val="15"/>
           <w:szCs w:val="15"/>
         </w:rPr>
-        <w:t xml:space="preserve">NC = match à programmer (horaire non communiqué). Relevé AFT du 25/10/2026 ; tableaux Grade 3 (poules) inclus.</w:t>
+        <w:t xml:space="preserve">NC = match à programmer (horaire non communiqué). Relevé AFT du 26/10/2026 ; tableaux Grade 3 (poules) inclus.</w:t>
       </w:r>
     </w:p>
     <w:sectPr>

</xml_diff>

<commit_message>
Matchs Toussaint Gr9-10: ajout Vytautas Razauskas et Kalina Grozdeva
- Vytautas Razauskas (aff. 1105028): Set Wahis Msg3 lun 16h00 + Msg2 NC;
  Oree Msg3 jeu 29/10 15h30.
- Kalina Grozdeva (aff. 1101153): Oree Dames 1 mer 28/10 14h00; Set Wahis
  Dames 1 NC.

Co-Authored-By: Claude Opus 4.8 <noreply@anthropic.com>
Claude-Session: https://claude.ai/code/session_013WShXcCyBkE1H1x1qzmtZK
</commit_message>
<xml_diff>
--- a/Liste_des_matchs_Toussaint_Gr9-10.docx
+++ b/Liste_des_matchs_Toussaint_Gr9-10.docx
@@ -2190,6 +2190,497 @@
           <w:p/>
         </w:tc>
       </w:tr>
+      <w:tr>
+        <w:trPr>
+          <w:cantSplit/>
+        </w:trPr>
+        <w:tc>
+          <w:tcPr>
+            <w:tcW w:type="dxa" w:w="1900"/>
+            <w:tcMar>
+              <w:top w:type="dxa" w:w="20"/>
+              <w:left w:type="dxa" w:w="60"/>
+              <w:bottom w:type="dxa" w:w="20"/>
+              <w:right w:type="dxa" w:w="40"/>
+            </w:tcMar>
+            <w:vAlign w:val="center"/>
+          </w:tcPr>
+          <w:p>
+            <w:pPr>
+              <w:spacing w:after="0" w:line="220"/>
+              <w:jc w:val="left"/>
+            </w:pPr>
+            <w:r>
+              <w:rPr>
+                <w:b w:val="false"/>
+                <w:bCs w:val="false"/>
+                <w:sz w:val="18"/>
+                <w:szCs w:val="18"/>
+              </w:rPr>
+              <w:t xml:space="preserve">Vytautas M3</w:t>
+            </w:r>
+          </w:p>
+        </w:tc>
+        <w:tc>
+          <w:tcPr>
+            <w:tcW w:type="dxa" w:w="988"/>
+            <w:tcMar>
+              <w:top w:type="dxa" w:w="20"/>
+              <w:left w:type="dxa" w:w="60"/>
+              <w:bottom w:type="dxa" w:w="20"/>
+              <w:right w:type="dxa" w:w="40"/>
+            </w:tcMar>
+            <w:vAlign w:val="center"/>
+          </w:tcPr>
+          <w:p/>
+        </w:tc>
+        <w:tc>
+          <w:tcPr>
+            <w:tcW w:type="dxa" w:w="988"/>
+            <w:tcMar>
+              <w:top w:type="dxa" w:w="20"/>
+              <w:left w:type="dxa" w:w="60"/>
+              <w:bottom w:type="dxa" w:w="20"/>
+              <w:right w:type="dxa" w:w="40"/>
+            </w:tcMar>
+            <w:vAlign w:val="center"/>
+          </w:tcPr>
+          <w:p/>
+        </w:tc>
+        <w:tc>
+          <w:tcPr>
+            <w:tcW w:type="dxa" w:w="988"/>
+            <w:tcMar>
+              <w:top w:type="dxa" w:w="20"/>
+              <w:left w:type="dxa" w:w="60"/>
+              <w:bottom w:type="dxa" w:w="20"/>
+              <w:right w:type="dxa" w:w="40"/>
+            </w:tcMar>
+            <w:vAlign w:val="center"/>
+          </w:tcPr>
+          <w:p>
+            <w:pPr>
+              <w:spacing w:after="0" w:line="220"/>
+              <w:jc w:val="center"/>
+            </w:pPr>
+            <w:r>
+              <w:rPr>
+                <w:b/>
+                <w:bCs/>
+                <w:sz w:val="16"/>
+                <w:szCs w:val="16"/>
+              </w:rPr>
+              <w:t xml:space="preserve">16.00</w:t>
+            </w:r>
+          </w:p>
+        </w:tc>
+        <w:tc>
+          <w:tcPr>
+            <w:tcW w:type="dxa" w:w="988"/>
+            <w:tcMar>
+              <w:top w:type="dxa" w:w="20"/>
+              <w:left w:type="dxa" w:w="60"/>
+              <w:bottom w:type="dxa" w:w="20"/>
+              <w:right w:type="dxa" w:w="40"/>
+            </w:tcMar>
+            <w:vAlign w:val="center"/>
+          </w:tcPr>
+          <w:p/>
+        </w:tc>
+        <w:tc>
+          <w:tcPr>
+            <w:tcW w:type="dxa" w:w="988"/>
+            <w:tcMar>
+              <w:top w:type="dxa" w:w="20"/>
+              <w:left w:type="dxa" w:w="60"/>
+              <w:bottom w:type="dxa" w:w="20"/>
+              <w:right w:type="dxa" w:w="40"/>
+            </w:tcMar>
+            <w:vAlign w:val="center"/>
+          </w:tcPr>
+          <w:p/>
+        </w:tc>
+        <w:tc>
+          <w:tcPr>
+            <w:tcW w:type="dxa" w:w="988"/>
+            <w:tcMar>
+              <w:top w:type="dxa" w:w="20"/>
+              <w:left w:type="dxa" w:w="60"/>
+              <w:bottom w:type="dxa" w:w="20"/>
+              <w:right w:type="dxa" w:w="40"/>
+            </w:tcMar>
+            <w:vAlign w:val="center"/>
+          </w:tcPr>
+          <w:p/>
+        </w:tc>
+        <w:tc>
+          <w:tcPr>
+            <w:tcW w:type="dxa" w:w="988"/>
+            <w:tcMar>
+              <w:top w:type="dxa" w:w="20"/>
+              <w:left w:type="dxa" w:w="60"/>
+              <w:bottom w:type="dxa" w:w="20"/>
+              <w:right w:type="dxa" w:w="40"/>
+            </w:tcMar>
+            <w:vAlign w:val="center"/>
+          </w:tcPr>
+          <w:p/>
+        </w:tc>
+        <w:tc>
+          <w:tcPr>
+            <w:tcW w:type="dxa" w:w="988"/>
+            <w:tcMar>
+              <w:top w:type="dxa" w:w="20"/>
+              <w:left w:type="dxa" w:w="60"/>
+              <w:bottom w:type="dxa" w:w="20"/>
+              <w:right w:type="dxa" w:w="40"/>
+            </w:tcMar>
+            <w:vAlign w:val="center"/>
+          </w:tcPr>
+          <w:p/>
+        </w:tc>
+        <w:tc>
+          <w:tcPr>
+            <w:tcW w:type="dxa" w:w="988"/>
+            <w:tcMar>
+              <w:top w:type="dxa" w:w="20"/>
+              <w:left w:type="dxa" w:w="60"/>
+              <w:bottom w:type="dxa" w:w="20"/>
+              <w:right w:type="dxa" w:w="40"/>
+            </w:tcMar>
+            <w:vAlign w:val="center"/>
+          </w:tcPr>
+          <w:p/>
+        </w:tc>
+      </w:tr>
+      <w:tr>
+        <w:trPr>
+          <w:cantSplit/>
+        </w:trPr>
+        <w:tc>
+          <w:tcPr>
+            <w:tcW w:type="dxa" w:w="1900"/>
+            <w:tcMar>
+              <w:top w:type="dxa" w:w="20"/>
+              <w:left w:type="dxa" w:w="60"/>
+              <w:bottom w:type="dxa" w:w="20"/>
+              <w:right w:type="dxa" w:w="40"/>
+            </w:tcMar>
+            <w:vAlign w:val="center"/>
+          </w:tcPr>
+          <w:p>
+            <w:pPr>
+              <w:spacing w:after="0" w:line="220"/>
+              <w:jc w:val="left"/>
+            </w:pPr>
+            <w:r>
+              <w:rPr>
+                <w:b w:val="false"/>
+                <w:bCs w:val="false"/>
+                <w:sz w:val="18"/>
+                <w:szCs w:val="18"/>
+              </w:rPr>
+              <w:t xml:space="preserve">Vytautas M2</w:t>
+            </w:r>
+          </w:p>
+        </w:tc>
+        <w:tc>
+          <w:tcPr>
+            <w:tcW w:type="dxa" w:w="988"/>
+            <w:tcMar>
+              <w:top w:type="dxa" w:w="20"/>
+              <w:left w:type="dxa" w:w="60"/>
+              <w:bottom w:type="dxa" w:w="20"/>
+              <w:right w:type="dxa" w:w="40"/>
+            </w:tcMar>
+            <w:vAlign w:val="center"/>
+          </w:tcPr>
+          <w:p/>
+        </w:tc>
+        <w:tc>
+          <w:tcPr>
+            <w:tcW w:type="dxa" w:w="988"/>
+            <w:tcMar>
+              <w:top w:type="dxa" w:w="20"/>
+              <w:left w:type="dxa" w:w="60"/>
+              <w:bottom w:type="dxa" w:w="20"/>
+              <w:right w:type="dxa" w:w="40"/>
+            </w:tcMar>
+            <w:vAlign w:val="center"/>
+          </w:tcPr>
+          <w:p/>
+        </w:tc>
+        <w:tc>
+          <w:tcPr>
+            <w:tcW w:type="dxa" w:w="988"/>
+            <w:tcMar>
+              <w:top w:type="dxa" w:w="20"/>
+              <w:left w:type="dxa" w:w="60"/>
+              <w:bottom w:type="dxa" w:w="20"/>
+              <w:right w:type="dxa" w:w="40"/>
+            </w:tcMar>
+            <w:vAlign w:val="center"/>
+          </w:tcPr>
+          <w:p>
+            <w:pPr>
+              <w:spacing w:after="0" w:line="220"/>
+              <w:jc w:val="center"/>
+            </w:pPr>
+            <w:r>
+              <w:rPr>
+                <w:b w:val="false"/>
+                <w:bCs w:val="false"/>
+                <w:color w:val="C0392B"/>
+                <w:sz w:val="16"/>
+                <w:szCs w:val="16"/>
+              </w:rPr>
+              <w:t xml:space="preserve">NC</w:t>
+            </w:r>
+          </w:p>
+        </w:tc>
+        <w:tc>
+          <w:tcPr>
+            <w:tcW w:type="dxa" w:w="988"/>
+            <w:tcMar>
+              <w:top w:type="dxa" w:w="20"/>
+              <w:left w:type="dxa" w:w="60"/>
+              <w:bottom w:type="dxa" w:w="20"/>
+              <w:right w:type="dxa" w:w="40"/>
+            </w:tcMar>
+            <w:vAlign w:val="center"/>
+          </w:tcPr>
+          <w:p/>
+        </w:tc>
+        <w:tc>
+          <w:tcPr>
+            <w:tcW w:type="dxa" w:w="988"/>
+            <w:tcMar>
+              <w:top w:type="dxa" w:w="20"/>
+              <w:left w:type="dxa" w:w="60"/>
+              <w:bottom w:type="dxa" w:w="20"/>
+              <w:right w:type="dxa" w:w="40"/>
+            </w:tcMar>
+            <w:vAlign w:val="center"/>
+          </w:tcPr>
+          <w:p/>
+        </w:tc>
+        <w:tc>
+          <w:tcPr>
+            <w:tcW w:type="dxa" w:w="988"/>
+            <w:tcMar>
+              <w:top w:type="dxa" w:w="20"/>
+              <w:left w:type="dxa" w:w="60"/>
+              <w:bottom w:type="dxa" w:w="20"/>
+              <w:right w:type="dxa" w:w="40"/>
+            </w:tcMar>
+            <w:vAlign w:val="center"/>
+          </w:tcPr>
+          <w:p/>
+        </w:tc>
+        <w:tc>
+          <w:tcPr>
+            <w:tcW w:type="dxa" w:w="988"/>
+            <w:tcMar>
+              <w:top w:type="dxa" w:w="20"/>
+              <w:left w:type="dxa" w:w="60"/>
+              <w:bottom w:type="dxa" w:w="20"/>
+              <w:right w:type="dxa" w:w="40"/>
+            </w:tcMar>
+            <w:vAlign w:val="center"/>
+          </w:tcPr>
+          <w:p/>
+        </w:tc>
+        <w:tc>
+          <w:tcPr>
+            <w:tcW w:type="dxa" w:w="988"/>
+            <w:tcMar>
+              <w:top w:type="dxa" w:w="20"/>
+              <w:left w:type="dxa" w:w="60"/>
+              <w:bottom w:type="dxa" w:w="20"/>
+              <w:right w:type="dxa" w:w="40"/>
+            </w:tcMar>
+            <w:vAlign w:val="center"/>
+          </w:tcPr>
+          <w:p/>
+        </w:tc>
+        <w:tc>
+          <w:tcPr>
+            <w:tcW w:type="dxa" w:w="988"/>
+            <w:tcMar>
+              <w:top w:type="dxa" w:w="20"/>
+              <w:left w:type="dxa" w:w="60"/>
+              <w:bottom w:type="dxa" w:w="20"/>
+              <w:right w:type="dxa" w:w="40"/>
+            </w:tcMar>
+            <w:vAlign w:val="center"/>
+          </w:tcPr>
+          <w:p/>
+        </w:tc>
+      </w:tr>
+      <w:tr>
+        <w:trPr>
+          <w:cantSplit/>
+        </w:trPr>
+        <w:tc>
+          <w:tcPr>
+            <w:tcW w:type="dxa" w:w="1900"/>
+            <w:tcMar>
+              <w:top w:type="dxa" w:w="20"/>
+              <w:left w:type="dxa" w:w="60"/>
+              <w:bottom w:type="dxa" w:w="20"/>
+              <w:right w:type="dxa" w:w="40"/>
+            </w:tcMar>
+            <w:vAlign w:val="center"/>
+          </w:tcPr>
+          <w:p>
+            <w:pPr>
+              <w:spacing w:after="0" w:line="220"/>
+              <w:jc w:val="left"/>
+            </w:pPr>
+            <w:r>
+              <w:rPr>
+                <w:b w:val="false"/>
+                <w:bCs w:val="false"/>
+                <w:sz w:val="18"/>
+                <w:szCs w:val="18"/>
+              </w:rPr>
+              <w:t xml:space="preserve">Kalina D1</w:t>
+            </w:r>
+          </w:p>
+        </w:tc>
+        <w:tc>
+          <w:tcPr>
+            <w:tcW w:type="dxa" w:w="988"/>
+            <w:tcMar>
+              <w:top w:type="dxa" w:w="20"/>
+              <w:left w:type="dxa" w:w="60"/>
+              <w:bottom w:type="dxa" w:w="20"/>
+              <w:right w:type="dxa" w:w="40"/>
+            </w:tcMar>
+            <w:vAlign w:val="center"/>
+          </w:tcPr>
+          <w:p/>
+        </w:tc>
+        <w:tc>
+          <w:tcPr>
+            <w:tcW w:type="dxa" w:w="988"/>
+            <w:tcMar>
+              <w:top w:type="dxa" w:w="20"/>
+              <w:left w:type="dxa" w:w="60"/>
+              <w:bottom w:type="dxa" w:w="20"/>
+              <w:right w:type="dxa" w:w="40"/>
+            </w:tcMar>
+            <w:vAlign w:val="center"/>
+          </w:tcPr>
+          <w:p/>
+        </w:tc>
+        <w:tc>
+          <w:tcPr>
+            <w:tcW w:type="dxa" w:w="988"/>
+            <w:tcMar>
+              <w:top w:type="dxa" w:w="20"/>
+              <w:left w:type="dxa" w:w="60"/>
+              <w:bottom w:type="dxa" w:w="20"/>
+              <w:right w:type="dxa" w:w="40"/>
+            </w:tcMar>
+            <w:vAlign w:val="center"/>
+          </w:tcPr>
+          <w:p>
+            <w:pPr>
+              <w:spacing w:after="0" w:line="220"/>
+              <w:jc w:val="center"/>
+            </w:pPr>
+            <w:r>
+              <w:rPr>
+                <w:b w:val="false"/>
+                <w:bCs w:val="false"/>
+                <w:color w:val="C0392B"/>
+                <w:sz w:val="16"/>
+                <w:szCs w:val="16"/>
+              </w:rPr>
+              <w:t xml:space="preserve">NC</w:t>
+            </w:r>
+          </w:p>
+        </w:tc>
+        <w:tc>
+          <w:tcPr>
+            <w:tcW w:type="dxa" w:w="988"/>
+            <w:tcMar>
+              <w:top w:type="dxa" w:w="20"/>
+              <w:left w:type="dxa" w:w="60"/>
+              <w:bottom w:type="dxa" w:w="20"/>
+              <w:right w:type="dxa" w:w="40"/>
+            </w:tcMar>
+            <w:vAlign w:val="center"/>
+          </w:tcPr>
+          <w:p/>
+        </w:tc>
+        <w:tc>
+          <w:tcPr>
+            <w:tcW w:type="dxa" w:w="988"/>
+            <w:tcMar>
+              <w:top w:type="dxa" w:w="20"/>
+              <w:left w:type="dxa" w:w="60"/>
+              <w:bottom w:type="dxa" w:w="20"/>
+              <w:right w:type="dxa" w:w="40"/>
+            </w:tcMar>
+            <w:vAlign w:val="center"/>
+          </w:tcPr>
+          <w:p/>
+        </w:tc>
+        <w:tc>
+          <w:tcPr>
+            <w:tcW w:type="dxa" w:w="988"/>
+            <w:tcMar>
+              <w:top w:type="dxa" w:w="20"/>
+              <w:left w:type="dxa" w:w="60"/>
+              <w:bottom w:type="dxa" w:w="20"/>
+              <w:right w:type="dxa" w:w="40"/>
+            </w:tcMar>
+            <w:vAlign w:val="center"/>
+          </w:tcPr>
+          <w:p/>
+        </w:tc>
+        <w:tc>
+          <w:tcPr>
+            <w:tcW w:type="dxa" w:w="988"/>
+            <w:tcMar>
+              <w:top w:type="dxa" w:w="20"/>
+              <w:left w:type="dxa" w:w="60"/>
+              <w:bottom w:type="dxa" w:w="20"/>
+              <w:right w:type="dxa" w:w="40"/>
+            </w:tcMar>
+            <w:vAlign w:val="center"/>
+          </w:tcPr>
+          <w:p/>
+        </w:tc>
+        <w:tc>
+          <w:tcPr>
+            <w:tcW w:type="dxa" w:w="988"/>
+            <w:tcMar>
+              <w:top w:type="dxa" w:w="20"/>
+              <w:left w:type="dxa" w:w="60"/>
+              <w:bottom w:type="dxa" w:w="20"/>
+              <w:right w:type="dxa" w:w="40"/>
+            </w:tcMar>
+            <w:vAlign w:val="center"/>
+          </w:tcPr>
+          <w:p/>
+        </w:tc>
+        <w:tc>
+          <w:tcPr>
+            <w:tcW w:type="dxa" w:w="988"/>
+            <w:tcMar>
+              <w:top w:type="dxa" w:w="20"/>
+              <w:left w:type="dxa" w:w="60"/>
+              <w:bottom w:type="dxa" w:w="20"/>
+              <w:right w:type="dxa" w:w="40"/>
+            </w:tcMar>
+            <w:vAlign w:val="center"/>
+          </w:tcPr>
+          <w:p/>
+        </w:tc>
+      </w:tr>
     </w:tbl>
     <w:p>
       <w:pPr>
@@ -3922,6 +4413,332 @@
             <w:vAlign w:val="center"/>
           </w:tcPr>
           <w:p/>
+        </w:tc>
+        <w:tc>
+          <w:tcPr>
+            <w:tcW w:type="dxa" w:w="988"/>
+            <w:tcMar>
+              <w:top w:type="dxa" w:w="20"/>
+              <w:left w:type="dxa" w:w="60"/>
+              <w:bottom w:type="dxa" w:w="20"/>
+              <w:right w:type="dxa" w:w="40"/>
+            </w:tcMar>
+            <w:vAlign w:val="center"/>
+          </w:tcPr>
+          <w:p/>
+        </w:tc>
+        <w:tc>
+          <w:tcPr>
+            <w:tcW w:type="dxa" w:w="988"/>
+            <w:tcMar>
+              <w:top w:type="dxa" w:w="20"/>
+              <w:left w:type="dxa" w:w="60"/>
+              <w:bottom w:type="dxa" w:w="20"/>
+              <w:right w:type="dxa" w:w="40"/>
+            </w:tcMar>
+            <w:vAlign w:val="center"/>
+          </w:tcPr>
+          <w:p/>
+        </w:tc>
+        <w:tc>
+          <w:tcPr>
+            <w:tcW w:type="dxa" w:w="988"/>
+            <w:tcMar>
+              <w:top w:type="dxa" w:w="20"/>
+              <w:left w:type="dxa" w:w="60"/>
+              <w:bottom w:type="dxa" w:w="20"/>
+              <w:right w:type="dxa" w:w="40"/>
+            </w:tcMar>
+            <w:vAlign w:val="center"/>
+          </w:tcPr>
+          <w:p/>
+        </w:tc>
+        <w:tc>
+          <w:tcPr>
+            <w:tcW w:type="dxa" w:w="988"/>
+            <w:tcMar>
+              <w:top w:type="dxa" w:w="20"/>
+              <w:left w:type="dxa" w:w="60"/>
+              <w:bottom w:type="dxa" w:w="20"/>
+              <w:right w:type="dxa" w:w="40"/>
+            </w:tcMar>
+            <w:vAlign w:val="center"/>
+          </w:tcPr>
+          <w:p/>
+        </w:tc>
+      </w:tr>
+      <w:tr>
+        <w:trPr>
+          <w:cantSplit/>
+        </w:trPr>
+        <w:tc>
+          <w:tcPr>
+            <w:tcW w:type="dxa" w:w="1900"/>
+            <w:tcMar>
+              <w:top w:type="dxa" w:w="20"/>
+              <w:left w:type="dxa" w:w="60"/>
+              <w:bottom w:type="dxa" w:w="20"/>
+              <w:right w:type="dxa" w:w="40"/>
+            </w:tcMar>
+            <w:vAlign w:val="center"/>
+          </w:tcPr>
+          <w:p>
+            <w:pPr>
+              <w:spacing w:after="0" w:line="220"/>
+              <w:jc w:val="left"/>
+            </w:pPr>
+            <w:r>
+              <w:rPr>
+                <w:b w:val="false"/>
+                <w:bCs w:val="false"/>
+                <w:sz w:val="18"/>
+                <w:szCs w:val="18"/>
+              </w:rPr>
+              <w:t xml:space="preserve">Vytautas M3</w:t>
+            </w:r>
+          </w:p>
+        </w:tc>
+        <w:tc>
+          <w:tcPr>
+            <w:tcW w:type="dxa" w:w="988"/>
+            <w:tcMar>
+              <w:top w:type="dxa" w:w="20"/>
+              <w:left w:type="dxa" w:w="60"/>
+              <w:bottom w:type="dxa" w:w="20"/>
+              <w:right w:type="dxa" w:w="40"/>
+            </w:tcMar>
+            <w:vAlign w:val="center"/>
+          </w:tcPr>
+          <w:p/>
+        </w:tc>
+        <w:tc>
+          <w:tcPr>
+            <w:tcW w:type="dxa" w:w="988"/>
+            <w:tcMar>
+              <w:top w:type="dxa" w:w="20"/>
+              <w:left w:type="dxa" w:w="60"/>
+              <w:bottom w:type="dxa" w:w="20"/>
+              <w:right w:type="dxa" w:w="40"/>
+            </w:tcMar>
+            <w:vAlign w:val="center"/>
+          </w:tcPr>
+          <w:p/>
+        </w:tc>
+        <w:tc>
+          <w:tcPr>
+            <w:tcW w:type="dxa" w:w="988"/>
+            <w:tcMar>
+              <w:top w:type="dxa" w:w="20"/>
+              <w:left w:type="dxa" w:w="60"/>
+              <w:bottom w:type="dxa" w:w="20"/>
+              <w:right w:type="dxa" w:w="40"/>
+            </w:tcMar>
+            <w:vAlign w:val="center"/>
+          </w:tcPr>
+          <w:p/>
+        </w:tc>
+        <w:tc>
+          <w:tcPr>
+            <w:tcW w:type="dxa" w:w="988"/>
+            <w:tcMar>
+              <w:top w:type="dxa" w:w="20"/>
+              <w:left w:type="dxa" w:w="60"/>
+              <w:bottom w:type="dxa" w:w="20"/>
+              <w:right w:type="dxa" w:w="40"/>
+            </w:tcMar>
+            <w:vAlign w:val="center"/>
+          </w:tcPr>
+          <w:p/>
+        </w:tc>
+        <w:tc>
+          <w:tcPr>
+            <w:tcW w:type="dxa" w:w="988"/>
+            <w:tcMar>
+              <w:top w:type="dxa" w:w="20"/>
+              <w:left w:type="dxa" w:w="60"/>
+              <w:bottom w:type="dxa" w:w="20"/>
+              <w:right w:type="dxa" w:w="40"/>
+            </w:tcMar>
+            <w:vAlign w:val="center"/>
+          </w:tcPr>
+          <w:p/>
+        </w:tc>
+        <w:tc>
+          <w:tcPr>
+            <w:tcW w:type="dxa" w:w="988"/>
+            <w:tcMar>
+              <w:top w:type="dxa" w:w="20"/>
+              <w:left w:type="dxa" w:w="60"/>
+              <w:bottom w:type="dxa" w:w="20"/>
+              <w:right w:type="dxa" w:w="40"/>
+            </w:tcMar>
+            <w:vAlign w:val="center"/>
+          </w:tcPr>
+          <w:p>
+            <w:pPr>
+              <w:spacing w:after="0" w:line="220"/>
+              <w:jc w:val="center"/>
+            </w:pPr>
+            <w:r>
+              <w:rPr>
+                <w:b/>
+                <w:bCs/>
+                <w:sz w:val="16"/>
+                <w:szCs w:val="16"/>
+              </w:rPr>
+              <w:t xml:space="preserve">15.30</w:t>
+            </w:r>
+          </w:p>
+        </w:tc>
+        <w:tc>
+          <w:tcPr>
+            <w:tcW w:type="dxa" w:w="988"/>
+            <w:tcMar>
+              <w:top w:type="dxa" w:w="20"/>
+              <w:left w:type="dxa" w:w="60"/>
+              <w:bottom w:type="dxa" w:w="20"/>
+              <w:right w:type="dxa" w:w="40"/>
+            </w:tcMar>
+            <w:vAlign w:val="center"/>
+          </w:tcPr>
+          <w:p/>
+        </w:tc>
+        <w:tc>
+          <w:tcPr>
+            <w:tcW w:type="dxa" w:w="988"/>
+            <w:tcMar>
+              <w:top w:type="dxa" w:w="20"/>
+              <w:left w:type="dxa" w:w="60"/>
+              <w:bottom w:type="dxa" w:w="20"/>
+              <w:right w:type="dxa" w:w="40"/>
+            </w:tcMar>
+            <w:vAlign w:val="center"/>
+          </w:tcPr>
+          <w:p/>
+        </w:tc>
+        <w:tc>
+          <w:tcPr>
+            <w:tcW w:type="dxa" w:w="988"/>
+            <w:tcMar>
+              <w:top w:type="dxa" w:w="20"/>
+              <w:left w:type="dxa" w:w="60"/>
+              <w:bottom w:type="dxa" w:w="20"/>
+              <w:right w:type="dxa" w:w="40"/>
+            </w:tcMar>
+            <w:vAlign w:val="center"/>
+          </w:tcPr>
+          <w:p/>
+        </w:tc>
+      </w:tr>
+      <w:tr>
+        <w:trPr>
+          <w:cantSplit/>
+        </w:trPr>
+        <w:tc>
+          <w:tcPr>
+            <w:tcW w:type="dxa" w:w="1900"/>
+            <w:tcMar>
+              <w:top w:type="dxa" w:w="20"/>
+              <w:left w:type="dxa" w:w="60"/>
+              <w:bottom w:type="dxa" w:w="20"/>
+              <w:right w:type="dxa" w:w="40"/>
+            </w:tcMar>
+            <w:vAlign w:val="center"/>
+          </w:tcPr>
+          <w:p>
+            <w:pPr>
+              <w:spacing w:after="0" w:line="220"/>
+              <w:jc w:val="left"/>
+            </w:pPr>
+            <w:r>
+              <w:rPr>
+                <w:b w:val="false"/>
+                <w:bCs w:val="false"/>
+                <w:sz w:val="18"/>
+                <w:szCs w:val="18"/>
+              </w:rPr>
+              <w:t xml:space="preserve">Kalina D1</w:t>
+            </w:r>
+          </w:p>
+        </w:tc>
+        <w:tc>
+          <w:tcPr>
+            <w:tcW w:type="dxa" w:w="988"/>
+            <w:tcMar>
+              <w:top w:type="dxa" w:w="20"/>
+              <w:left w:type="dxa" w:w="60"/>
+              <w:bottom w:type="dxa" w:w="20"/>
+              <w:right w:type="dxa" w:w="40"/>
+            </w:tcMar>
+            <w:vAlign w:val="center"/>
+          </w:tcPr>
+          <w:p/>
+        </w:tc>
+        <w:tc>
+          <w:tcPr>
+            <w:tcW w:type="dxa" w:w="988"/>
+            <w:tcMar>
+              <w:top w:type="dxa" w:w="20"/>
+              <w:left w:type="dxa" w:w="60"/>
+              <w:bottom w:type="dxa" w:w="20"/>
+              <w:right w:type="dxa" w:w="40"/>
+            </w:tcMar>
+            <w:vAlign w:val="center"/>
+          </w:tcPr>
+          <w:p/>
+        </w:tc>
+        <w:tc>
+          <w:tcPr>
+            <w:tcW w:type="dxa" w:w="988"/>
+            <w:tcMar>
+              <w:top w:type="dxa" w:w="20"/>
+              <w:left w:type="dxa" w:w="60"/>
+              <w:bottom w:type="dxa" w:w="20"/>
+              <w:right w:type="dxa" w:w="40"/>
+            </w:tcMar>
+            <w:vAlign w:val="center"/>
+          </w:tcPr>
+          <w:p/>
+        </w:tc>
+        <w:tc>
+          <w:tcPr>
+            <w:tcW w:type="dxa" w:w="988"/>
+            <w:tcMar>
+              <w:top w:type="dxa" w:w="20"/>
+              <w:left w:type="dxa" w:w="60"/>
+              <w:bottom w:type="dxa" w:w="20"/>
+              <w:right w:type="dxa" w:w="40"/>
+            </w:tcMar>
+            <w:vAlign w:val="center"/>
+          </w:tcPr>
+          <w:p/>
+        </w:tc>
+        <w:tc>
+          <w:tcPr>
+            <w:tcW w:type="dxa" w:w="988"/>
+            <w:tcMar>
+              <w:top w:type="dxa" w:w="20"/>
+              <w:left w:type="dxa" w:w="60"/>
+              <w:bottom w:type="dxa" w:w="20"/>
+              <w:right w:type="dxa" w:w="40"/>
+            </w:tcMar>
+            <w:vAlign w:val="center"/>
+          </w:tcPr>
+          <w:p>
+            <w:pPr>
+              <w:spacing w:after="0" w:line="220"/>
+              <w:jc w:val="center"/>
+            </w:pPr>
+            <w:r>
+              <w:rPr>
+                <w:b/>
+                <w:bCs/>
+                <w:sz w:val="16"/>
+                <w:szCs w:val="16"/>
+              </w:rPr>
+              <w:t xml:space="preserve">14.00</w:t>
+            </w:r>
+          </w:p>
         </w:tc>
         <w:tc>
           <w:tcPr>

</xml_diff>

<commit_message>
Matchs Toussaint Gr9-10: MAJ horaires du 26/10 (soir)
- Thibault (Le Parc 11.1): prochain jeu 29/10 11h00 (apres lun 15h00).
- Maxim G. (Le Parc 9.1): sam 31/10 12h00.
- Vytautas (Set Wahis M3): prochain ven 30/10 19h00 (apres lun 16h00).
- Maxim B. (Oree M4): mer 28/10 15h30.
- Gaspard (Primerose 15.2): mar 27/10 13h00.
Simon (Castle Club M4) et Georges (tableau 13 G2) elimines lundi.

Co-Authored-By: Claude Opus 4.8 <noreply@anthropic.com>
Claude-Session: https://claude.ai/code/session_013WShXcCyBkE1H1x1qzmtZK
</commit_message>
<xml_diff>
--- a/Liste_des_matchs_Toussaint_Gr9-10.docx
+++ b/Liste_des_matchs_Toussaint_Gr9-10.docx
@@ -511,7 +511,21 @@
             </w:tcMar>
             <w:vAlign w:val="center"/>
           </w:tcPr>
-          <w:p/>
+          <w:p>
+            <w:pPr>
+              <w:spacing w:after="0" w:line="220"/>
+              <w:jc w:val="center"/>
+            </w:pPr>
+            <w:r>
+              <w:rPr>
+                <w:b/>
+                <w:bCs/>
+                <w:sz w:val="16"/>
+                <w:szCs w:val="16"/>
+              </w:rPr>
+              <w:t xml:space="preserve">11.00</w:t>
+            </w:r>
+          </w:p>
         </w:tc>
         <w:tc>
           <w:tcPr>
@@ -621,87 +635,86 @@
             </w:tcMar>
             <w:vAlign w:val="center"/>
           </w:tcPr>
-          <w:p>
-            <w:pPr>
-              <w:spacing w:after="0" w:line="220"/>
-              <w:jc w:val="center"/>
-            </w:pPr>
-            <w:r>
-              <w:rPr>
-                <w:b w:val="false"/>
-                <w:bCs w:val="false"/>
-                <w:color w:val="C0392B"/>
+          <w:p/>
+        </w:tc>
+        <w:tc>
+          <w:tcPr>
+            <w:tcW w:type="dxa" w:w="988"/>
+            <w:tcMar>
+              <w:top w:type="dxa" w:w="20"/>
+              <w:left w:type="dxa" w:w="60"/>
+              <w:bottom w:type="dxa" w:w="20"/>
+              <w:right w:type="dxa" w:w="40"/>
+            </w:tcMar>
+            <w:vAlign w:val="center"/>
+          </w:tcPr>
+          <w:p/>
+        </w:tc>
+        <w:tc>
+          <w:tcPr>
+            <w:tcW w:type="dxa" w:w="988"/>
+            <w:tcMar>
+              <w:top w:type="dxa" w:w="20"/>
+              <w:left w:type="dxa" w:w="60"/>
+              <w:bottom w:type="dxa" w:w="20"/>
+              <w:right w:type="dxa" w:w="40"/>
+            </w:tcMar>
+            <w:vAlign w:val="center"/>
+          </w:tcPr>
+          <w:p/>
+        </w:tc>
+        <w:tc>
+          <w:tcPr>
+            <w:tcW w:type="dxa" w:w="988"/>
+            <w:tcMar>
+              <w:top w:type="dxa" w:w="20"/>
+              <w:left w:type="dxa" w:w="60"/>
+              <w:bottom w:type="dxa" w:w="20"/>
+              <w:right w:type="dxa" w:w="40"/>
+            </w:tcMar>
+            <w:vAlign w:val="center"/>
+          </w:tcPr>
+          <w:p/>
+        </w:tc>
+        <w:tc>
+          <w:tcPr>
+            <w:tcW w:type="dxa" w:w="988"/>
+            <w:tcMar>
+              <w:top w:type="dxa" w:w="20"/>
+              <w:left w:type="dxa" w:w="60"/>
+              <w:bottom w:type="dxa" w:w="20"/>
+              <w:right w:type="dxa" w:w="40"/>
+            </w:tcMar>
+            <w:vAlign w:val="center"/>
+          </w:tcPr>
+          <w:p/>
+        </w:tc>
+        <w:tc>
+          <w:tcPr>
+            <w:tcW w:type="dxa" w:w="988"/>
+            <w:tcMar>
+              <w:top w:type="dxa" w:w="20"/>
+              <w:left w:type="dxa" w:w="60"/>
+              <w:bottom w:type="dxa" w:w="20"/>
+              <w:right w:type="dxa" w:w="40"/>
+            </w:tcMar>
+            <w:vAlign w:val="center"/>
+          </w:tcPr>
+          <w:p>
+            <w:pPr>
+              <w:spacing w:after="0" w:line="220"/>
+              <w:jc w:val="center"/>
+            </w:pPr>
+            <w:r>
+              <w:rPr>
+                <w:b/>
+                <w:bCs/>
                 <w:sz w:val="16"/>
                 <w:szCs w:val="16"/>
               </w:rPr>
-              <w:t xml:space="preserve">NC</w:t>
-            </w:r>
-          </w:p>
-        </w:tc>
-        <w:tc>
-          <w:tcPr>
-            <w:tcW w:type="dxa" w:w="988"/>
-            <w:tcMar>
-              <w:top w:type="dxa" w:w="20"/>
-              <w:left w:type="dxa" w:w="60"/>
-              <w:bottom w:type="dxa" w:w="20"/>
-              <w:right w:type="dxa" w:w="40"/>
-            </w:tcMar>
-            <w:vAlign w:val="center"/>
-          </w:tcPr>
-          <w:p/>
-        </w:tc>
-        <w:tc>
-          <w:tcPr>
-            <w:tcW w:type="dxa" w:w="988"/>
-            <w:tcMar>
-              <w:top w:type="dxa" w:w="20"/>
-              <w:left w:type="dxa" w:w="60"/>
-              <w:bottom w:type="dxa" w:w="20"/>
-              <w:right w:type="dxa" w:w="40"/>
-            </w:tcMar>
-            <w:vAlign w:val="center"/>
-          </w:tcPr>
-          <w:p/>
-        </w:tc>
-        <w:tc>
-          <w:tcPr>
-            <w:tcW w:type="dxa" w:w="988"/>
-            <w:tcMar>
-              <w:top w:type="dxa" w:w="20"/>
-              <w:left w:type="dxa" w:w="60"/>
-              <w:bottom w:type="dxa" w:w="20"/>
-              <w:right w:type="dxa" w:w="40"/>
-            </w:tcMar>
-            <w:vAlign w:val="center"/>
-          </w:tcPr>
-          <w:p/>
-        </w:tc>
-        <w:tc>
-          <w:tcPr>
-            <w:tcW w:type="dxa" w:w="988"/>
-            <w:tcMar>
-              <w:top w:type="dxa" w:w="20"/>
-              <w:left w:type="dxa" w:w="60"/>
-              <w:bottom w:type="dxa" w:w="20"/>
-              <w:right w:type="dxa" w:w="40"/>
-            </w:tcMar>
-            <w:vAlign w:val="center"/>
-          </w:tcPr>
-          <w:p/>
-        </w:tc>
-        <w:tc>
-          <w:tcPr>
-            <w:tcW w:type="dxa" w:w="988"/>
-            <w:tcMar>
-              <w:top w:type="dxa" w:w="20"/>
-              <w:left w:type="dxa" w:w="60"/>
-              <w:bottom w:type="dxa" w:w="20"/>
-              <w:right w:type="dxa" w:w="40"/>
-            </w:tcMar>
-            <w:vAlign w:val="center"/>
-          </w:tcPr>
-          <w:p/>
+              <w:t xml:space="preserve">12.00</w:t>
+            </w:r>
+          </w:p>
         </w:tc>
         <w:tc>
           <w:tcPr>
@@ -2324,7 +2337,21 @@
             </w:tcMar>
             <w:vAlign w:val="center"/>
           </w:tcPr>
-          <w:p/>
+          <w:p>
+            <w:pPr>
+              <w:spacing w:after="0" w:line="220"/>
+              <w:jc w:val="center"/>
+            </w:pPr>
+            <w:r>
+              <w:rPr>
+                <w:b/>
+                <w:bCs/>
+                <w:sz w:val="16"/>
+                <w:szCs w:val="16"/>
+              </w:rPr>
+              <w:t xml:space="preserve">19.00</w:t>
+            </w:r>
+          </w:p>
         </w:tc>
         <w:tc>
           <w:tcPr>
@@ -4208,48 +4235,47 @@
             </w:tcMar>
             <w:vAlign w:val="center"/>
           </w:tcPr>
-          <w:p>
-            <w:pPr>
-              <w:spacing w:after="0" w:line="220"/>
-              <w:jc w:val="center"/>
-            </w:pPr>
-            <w:r>
-              <w:rPr>
-                <w:b w:val="false"/>
-                <w:bCs w:val="false"/>
-                <w:color w:val="C0392B"/>
+          <w:p/>
+        </w:tc>
+        <w:tc>
+          <w:tcPr>
+            <w:tcW w:type="dxa" w:w="988"/>
+            <w:tcMar>
+              <w:top w:type="dxa" w:w="20"/>
+              <w:left w:type="dxa" w:w="60"/>
+              <w:bottom w:type="dxa" w:w="20"/>
+              <w:right w:type="dxa" w:w="40"/>
+            </w:tcMar>
+            <w:vAlign w:val="center"/>
+          </w:tcPr>
+          <w:p/>
+        </w:tc>
+        <w:tc>
+          <w:tcPr>
+            <w:tcW w:type="dxa" w:w="988"/>
+            <w:tcMar>
+              <w:top w:type="dxa" w:w="20"/>
+              <w:left w:type="dxa" w:w="60"/>
+              <w:bottom w:type="dxa" w:w="20"/>
+              <w:right w:type="dxa" w:w="40"/>
+            </w:tcMar>
+            <w:vAlign w:val="center"/>
+          </w:tcPr>
+          <w:p>
+            <w:pPr>
+              <w:spacing w:after="0" w:line="220"/>
+              <w:jc w:val="center"/>
+            </w:pPr>
+            <w:r>
+              <w:rPr>
+                <w:b/>
+                <w:bCs/>
                 <w:sz w:val="16"/>
                 <w:szCs w:val="16"/>
               </w:rPr>
-              <w:t xml:space="preserve">NC</w:t>
-            </w:r>
-          </w:p>
-        </w:tc>
-        <w:tc>
-          <w:tcPr>
-            <w:tcW w:type="dxa" w:w="988"/>
-            <w:tcMar>
-              <w:top w:type="dxa" w:w="20"/>
-              <w:left w:type="dxa" w:w="60"/>
-              <w:bottom w:type="dxa" w:w="20"/>
-              <w:right w:type="dxa" w:w="40"/>
-            </w:tcMar>
-            <w:vAlign w:val="center"/>
-          </w:tcPr>
-          <w:p/>
-        </w:tc>
-        <w:tc>
-          <w:tcPr>
-            <w:tcW w:type="dxa" w:w="988"/>
-            <w:tcMar>
-              <w:top w:type="dxa" w:w="20"/>
-              <w:left w:type="dxa" w:w="60"/>
-              <w:bottom w:type="dxa" w:w="20"/>
-              <w:right w:type="dxa" w:w="40"/>
-            </w:tcMar>
-            <w:vAlign w:val="center"/>
-          </w:tcPr>
-          <w:p/>
+              <w:t xml:space="preserve">15.30</w:t>
+            </w:r>
+          </w:p>
         </w:tc>
         <w:tc>
           <w:tcPr>
@@ -5175,35 +5201,34 @@
             </w:tcMar>
             <w:vAlign w:val="center"/>
           </w:tcPr>
-          <w:p>
-            <w:pPr>
-              <w:spacing w:after="0" w:line="220"/>
-              <w:jc w:val="center"/>
-            </w:pPr>
-            <w:r>
-              <w:rPr>
-                <w:b w:val="false"/>
-                <w:bCs w:val="false"/>
-                <w:color w:val="C0392B"/>
+          <w:p/>
+        </w:tc>
+        <w:tc>
+          <w:tcPr>
+            <w:tcW w:type="dxa" w:w="988"/>
+            <w:tcMar>
+              <w:top w:type="dxa" w:w="20"/>
+              <w:left w:type="dxa" w:w="60"/>
+              <w:bottom w:type="dxa" w:w="20"/>
+              <w:right w:type="dxa" w:w="40"/>
+            </w:tcMar>
+            <w:vAlign w:val="center"/>
+          </w:tcPr>
+          <w:p>
+            <w:pPr>
+              <w:spacing w:after="0" w:line="220"/>
+              <w:jc w:val="center"/>
+            </w:pPr>
+            <w:r>
+              <w:rPr>
+                <w:b/>
+                <w:bCs/>
                 <w:sz w:val="16"/>
                 <w:szCs w:val="16"/>
               </w:rPr>
-              <w:t xml:space="preserve">NC</w:t>
-            </w:r>
-          </w:p>
-        </w:tc>
-        <w:tc>
-          <w:tcPr>
-            <w:tcW w:type="dxa" w:w="988"/>
-            <w:tcMar>
-              <w:top w:type="dxa" w:w="20"/>
-              <w:left w:type="dxa" w:w="60"/>
-              <w:bottom w:type="dxa" w:w="20"/>
-              <w:right w:type="dxa" w:w="40"/>
-            </w:tcMar>
-            <w:vAlign w:val="center"/>
-          </w:tcPr>
-          <w:p/>
+              <w:t xml:space="preserve">13.00</w:t>
+            </w:r>
+          </w:p>
         </w:tc>
         <w:tc>
           <w:tcPr>

</xml_diff>

<commit_message>
Matchs Toussaint Gr9-10: releve 27/10 + XXXXX pour elimines
- Gaspard (Castle Club 15.2): mer 28/10 13h00 (etait NC).
- XXXXX (gris) dans les cases restantes des elimines: Simon (Castle Club
  M4) et Georges (tableau 13 G2, toujours actif en 13 G3). Match de lundi
  conserve.
- Legende: ajout 'XXXXX = elimine du tableau'.

Co-Authored-By: Claude Opus 4.8 <noreply@anthropic.com>
Claude-Session: https://claude.ai/code/session_013WShXcCyBkE1H1x1qzmtZK
</commit_message>
<xml_diff>
--- a/Liste_des_matchs_Toussaint_Gr9-10.docx
+++ b/Liste_des_matchs_Toussaint_Gr9-10.docx
@@ -3280,72 +3280,162 @@
             </w:tcMar>
             <w:vAlign w:val="center"/>
           </w:tcPr>
-          <w:p/>
-        </w:tc>
-        <w:tc>
-          <w:tcPr>
-            <w:tcW w:type="dxa" w:w="988"/>
-            <w:tcMar>
-              <w:top w:type="dxa" w:w="20"/>
-              <w:left w:type="dxa" w:w="60"/>
-              <w:bottom w:type="dxa" w:w="20"/>
-              <w:right w:type="dxa" w:w="40"/>
-            </w:tcMar>
-            <w:vAlign w:val="center"/>
-          </w:tcPr>
-          <w:p/>
-        </w:tc>
-        <w:tc>
-          <w:tcPr>
-            <w:tcW w:type="dxa" w:w="988"/>
-            <w:tcMar>
-              <w:top w:type="dxa" w:w="20"/>
-              <w:left w:type="dxa" w:w="60"/>
-              <w:bottom w:type="dxa" w:w="20"/>
-              <w:right w:type="dxa" w:w="40"/>
-            </w:tcMar>
-            <w:vAlign w:val="center"/>
-          </w:tcPr>
-          <w:p/>
-        </w:tc>
-        <w:tc>
-          <w:tcPr>
-            <w:tcW w:type="dxa" w:w="988"/>
-            <w:tcMar>
-              <w:top w:type="dxa" w:w="20"/>
-              <w:left w:type="dxa" w:w="60"/>
-              <w:bottom w:type="dxa" w:w="20"/>
-              <w:right w:type="dxa" w:w="40"/>
-            </w:tcMar>
-            <w:vAlign w:val="center"/>
-          </w:tcPr>
-          <w:p/>
-        </w:tc>
-        <w:tc>
-          <w:tcPr>
-            <w:tcW w:type="dxa" w:w="988"/>
-            <w:tcMar>
-              <w:top w:type="dxa" w:w="20"/>
-              <w:left w:type="dxa" w:w="60"/>
-              <w:bottom w:type="dxa" w:w="20"/>
-              <w:right w:type="dxa" w:w="40"/>
-            </w:tcMar>
-            <w:vAlign w:val="center"/>
-          </w:tcPr>
-          <w:p/>
-        </w:tc>
-        <w:tc>
-          <w:tcPr>
-            <w:tcW w:type="dxa" w:w="988"/>
-            <w:tcMar>
-              <w:top w:type="dxa" w:w="20"/>
-              <w:left w:type="dxa" w:w="60"/>
-              <w:bottom w:type="dxa" w:w="20"/>
-              <w:right w:type="dxa" w:w="40"/>
-            </w:tcMar>
-            <w:vAlign w:val="center"/>
-          </w:tcPr>
-          <w:p/>
+          <w:p>
+            <w:pPr>
+              <w:spacing w:after="0" w:line="220"/>
+              <w:jc w:val="center"/>
+            </w:pPr>
+            <w:r>
+              <w:rPr>
+                <w:b w:val="false"/>
+                <w:bCs w:val="false"/>
+                <w:color w:val="999999"/>
+                <w:sz w:val="16"/>
+                <w:szCs w:val="16"/>
+              </w:rPr>
+              <w:t xml:space="preserve">XXXXX</w:t>
+            </w:r>
+          </w:p>
+        </w:tc>
+        <w:tc>
+          <w:tcPr>
+            <w:tcW w:type="dxa" w:w="988"/>
+            <w:tcMar>
+              <w:top w:type="dxa" w:w="20"/>
+              <w:left w:type="dxa" w:w="60"/>
+              <w:bottom w:type="dxa" w:w="20"/>
+              <w:right w:type="dxa" w:w="40"/>
+            </w:tcMar>
+            <w:vAlign w:val="center"/>
+          </w:tcPr>
+          <w:p>
+            <w:pPr>
+              <w:spacing w:after="0" w:line="220"/>
+              <w:jc w:val="center"/>
+            </w:pPr>
+            <w:r>
+              <w:rPr>
+                <w:b w:val="false"/>
+                <w:bCs w:val="false"/>
+                <w:color w:val="999999"/>
+                <w:sz w:val="16"/>
+                <w:szCs w:val="16"/>
+              </w:rPr>
+              <w:t xml:space="preserve">XXXXX</w:t>
+            </w:r>
+          </w:p>
+        </w:tc>
+        <w:tc>
+          <w:tcPr>
+            <w:tcW w:type="dxa" w:w="988"/>
+            <w:tcMar>
+              <w:top w:type="dxa" w:w="20"/>
+              <w:left w:type="dxa" w:w="60"/>
+              <w:bottom w:type="dxa" w:w="20"/>
+              <w:right w:type="dxa" w:w="40"/>
+            </w:tcMar>
+            <w:vAlign w:val="center"/>
+          </w:tcPr>
+          <w:p>
+            <w:pPr>
+              <w:spacing w:after="0" w:line="220"/>
+              <w:jc w:val="center"/>
+            </w:pPr>
+            <w:r>
+              <w:rPr>
+                <w:b w:val="false"/>
+                <w:bCs w:val="false"/>
+                <w:color w:val="999999"/>
+                <w:sz w:val="16"/>
+                <w:szCs w:val="16"/>
+              </w:rPr>
+              <w:t xml:space="preserve">XXXXX</w:t>
+            </w:r>
+          </w:p>
+        </w:tc>
+        <w:tc>
+          <w:tcPr>
+            <w:tcW w:type="dxa" w:w="988"/>
+            <w:tcMar>
+              <w:top w:type="dxa" w:w="20"/>
+              <w:left w:type="dxa" w:w="60"/>
+              <w:bottom w:type="dxa" w:w="20"/>
+              <w:right w:type="dxa" w:w="40"/>
+            </w:tcMar>
+            <w:vAlign w:val="center"/>
+          </w:tcPr>
+          <w:p>
+            <w:pPr>
+              <w:spacing w:after="0" w:line="220"/>
+              <w:jc w:val="center"/>
+            </w:pPr>
+            <w:r>
+              <w:rPr>
+                <w:b w:val="false"/>
+                <w:bCs w:val="false"/>
+                <w:color w:val="999999"/>
+                <w:sz w:val="16"/>
+                <w:szCs w:val="16"/>
+              </w:rPr>
+              <w:t xml:space="preserve">XXXXX</w:t>
+            </w:r>
+          </w:p>
+        </w:tc>
+        <w:tc>
+          <w:tcPr>
+            <w:tcW w:type="dxa" w:w="988"/>
+            <w:tcMar>
+              <w:top w:type="dxa" w:w="20"/>
+              <w:left w:type="dxa" w:w="60"/>
+              <w:bottom w:type="dxa" w:w="20"/>
+              <w:right w:type="dxa" w:w="40"/>
+            </w:tcMar>
+            <w:vAlign w:val="center"/>
+          </w:tcPr>
+          <w:p>
+            <w:pPr>
+              <w:spacing w:after="0" w:line="220"/>
+              <w:jc w:val="center"/>
+            </w:pPr>
+            <w:r>
+              <w:rPr>
+                <w:b w:val="false"/>
+                <w:bCs w:val="false"/>
+                <w:color w:val="999999"/>
+                <w:sz w:val="16"/>
+                <w:szCs w:val="16"/>
+              </w:rPr>
+              <w:t xml:space="preserve">XXXXX</w:t>
+            </w:r>
+          </w:p>
+        </w:tc>
+        <w:tc>
+          <w:tcPr>
+            <w:tcW w:type="dxa" w:w="988"/>
+            <w:tcMar>
+              <w:top w:type="dxa" w:w="20"/>
+              <w:left w:type="dxa" w:w="60"/>
+              <w:bottom w:type="dxa" w:w="20"/>
+              <w:right w:type="dxa" w:w="40"/>
+            </w:tcMar>
+            <w:vAlign w:val="center"/>
+          </w:tcPr>
+          <w:p>
+            <w:pPr>
+              <w:spacing w:after="0" w:line="220"/>
+              <w:jc w:val="center"/>
+            </w:pPr>
+            <w:r>
+              <w:rPr>
+                <w:b w:val="false"/>
+                <w:bCs w:val="false"/>
+                <w:color w:val="999999"/>
+                <w:sz w:val="16"/>
+                <w:szCs w:val="16"/>
+              </w:rPr>
+              <w:t xml:space="preserve">XXXXX</w:t>
+            </w:r>
+          </w:p>
         </w:tc>
       </w:tr>
       <w:tr>
@@ -3621,72 +3711,162 @@
             </w:tcMar>
             <w:vAlign w:val="center"/>
           </w:tcPr>
-          <w:p/>
-        </w:tc>
-        <w:tc>
-          <w:tcPr>
-            <w:tcW w:type="dxa" w:w="988"/>
-            <w:tcMar>
-              <w:top w:type="dxa" w:w="20"/>
-              <w:left w:type="dxa" w:w="60"/>
-              <w:bottom w:type="dxa" w:w="20"/>
-              <w:right w:type="dxa" w:w="40"/>
-            </w:tcMar>
-            <w:vAlign w:val="center"/>
-          </w:tcPr>
-          <w:p/>
-        </w:tc>
-        <w:tc>
-          <w:tcPr>
-            <w:tcW w:type="dxa" w:w="988"/>
-            <w:tcMar>
-              <w:top w:type="dxa" w:w="20"/>
-              <w:left w:type="dxa" w:w="60"/>
-              <w:bottom w:type="dxa" w:w="20"/>
-              <w:right w:type="dxa" w:w="40"/>
-            </w:tcMar>
-            <w:vAlign w:val="center"/>
-          </w:tcPr>
-          <w:p/>
-        </w:tc>
-        <w:tc>
-          <w:tcPr>
-            <w:tcW w:type="dxa" w:w="988"/>
-            <w:tcMar>
-              <w:top w:type="dxa" w:w="20"/>
-              <w:left w:type="dxa" w:w="60"/>
-              <w:bottom w:type="dxa" w:w="20"/>
-              <w:right w:type="dxa" w:w="40"/>
-            </w:tcMar>
-            <w:vAlign w:val="center"/>
-          </w:tcPr>
-          <w:p/>
-        </w:tc>
-        <w:tc>
-          <w:tcPr>
-            <w:tcW w:type="dxa" w:w="988"/>
-            <w:tcMar>
-              <w:top w:type="dxa" w:w="20"/>
-              <w:left w:type="dxa" w:w="60"/>
-              <w:bottom w:type="dxa" w:w="20"/>
-              <w:right w:type="dxa" w:w="40"/>
-            </w:tcMar>
-            <w:vAlign w:val="center"/>
-          </w:tcPr>
-          <w:p/>
-        </w:tc>
-        <w:tc>
-          <w:tcPr>
-            <w:tcW w:type="dxa" w:w="988"/>
-            <w:tcMar>
-              <w:top w:type="dxa" w:w="20"/>
-              <w:left w:type="dxa" w:w="60"/>
-              <w:bottom w:type="dxa" w:w="20"/>
-              <w:right w:type="dxa" w:w="40"/>
-            </w:tcMar>
-            <w:vAlign w:val="center"/>
-          </w:tcPr>
-          <w:p/>
+          <w:p>
+            <w:pPr>
+              <w:spacing w:after="0" w:line="220"/>
+              <w:jc w:val="center"/>
+            </w:pPr>
+            <w:r>
+              <w:rPr>
+                <w:b w:val="false"/>
+                <w:bCs w:val="false"/>
+                <w:color w:val="999999"/>
+                <w:sz w:val="16"/>
+                <w:szCs w:val="16"/>
+              </w:rPr>
+              <w:t xml:space="preserve">XXXXX</w:t>
+            </w:r>
+          </w:p>
+        </w:tc>
+        <w:tc>
+          <w:tcPr>
+            <w:tcW w:type="dxa" w:w="988"/>
+            <w:tcMar>
+              <w:top w:type="dxa" w:w="20"/>
+              <w:left w:type="dxa" w:w="60"/>
+              <w:bottom w:type="dxa" w:w="20"/>
+              <w:right w:type="dxa" w:w="40"/>
+            </w:tcMar>
+            <w:vAlign w:val="center"/>
+          </w:tcPr>
+          <w:p>
+            <w:pPr>
+              <w:spacing w:after="0" w:line="220"/>
+              <w:jc w:val="center"/>
+            </w:pPr>
+            <w:r>
+              <w:rPr>
+                <w:b w:val="false"/>
+                <w:bCs w:val="false"/>
+                <w:color w:val="999999"/>
+                <w:sz w:val="16"/>
+                <w:szCs w:val="16"/>
+              </w:rPr>
+              <w:t xml:space="preserve">XXXXX</w:t>
+            </w:r>
+          </w:p>
+        </w:tc>
+        <w:tc>
+          <w:tcPr>
+            <w:tcW w:type="dxa" w:w="988"/>
+            <w:tcMar>
+              <w:top w:type="dxa" w:w="20"/>
+              <w:left w:type="dxa" w:w="60"/>
+              <w:bottom w:type="dxa" w:w="20"/>
+              <w:right w:type="dxa" w:w="40"/>
+            </w:tcMar>
+            <w:vAlign w:val="center"/>
+          </w:tcPr>
+          <w:p>
+            <w:pPr>
+              <w:spacing w:after="0" w:line="220"/>
+              <w:jc w:val="center"/>
+            </w:pPr>
+            <w:r>
+              <w:rPr>
+                <w:b w:val="false"/>
+                <w:bCs w:val="false"/>
+                <w:color w:val="999999"/>
+                <w:sz w:val="16"/>
+                <w:szCs w:val="16"/>
+              </w:rPr>
+              <w:t xml:space="preserve">XXXXX</w:t>
+            </w:r>
+          </w:p>
+        </w:tc>
+        <w:tc>
+          <w:tcPr>
+            <w:tcW w:type="dxa" w:w="988"/>
+            <w:tcMar>
+              <w:top w:type="dxa" w:w="20"/>
+              <w:left w:type="dxa" w:w="60"/>
+              <w:bottom w:type="dxa" w:w="20"/>
+              <w:right w:type="dxa" w:w="40"/>
+            </w:tcMar>
+            <w:vAlign w:val="center"/>
+          </w:tcPr>
+          <w:p>
+            <w:pPr>
+              <w:spacing w:after="0" w:line="220"/>
+              <w:jc w:val="center"/>
+            </w:pPr>
+            <w:r>
+              <w:rPr>
+                <w:b w:val="false"/>
+                <w:bCs w:val="false"/>
+                <w:color w:val="999999"/>
+                <w:sz w:val="16"/>
+                <w:szCs w:val="16"/>
+              </w:rPr>
+              <w:t xml:space="preserve">XXXXX</w:t>
+            </w:r>
+          </w:p>
+        </w:tc>
+        <w:tc>
+          <w:tcPr>
+            <w:tcW w:type="dxa" w:w="988"/>
+            <w:tcMar>
+              <w:top w:type="dxa" w:w="20"/>
+              <w:left w:type="dxa" w:w="60"/>
+              <w:bottom w:type="dxa" w:w="20"/>
+              <w:right w:type="dxa" w:w="40"/>
+            </w:tcMar>
+            <w:vAlign w:val="center"/>
+          </w:tcPr>
+          <w:p>
+            <w:pPr>
+              <w:spacing w:after="0" w:line="220"/>
+              <w:jc w:val="center"/>
+            </w:pPr>
+            <w:r>
+              <w:rPr>
+                <w:b w:val="false"/>
+                <w:bCs w:val="false"/>
+                <w:color w:val="999999"/>
+                <w:sz w:val="16"/>
+                <w:szCs w:val="16"/>
+              </w:rPr>
+              <w:t xml:space="preserve">XXXXX</w:t>
+            </w:r>
+          </w:p>
+        </w:tc>
+        <w:tc>
+          <w:tcPr>
+            <w:tcW w:type="dxa" w:w="988"/>
+            <w:tcMar>
+              <w:top w:type="dxa" w:w="20"/>
+              <w:left w:type="dxa" w:w="60"/>
+              <w:bottom w:type="dxa" w:w="20"/>
+              <w:right w:type="dxa" w:w="40"/>
+            </w:tcMar>
+            <w:vAlign w:val="center"/>
+          </w:tcPr>
+          <w:p>
+            <w:pPr>
+              <w:spacing w:after="0" w:line="220"/>
+              <w:jc w:val="center"/>
+            </w:pPr>
+            <w:r>
+              <w:rPr>
+                <w:b w:val="false"/>
+                <w:bCs w:val="false"/>
+                <w:color w:val="999999"/>
+                <w:sz w:val="16"/>
+                <w:szCs w:val="16"/>
+              </w:rPr>
+              <w:t xml:space="preserve">XXXXX</w:t>
+            </w:r>
+          </w:p>
         </w:tc>
       </w:tr>
       <w:tr>
@@ -3757,48 +3937,47 @@
             </w:tcMar>
             <w:vAlign w:val="center"/>
           </w:tcPr>
-          <w:p>
-            <w:pPr>
-              <w:spacing w:after="0" w:line="220"/>
-              <w:jc w:val="center"/>
-            </w:pPr>
-            <w:r>
-              <w:rPr>
-                <w:b w:val="false"/>
-                <w:bCs w:val="false"/>
-                <w:color w:val="C0392B"/>
+          <w:p/>
+        </w:tc>
+        <w:tc>
+          <w:tcPr>
+            <w:tcW w:type="dxa" w:w="988"/>
+            <w:tcMar>
+              <w:top w:type="dxa" w:w="20"/>
+              <w:left w:type="dxa" w:w="60"/>
+              <w:bottom w:type="dxa" w:w="20"/>
+              <w:right w:type="dxa" w:w="40"/>
+            </w:tcMar>
+            <w:vAlign w:val="center"/>
+          </w:tcPr>
+          <w:p/>
+        </w:tc>
+        <w:tc>
+          <w:tcPr>
+            <w:tcW w:type="dxa" w:w="988"/>
+            <w:tcMar>
+              <w:top w:type="dxa" w:w="20"/>
+              <w:left w:type="dxa" w:w="60"/>
+              <w:bottom w:type="dxa" w:w="20"/>
+              <w:right w:type="dxa" w:w="40"/>
+            </w:tcMar>
+            <w:vAlign w:val="center"/>
+          </w:tcPr>
+          <w:p>
+            <w:pPr>
+              <w:spacing w:after="0" w:line="220"/>
+              <w:jc w:val="center"/>
+            </w:pPr>
+            <w:r>
+              <w:rPr>
+                <w:b/>
+                <w:bCs/>
                 <w:sz w:val="16"/>
                 <w:szCs w:val="16"/>
               </w:rPr>
-              <w:t xml:space="preserve">NC</w:t>
-            </w:r>
-          </w:p>
-        </w:tc>
-        <w:tc>
-          <w:tcPr>
-            <w:tcW w:type="dxa" w:w="988"/>
-            <w:tcMar>
-              <w:top w:type="dxa" w:w="20"/>
-              <w:left w:type="dxa" w:w="60"/>
-              <w:bottom w:type="dxa" w:w="20"/>
-              <w:right w:type="dxa" w:w="40"/>
-            </w:tcMar>
-            <w:vAlign w:val="center"/>
-          </w:tcPr>
-          <w:p/>
-        </w:tc>
-        <w:tc>
-          <w:tcPr>
-            <w:tcW w:type="dxa" w:w="988"/>
-            <w:tcMar>
-              <w:top w:type="dxa" w:w="20"/>
-              <w:left w:type="dxa" w:w="60"/>
-              <w:bottom w:type="dxa" w:w="20"/>
-              <w:right w:type="dxa" w:w="40"/>
-            </w:tcMar>
-            <w:vAlign w:val="center"/>
-          </w:tcPr>
-          <w:p/>
+              <w:t xml:space="preserve">13.00</w:t>
+            </w:r>
+          </w:p>
         </w:tc>
         <w:tc>
           <w:tcPr>
@@ -5309,7 +5488,7 @@
           <w:sz w:val="15"/>
           <w:szCs w:val="15"/>
         </w:rPr>
-        <w:t xml:space="preserve">NC = match à programmer (horaire non communiqué). Relevé AFT du 26/10/2026 ; tableaux Grade 3 (poules) inclus.</w:t>
+        <w:t xml:space="preserve">NC = match à programmer (horaire non communiqué). XXXXX = éliminé du tableau. Relevé AFT du 27/10/2026 ; tableaux Grade 3 (poules) inclus.</w:t>
       </w:r>
     </w:p>
     <w:sectPr>

</xml_diff>

<commit_message>
Matchs Toussaint Gr9-10: releve 28/10 (eliminations + nouveaux horaires)
Elimines mardi a Set Wahis (XXXXX): Thibault (13 G2), Samy (11 G2, out),
Maxim G. (9 G1 a Set Wahis; reste actif au Parc).
Horaires: Georges 13 G3 poules mer 12.45/13.30; Gaspard Castle 15.2 mer
13.45; Gaspard Primerose a gagne mardi -> jeu 29/10 16h00.

Co-Authored-By: Claude Opus 4.8 <noreply@anthropic.com>
Claude-Session: https://claude.ai/code/session_013WShXcCyBkE1H1x1qzmtZK
</commit_message>
<xml_diff>
--- a/Liste_des_matchs_Toussaint_Gr9-10.docx
+++ b/Liste_des_matchs_Toussaint_Gr9-10.docx
@@ -1152,59 +1152,134 @@
             </w:tcMar>
             <w:vAlign w:val="center"/>
           </w:tcPr>
-          <w:p/>
-        </w:tc>
-        <w:tc>
-          <w:tcPr>
-            <w:tcW w:type="dxa" w:w="988"/>
-            <w:tcMar>
-              <w:top w:type="dxa" w:w="20"/>
-              <w:left w:type="dxa" w:w="60"/>
-              <w:bottom w:type="dxa" w:w="20"/>
-              <w:right w:type="dxa" w:w="40"/>
-            </w:tcMar>
-            <w:vAlign w:val="center"/>
-          </w:tcPr>
-          <w:p/>
-        </w:tc>
-        <w:tc>
-          <w:tcPr>
-            <w:tcW w:type="dxa" w:w="988"/>
-            <w:tcMar>
-              <w:top w:type="dxa" w:w="20"/>
-              <w:left w:type="dxa" w:w="60"/>
-              <w:bottom w:type="dxa" w:w="20"/>
-              <w:right w:type="dxa" w:w="40"/>
-            </w:tcMar>
-            <w:vAlign w:val="center"/>
-          </w:tcPr>
-          <w:p/>
-        </w:tc>
-        <w:tc>
-          <w:tcPr>
-            <w:tcW w:type="dxa" w:w="988"/>
-            <w:tcMar>
-              <w:top w:type="dxa" w:w="20"/>
-              <w:left w:type="dxa" w:w="60"/>
-              <w:bottom w:type="dxa" w:w="20"/>
-              <w:right w:type="dxa" w:w="40"/>
-            </w:tcMar>
-            <w:vAlign w:val="center"/>
-          </w:tcPr>
-          <w:p/>
-        </w:tc>
-        <w:tc>
-          <w:tcPr>
-            <w:tcW w:type="dxa" w:w="988"/>
-            <w:tcMar>
-              <w:top w:type="dxa" w:w="20"/>
-              <w:left w:type="dxa" w:w="60"/>
-              <w:bottom w:type="dxa" w:w="20"/>
-              <w:right w:type="dxa" w:w="40"/>
-            </w:tcMar>
-            <w:vAlign w:val="center"/>
-          </w:tcPr>
-          <w:p/>
+          <w:p>
+            <w:pPr>
+              <w:spacing w:after="0" w:line="220"/>
+              <w:jc w:val="center"/>
+            </w:pPr>
+            <w:r>
+              <w:rPr>
+                <w:b w:val="false"/>
+                <w:bCs w:val="false"/>
+                <w:color w:val="999999"/>
+                <w:sz w:val="16"/>
+                <w:szCs w:val="16"/>
+              </w:rPr>
+              <w:t xml:space="preserve">XXXXX</w:t>
+            </w:r>
+          </w:p>
+        </w:tc>
+        <w:tc>
+          <w:tcPr>
+            <w:tcW w:type="dxa" w:w="988"/>
+            <w:tcMar>
+              <w:top w:type="dxa" w:w="20"/>
+              <w:left w:type="dxa" w:w="60"/>
+              <w:bottom w:type="dxa" w:w="20"/>
+              <w:right w:type="dxa" w:w="40"/>
+            </w:tcMar>
+            <w:vAlign w:val="center"/>
+          </w:tcPr>
+          <w:p>
+            <w:pPr>
+              <w:spacing w:after="0" w:line="220"/>
+              <w:jc w:val="center"/>
+            </w:pPr>
+            <w:r>
+              <w:rPr>
+                <w:b w:val="false"/>
+                <w:bCs w:val="false"/>
+                <w:color w:val="999999"/>
+                <w:sz w:val="16"/>
+                <w:szCs w:val="16"/>
+              </w:rPr>
+              <w:t xml:space="preserve">XXXXX</w:t>
+            </w:r>
+          </w:p>
+        </w:tc>
+        <w:tc>
+          <w:tcPr>
+            <w:tcW w:type="dxa" w:w="988"/>
+            <w:tcMar>
+              <w:top w:type="dxa" w:w="20"/>
+              <w:left w:type="dxa" w:w="60"/>
+              <w:bottom w:type="dxa" w:w="20"/>
+              <w:right w:type="dxa" w:w="40"/>
+            </w:tcMar>
+            <w:vAlign w:val="center"/>
+          </w:tcPr>
+          <w:p>
+            <w:pPr>
+              <w:spacing w:after="0" w:line="220"/>
+              <w:jc w:val="center"/>
+            </w:pPr>
+            <w:r>
+              <w:rPr>
+                <w:b w:val="false"/>
+                <w:bCs w:val="false"/>
+                <w:color w:val="999999"/>
+                <w:sz w:val="16"/>
+                <w:szCs w:val="16"/>
+              </w:rPr>
+              <w:t xml:space="preserve">XXXXX</w:t>
+            </w:r>
+          </w:p>
+        </w:tc>
+        <w:tc>
+          <w:tcPr>
+            <w:tcW w:type="dxa" w:w="988"/>
+            <w:tcMar>
+              <w:top w:type="dxa" w:w="20"/>
+              <w:left w:type="dxa" w:w="60"/>
+              <w:bottom w:type="dxa" w:w="20"/>
+              <w:right w:type="dxa" w:w="40"/>
+            </w:tcMar>
+            <w:vAlign w:val="center"/>
+          </w:tcPr>
+          <w:p>
+            <w:pPr>
+              <w:spacing w:after="0" w:line="220"/>
+              <w:jc w:val="center"/>
+            </w:pPr>
+            <w:r>
+              <w:rPr>
+                <w:b w:val="false"/>
+                <w:bCs w:val="false"/>
+                <w:color w:val="999999"/>
+                <w:sz w:val="16"/>
+                <w:szCs w:val="16"/>
+              </w:rPr>
+              <w:t xml:space="preserve">XXXXX</w:t>
+            </w:r>
+          </w:p>
+        </w:tc>
+        <w:tc>
+          <w:tcPr>
+            <w:tcW w:type="dxa" w:w="988"/>
+            <w:tcMar>
+              <w:top w:type="dxa" w:w="20"/>
+              <w:left w:type="dxa" w:w="60"/>
+              <w:bottom w:type="dxa" w:w="20"/>
+              <w:right w:type="dxa" w:w="40"/>
+            </w:tcMar>
+            <w:vAlign w:val="center"/>
+          </w:tcPr>
+          <w:p>
+            <w:pPr>
+              <w:spacing w:after="0" w:line="220"/>
+              <w:jc w:val="center"/>
+            </w:pPr>
+            <w:r>
+              <w:rPr>
+                <w:b w:val="false"/>
+                <w:bCs w:val="false"/>
+                <w:color w:val="999999"/>
+                <w:sz w:val="16"/>
+                <w:szCs w:val="16"/>
+              </w:rPr>
+              <w:t xml:space="preserve">XXXXX</w:t>
+            </w:r>
+          </w:p>
         </w:tc>
       </w:tr>
       <w:tr>
@@ -1657,59 +1732,134 @@
             </w:tcMar>
             <w:vAlign w:val="center"/>
           </w:tcPr>
-          <w:p/>
-        </w:tc>
-        <w:tc>
-          <w:tcPr>
-            <w:tcW w:type="dxa" w:w="988"/>
-            <w:tcMar>
-              <w:top w:type="dxa" w:w="20"/>
-              <w:left w:type="dxa" w:w="60"/>
-              <w:bottom w:type="dxa" w:w="20"/>
-              <w:right w:type="dxa" w:w="40"/>
-            </w:tcMar>
-            <w:vAlign w:val="center"/>
-          </w:tcPr>
-          <w:p/>
-        </w:tc>
-        <w:tc>
-          <w:tcPr>
-            <w:tcW w:type="dxa" w:w="988"/>
-            <w:tcMar>
-              <w:top w:type="dxa" w:w="20"/>
-              <w:left w:type="dxa" w:w="60"/>
-              <w:bottom w:type="dxa" w:w="20"/>
-              <w:right w:type="dxa" w:w="40"/>
-            </w:tcMar>
-            <w:vAlign w:val="center"/>
-          </w:tcPr>
-          <w:p/>
-        </w:tc>
-        <w:tc>
-          <w:tcPr>
-            <w:tcW w:type="dxa" w:w="988"/>
-            <w:tcMar>
-              <w:top w:type="dxa" w:w="20"/>
-              <w:left w:type="dxa" w:w="60"/>
-              <w:bottom w:type="dxa" w:w="20"/>
-              <w:right w:type="dxa" w:w="40"/>
-            </w:tcMar>
-            <w:vAlign w:val="center"/>
-          </w:tcPr>
-          <w:p/>
-        </w:tc>
-        <w:tc>
-          <w:tcPr>
-            <w:tcW w:type="dxa" w:w="988"/>
-            <w:tcMar>
-              <w:top w:type="dxa" w:w="20"/>
-              <w:left w:type="dxa" w:w="60"/>
-              <w:bottom w:type="dxa" w:w="20"/>
-              <w:right w:type="dxa" w:w="40"/>
-            </w:tcMar>
-            <w:vAlign w:val="center"/>
-          </w:tcPr>
-          <w:p/>
+          <w:p>
+            <w:pPr>
+              <w:spacing w:after="0" w:line="220"/>
+              <w:jc w:val="center"/>
+            </w:pPr>
+            <w:r>
+              <w:rPr>
+                <w:b w:val="false"/>
+                <w:bCs w:val="false"/>
+                <w:color w:val="999999"/>
+                <w:sz w:val="16"/>
+                <w:szCs w:val="16"/>
+              </w:rPr>
+              <w:t xml:space="preserve">XXXXX</w:t>
+            </w:r>
+          </w:p>
+        </w:tc>
+        <w:tc>
+          <w:tcPr>
+            <w:tcW w:type="dxa" w:w="988"/>
+            <w:tcMar>
+              <w:top w:type="dxa" w:w="20"/>
+              <w:left w:type="dxa" w:w="60"/>
+              <w:bottom w:type="dxa" w:w="20"/>
+              <w:right w:type="dxa" w:w="40"/>
+            </w:tcMar>
+            <w:vAlign w:val="center"/>
+          </w:tcPr>
+          <w:p>
+            <w:pPr>
+              <w:spacing w:after="0" w:line="220"/>
+              <w:jc w:val="center"/>
+            </w:pPr>
+            <w:r>
+              <w:rPr>
+                <w:b w:val="false"/>
+                <w:bCs w:val="false"/>
+                <w:color w:val="999999"/>
+                <w:sz w:val="16"/>
+                <w:szCs w:val="16"/>
+              </w:rPr>
+              <w:t xml:space="preserve">XXXXX</w:t>
+            </w:r>
+          </w:p>
+        </w:tc>
+        <w:tc>
+          <w:tcPr>
+            <w:tcW w:type="dxa" w:w="988"/>
+            <w:tcMar>
+              <w:top w:type="dxa" w:w="20"/>
+              <w:left w:type="dxa" w:w="60"/>
+              <w:bottom w:type="dxa" w:w="20"/>
+              <w:right w:type="dxa" w:w="40"/>
+            </w:tcMar>
+            <w:vAlign w:val="center"/>
+          </w:tcPr>
+          <w:p>
+            <w:pPr>
+              <w:spacing w:after="0" w:line="220"/>
+              <w:jc w:val="center"/>
+            </w:pPr>
+            <w:r>
+              <w:rPr>
+                <w:b w:val="false"/>
+                <w:bCs w:val="false"/>
+                <w:color w:val="999999"/>
+                <w:sz w:val="16"/>
+                <w:szCs w:val="16"/>
+              </w:rPr>
+              <w:t xml:space="preserve">XXXXX</w:t>
+            </w:r>
+          </w:p>
+        </w:tc>
+        <w:tc>
+          <w:tcPr>
+            <w:tcW w:type="dxa" w:w="988"/>
+            <w:tcMar>
+              <w:top w:type="dxa" w:w="20"/>
+              <w:left w:type="dxa" w:w="60"/>
+              <w:bottom w:type="dxa" w:w="20"/>
+              <w:right w:type="dxa" w:w="40"/>
+            </w:tcMar>
+            <w:vAlign w:val="center"/>
+          </w:tcPr>
+          <w:p>
+            <w:pPr>
+              <w:spacing w:after="0" w:line="220"/>
+              <w:jc w:val="center"/>
+            </w:pPr>
+            <w:r>
+              <w:rPr>
+                <w:b w:val="false"/>
+                <w:bCs w:val="false"/>
+                <w:color w:val="999999"/>
+                <w:sz w:val="16"/>
+                <w:szCs w:val="16"/>
+              </w:rPr>
+              <w:t xml:space="preserve">XXXXX</w:t>
+            </w:r>
+          </w:p>
+        </w:tc>
+        <w:tc>
+          <w:tcPr>
+            <w:tcW w:type="dxa" w:w="988"/>
+            <w:tcMar>
+              <w:top w:type="dxa" w:w="20"/>
+              <w:left w:type="dxa" w:w="60"/>
+              <w:bottom w:type="dxa" w:w="20"/>
+              <w:right w:type="dxa" w:w="40"/>
+            </w:tcMar>
+            <w:vAlign w:val="center"/>
+          </w:tcPr>
+          <w:p>
+            <w:pPr>
+              <w:spacing w:after="0" w:line="220"/>
+              <w:jc w:val="center"/>
+            </w:pPr>
+            <w:r>
+              <w:rPr>
+                <w:b w:val="false"/>
+                <w:bCs w:val="false"/>
+                <w:color w:val="999999"/>
+                <w:sz w:val="16"/>
+                <w:szCs w:val="16"/>
+              </w:rPr>
+              <w:t xml:space="preserve">XXXXX</w:t>
+            </w:r>
+          </w:p>
         </w:tc>
       </w:tr>
       <w:tr>
@@ -1820,59 +1970,134 @@
             </w:tcMar>
             <w:vAlign w:val="center"/>
           </w:tcPr>
-          <w:p/>
-        </w:tc>
-        <w:tc>
-          <w:tcPr>
-            <w:tcW w:type="dxa" w:w="988"/>
-            <w:tcMar>
-              <w:top w:type="dxa" w:w="20"/>
-              <w:left w:type="dxa" w:w="60"/>
-              <w:bottom w:type="dxa" w:w="20"/>
-              <w:right w:type="dxa" w:w="40"/>
-            </w:tcMar>
-            <w:vAlign w:val="center"/>
-          </w:tcPr>
-          <w:p/>
-        </w:tc>
-        <w:tc>
-          <w:tcPr>
-            <w:tcW w:type="dxa" w:w="988"/>
-            <w:tcMar>
-              <w:top w:type="dxa" w:w="20"/>
-              <w:left w:type="dxa" w:w="60"/>
-              <w:bottom w:type="dxa" w:w="20"/>
-              <w:right w:type="dxa" w:w="40"/>
-            </w:tcMar>
-            <w:vAlign w:val="center"/>
-          </w:tcPr>
-          <w:p/>
-        </w:tc>
-        <w:tc>
-          <w:tcPr>
-            <w:tcW w:type="dxa" w:w="988"/>
-            <w:tcMar>
-              <w:top w:type="dxa" w:w="20"/>
-              <w:left w:type="dxa" w:w="60"/>
-              <w:bottom w:type="dxa" w:w="20"/>
-              <w:right w:type="dxa" w:w="40"/>
-            </w:tcMar>
-            <w:vAlign w:val="center"/>
-          </w:tcPr>
-          <w:p/>
-        </w:tc>
-        <w:tc>
-          <w:tcPr>
-            <w:tcW w:type="dxa" w:w="988"/>
-            <w:tcMar>
-              <w:top w:type="dxa" w:w="20"/>
-              <w:left w:type="dxa" w:w="60"/>
-              <w:bottom w:type="dxa" w:w="20"/>
-              <w:right w:type="dxa" w:w="40"/>
-            </w:tcMar>
-            <w:vAlign w:val="center"/>
-          </w:tcPr>
-          <w:p/>
+          <w:p>
+            <w:pPr>
+              <w:spacing w:after="0" w:line="220"/>
+              <w:jc w:val="center"/>
+            </w:pPr>
+            <w:r>
+              <w:rPr>
+                <w:b w:val="false"/>
+                <w:bCs w:val="false"/>
+                <w:color w:val="999999"/>
+                <w:sz w:val="16"/>
+                <w:szCs w:val="16"/>
+              </w:rPr>
+              <w:t xml:space="preserve">XXXXX</w:t>
+            </w:r>
+          </w:p>
+        </w:tc>
+        <w:tc>
+          <w:tcPr>
+            <w:tcW w:type="dxa" w:w="988"/>
+            <w:tcMar>
+              <w:top w:type="dxa" w:w="20"/>
+              <w:left w:type="dxa" w:w="60"/>
+              <w:bottom w:type="dxa" w:w="20"/>
+              <w:right w:type="dxa" w:w="40"/>
+            </w:tcMar>
+            <w:vAlign w:val="center"/>
+          </w:tcPr>
+          <w:p>
+            <w:pPr>
+              <w:spacing w:after="0" w:line="220"/>
+              <w:jc w:val="center"/>
+            </w:pPr>
+            <w:r>
+              <w:rPr>
+                <w:b w:val="false"/>
+                <w:bCs w:val="false"/>
+                <w:color w:val="999999"/>
+                <w:sz w:val="16"/>
+                <w:szCs w:val="16"/>
+              </w:rPr>
+              <w:t xml:space="preserve">XXXXX</w:t>
+            </w:r>
+          </w:p>
+        </w:tc>
+        <w:tc>
+          <w:tcPr>
+            <w:tcW w:type="dxa" w:w="988"/>
+            <w:tcMar>
+              <w:top w:type="dxa" w:w="20"/>
+              <w:left w:type="dxa" w:w="60"/>
+              <w:bottom w:type="dxa" w:w="20"/>
+              <w:right w:type="dxa" w:w="40"/>
+            </w:tcMar>
+            <w:vAlign w:val="center"/>
+          </w:tcPr>
+          <w:p>
+            <w:pPr>
+              <w:spacing w:after="0" w:line="220"/>
+              <w:jc w:val="center"/>
+            </w:pPr>
+            <w:r>
+              <w:rPr>
+                <w:b w:val="false"/>
+                <w:bCs w:val="false"/>
+                <w:color w:val="999999"/>
+                <w:sz w:val="16"/>
+                <w:szCs w:val="16"/>
+              </w:rPr>
+              <w:t xml:space="preserve">XXXXX</w:t>
+            </w:r>
+          </w:p>
+        </w:tc>
+        <w:tc>
+          <w:tcPr>
+            <w:tcW w:type="dxa" w:w="988"/>
+            <w:tcMar>
+              <w:top w:type="dxa" w:w="20"/>
+              <w:left w:type="dxa" w:w="60"/>
+              <w:bottom w:type="dxa" w:w="20"/>
+              <w:right w:type="dxa" w:w="40"/>
+            </w:tcMar>
+            <w:vAlign w:val="center"/>
+          </w:tcPr>
+          <w:p>
+            <w:pPr>
+              <w:spacing w:after="0" w:line="220"/>
+              <w:jc w:val="center"/>
+            </w:pPr>
+            <w:r>
+              <w:rPr>
+                <w:b w:val="false"/>
+                <w:bCs w:val="false"/>
+                <w:color w:val="999999"/>
+                <w:sz w:val="16"/>
+                <w:szCs w:val="16"/>
+              </w:rPr>
+              <w:t xml:space="preserve">XXXXX</w:t>
+            </w:r>
+          </w:p>
+        </w:tc>
+        <w:tc>
+          <w:tcPr>
+            <w:tcW w:type="dxa" w:w="988"/>
+            <w:tcMar>
+              <w:top w:type="dxa" w:w="20"/>
+              <w:left w:type="dxa" w:w="60"/>
+              <w:bottom w:type="dxa" w:w="20"/>
+              <w:right w:type="dxa" w:w="40"/>
+            </w:tcMar>
+            <w:vAlign w:val="center"/>
+          </w:tcPr>
+          <w:p>
+            <w:pPr>
+              <w:spacing w:after="0" w:line="220"/>
+              <w:jc w:val="center"/>
+            </w:pPr>
+            <w:r>
+              <w:rPr>
+                <w:b w:val="false"/>
+                <w:bCs w:val="false"/>
+                <w:color w:val="999999"/>
+                <w:sz w:val="16"/>
+                <w:szCs w:val="16"/>
+              </w:rPr>
+              <w:t xml:space="preserve">XXXXX</w:t>
+            </w:r>
+          </w:p>
         </w:tc>
       </w:tr>
       <w:tr>
@@ -3544,7 +3769,7 @@
                 <w:sz w:val="16"/>
                 <w:szCs w:val="16"/>
               </w:rPr>
-              <w:t xml:space="preserve">12.00</w:t>
+              <w:t xml:space="preserve">12.45</w:t>
             </w:r>
           </w:p>
           <w:p>
@@ -3559,7 +3784,7 @@
                 <w:sz w:val="16"/>
                 <w:szCs w:val="16"/>
               </w:rPr>
-              <w:t xml:space="preserve">12.45</w:t>
+              <w:t xml:space="preserve">13.30</w:t>
             </w:r>
           </w:p>
         </w:tc>
@@ -3975,7 +4200,7 @@
                 <w:sz w:val="16"/>
                 <w:szCs w:val="16"/>
               </w:rPr>
-              <w:t xml:space="preserve">13.00</w:t>
+              <w:t xml:space="preserve">13.45</w:t>
             </w:r>
           </w:p>
         </w:tc>
@@ -5433,7 +5658,21 @@
             </w:tcMar>
             <w:vAlign w:val="center"/>
           </w:tcPr>
-          <w:p/>
+          <w:p>
+            <w:pPr>
+              <w:spacing w:after="0" w:line="220"/>
+              <w:jc w:val="center"/>
+            </w:pPr>
+            <w:r>
+              <w:rPr>
+                <w:b/>
+                <w:bCs/>
+                <w:sz w:val="16"/>
+                <w:szCs w:val="16"/>
+              </w:rPr>
+              <w:t xml:space="preserve">16.00</w:t>
+            </w:r>
+          </w:p>
         </w:tc>
         <w:tc>
           <w:tcPr>
@@ -5488,7 +5727,7 @@
           <w:sz w:val="15"/>
           <w:szCs w:val="15"/>
         </w:rPr>
-        <w:t xml:space="preserve">NC = match à programmer (horaire non communiqué). XXXXX = éliminé du tableau. Relevé AFT du 27/10/2026 ; tableaux Grade 3 (poules) inclus.</w:t>
+        <w:t xml:space="preserve">NC = match à programmer (horaire non communiqué). XXXXX = éliminé du tableau. Relevé AFT du 28/10/2026 ; tableaux Grade 3 (poules) inclus.</w:t>
       </w:r>
     </w:p>
     <w:sectPr>

</xml_diff>

<commit_message>
Matchs Toussaint Gr9-10: releve 28/10 (soir)
- Elimines en poules (XXXXX): Maroussia (Set Wahis 11 G3) et Georges
  (Castle Club 13 G3, desormais totalement sorti).
- Martin (Set Wahis -15 G1): programme jeu 29/10 17h30 (etait NC).

Co-Authored-By: Claude Opus 4.8 <noreply@anthropic.com>
Claude-Session: https://claude.ai/code/session_013WShXcCyBkE1H1x1qzmtZK
</commit_message>
<xml_diff>
--- a/Liste_des_matchs_Toussaint_Gr9-10.docx
+++ b/Liste_des_matchs_Toussaint_Gr9-10.docx
@@ -1582,46 +1582,106 @@
             </w:tcMar>
             <w:vAlign w:val="center"/>
           </w:tcPr>
-          <w:p/>
-        </w:tc>
-        <w:tc>
-          <w:tcPr>
-            <w:tcW w:type="dxa" w:w="988"/>
-            <w:tcMar>
-              <w:top w:type="dxa" w:w="20"/>
-              <w:left w:type="dxa" w:w="60"/>
-              <w:bottom w:type="dxa" w:w="20"/>
-              <w:right w:type="dxa" w:w="40"/>
-            </w:tcMar>
-            <w:vAlign w:val="center"/>
-          </w:tcPr>
-          <w:p/>
-        </w:tc>
-        <w:tc>
-          <w:tcPr>
-            <w:tcW w:type="dxa" w:w="988"/>
-            <w:tcMar>
-              <w:top w:type="dxa" w:w="20"/>
-              <w:left w:type="dxa" w:w="60"/>
-              <w:bottom w:type="dxa" w:w="20"/>
-              <w:right w:type="dxa" w:w="40"/>
-            </w:tcMar>
-            <w:vAlign w:val="center"/>
-          </w:tcPr>
-          <w:p/>
-        </w:tc>
-        <w:tc>
-          <w:tcPr>
-            <w:tcW w:type="dxa" w:w="988"/>
-            <w:tcMar>
-              <w:top w:type="dxa" w:w="20"/>
-              <w:left w:type="dxa" w:w="60"/>
-              <w:bottom w:type="dxa" w:w="20"/>
-              <w:right w:type="dxa" w:w="40"/>
-            </w:tcMar>
-            <w:vAlign w:val="center"/>
-          </w:tcPr>
-          <w:p/>
+          <w:p>
+            <w:pPr>
+              <w:spacing w:after="0" w:line="220"/>
+              <w:jc w:val="center"/>
+            </w:pPr>
+            <w:r>
+              <w:rPr>
+                <w:b w:val="false"/>
+                <w:bCs w:val="false"/>
+                <w:color w:val="999999"/>
+                <w:sz w:val="16"/>
+                <w:szCs w:val="16"/>
+              </w:rPr>
+              <w:t xml:space="preserve">XXXXX</w:t>
+            </w:r>
+          </w:p>
+        </w:tc>
+        <w:tc>
+          <w:tcPr>
+            <w:tcW w:type="dxa" w:w="988"/>
+            <w:tcMar>
+              <w:top w:type="dxa" w:w="20"/>
+              <w:left w:type="dxa" w:w="60"/>
+              <w:bottom w:type="dxa" w:w="20"/>
+              <w:right w:type="dxa" w:w="40"/>
+            </w:tcMar>
+            <w:vAlign w:val="center"/>
+          </w:tcPr>
+          <w:p>
+            <w:pPr>
+              <w:spacing w:after="0" w:line="220"/>
+              <w:jc w:val="center"/>
+            </w:pPr>
+            <w:r>
+              <w:rPr>
+                <w:b w:val="false"/>
+                <w:bCs w:val="false"/>
+                <w:color w:val="999999"/>
+                <w:sz w:val="16"/>
+                <w:szCs w:val="16"/>
+              </w:rPr>
+              <w:t xml:space="preserve">XXXXX</w:t>
+            </w:r>
+          </w:p>
+        </w:tc>
+        <w:tc>
+          <w:tcPr>
+            <w:tcW w:type="dxa" w:w="988"/>
+            <w:tcMar>
+              <w:top w:type="dxa" w:w="20"/>
+              <w:left w:type="dxa" w:w="60"/>
+              <w:bottom w:type="dxa" w:w="20"/>
+              <w:right w:type="dxa" w:w="40"/>
+            </w:tcMar>
+            <w:vAlign w:val="center"/>
+          </w:tcPr>
+          <w:p>
+            <w:pPr>
+              <w:spacing w:after="0" w:line="220"/>
+              <w:jc w:val="center"/>
+            </w:pPr>
+            <w:r>
+              <w:rPr>
+                <w:b w:val="false"/>
+                <w:bCs w:val="false"/>
+                <w:color w:val="999999"/>
+                <w:sz w:val="16"/>
+                <w:szCs w:val="16"/>
+              </w:rPr>
+              <w:t xml:space="preserve">XXXXX</w:t>
+            </w:r>
+          </w:p>
+        </w:tc>
+        <w:tc>
+          <w:tcPr>
+            <w:tcW w:type="dxa" w:w="988"/>
+            <w:tcMar>
+              <w:top w:type="dxa" w:w="20"/>
+              <w:left w:type="dxa" w:w="60"/>
+              <w:bottom w:type="dxa" w:w="20"/>
+              <w:right w:type="dxa" w:w="40"/>
+            </w:tcMar>
+            <w:vAlign w:val="center"/>
+          </w:tcPr>
+          <w:p>
+            <w:pPr>
+              <w:spacing w:after="0" w:line="220"/>
+              <w:jc w:val="center"/>
+            </w:pPr>
+            <w:r>
+              <w:rPr>
+                <w:b w:val="false"/>
+                <w:bCs w:val="false"/>
+                <w:color w:val="999999"/>
+                <w:sz w:val="16"/>
+                <w:szCs w:val="16"/>
+              </w:rPr>
+              <w:t xml:space="preserve">XXXXX</w:t>
+            </w:r>
+          </w:p>
         </w:tc>
       </w:tr>
       <w:tr>
@@ -2332,61 +2392,60 @@
             </w:tcMar>
             <w:vAlign w:val="center"/>
           </w:tcPr>
-          <w:p>
-            <w:pPr>
-              <w:spacing w:after="0" w:line="220"/>
-              <w:jc w:val="center"/>
-            </w:pPr>
-            <w:r>
-              <w:rPr>
-                <w:b w:val="false"/>
-                <w:bCs w:val="false"/>
-                <w:color w:val="C0392B"/>
+          <w:p/>
+        </w:tc>
+        <w:tc>
+          <w:tcPr>
+            <w:tcW w:type="dxa" w:w="988"/>
+            <w:tcMar>
+              <w:top w:type="dxa" w:w="20"/>
+              <w:left w:type="dxa" w:w="60"/>
+              <w:bottom w:type="dxa" w:w="20"/>
+              <w:right w:type="dxa" w:w="40"/>
+            </w:tcMar>
+            <w:vAlign w:val="center"/>
+          </w:tcPr>
+          <w:p/>
+        </w:tc>
+        <w:tc>
+          <w:tcPr>
+            <w:tcW w:type="dxa" w:w="988"/>
+            <w:tcMar>
+              <w:top w:type="dxa" w:w="20"/>
+              <w:left w:type="dxa" w:w="60"/>
+              <w:bottom w:type="dxa" w:w="20"/>
+              <w:right w:type="dxa" w:w="40"/>
+            </w:tcMar>
+            <w:vAlign w:val="center"/>
+          </w:tcPr>
+          <w:p/>
+        </w:tc>
+        <w:tc>
+          <w:tcPr>
+            <w:tcW w:type="dxa" w:w="988"/>
+            <w:tcMar>
+              <w:top w:type="dxa" w:w="20"/>
+              <w:left w:type="dxa" w:w="60"/>
+              <w:bottom w:type="dxa" w:w="20"/>
+              <w:right w:type="dxa" w:w="40"/>
+            </w:tcMar>
+            <w:vAlign w:val="center"/>
+          </w:tcPr>
+          <w:p>
+            <w:pPr>
+              <w:spacing w:after="0" w:line="220"/>
+              <w:jc w:val="center"/>
+            </w:pPr>
+            <w:r>
+              <w:rPr>
+                <w:b/>
+                <w:bCs/>
                 <w:sz w:val="16"/>
                 <w:szCs w:val="16"/>
               </w:rPr>
-              <w:t xml:space="preserve">NC</w:t>
-            </w:r>
-          </w:p>
-        </w:tc>
-        <w:tc>
-          <w:tcPr>
-            <w:tcW w:type="dxa" w:w="988"/>
-            <w:tcMar>
-              <w:top w:type="dxa" w:w="20"/>
-              <w:left w:type="dxa" w:w="60"/>
-              <w:bottom w:type="dxa" w:w="20"/>
-              <w:right w:type="dxa" w:w="40"/>
-            </w:tcMar>
-            <w:vAlign w:val="center"/>
-          </w:tcPr>
-          <w:p/>
-        </w:tc>
-        <w:tc>
-          <w:tcPr>
-            <w:tcW w:type="dxa" w:w="988"/>
-            <w:tcMar>
-              <w:top w:type="dxa" w:w="20"/>
-              <w:left w:type="dxa" w:w="60"/>
-              <w:bottom w:type="dxa" w:w="20"/>
-              <w:right w:type="dxa" w:w="40"/>
-            </w:tcMar>
-            <w:vAlign w:val="center"/>
-          </w:tcPr>
-          <w:p/>
-        </w:tc>
-        <w:tc>
-          <w:tcPr>
-            <w:tcW w:type="dxa" w:w="988"/>
-            <w:tcMar>
-              <w:top w:type="dxa" w:w="20"/>
-              <w:left w:type="dxa" w:w="60"/>
-              <w:bottom w:type="dxa" w:w="20"/>
-              <w:right w:type="dxa" w:w="40"/>
-            </w:tcMar>
-            <w:vAlign w:val="center"/>
-          </w:tcPr>
-          <w:p/>
+              <w:t xml:space="preserve">17.30</w:t>
+            </w:r>
+          </w:p>
         </w:tc>
         <w:tc>
           <w:tcPr>
@@ -3799,46 +3858,106 @@
             </w:tcMar>
             <w:vAlign w:val="center"/>
           </w:tcPr>
-          <w:p/>
-        </w:tc>
-        <w:tc>
-          <w:tcPr>
-            <w:tcW w:type="dxa" w:w="988"/>
-            <w:tcMar>
-              <w:top w:type="dxa" w:w="20"/>
-              <w:left w:type="dxa" w:w="60"/>
-              <w:bottom w:type="dxa" w:w="20"/>
-              <w:right w:type="dxa" w:w="40"/>
-            </w:tcMar>
-            <w:vAlign w:val="center"/>
-          </w:tcPr>
-          <w:p/>
-        </w:tc>
-        <w:tc>
-          <w:tcPr>
-            <w:tcW w:type="dxa" w:w="988"/>
-            <w:tcMar>
-              <w:top w:type="dxa" w:w="20"/>
-              <w:left w:type="dxa" w:w="60"/>
-              <w:bottom w:type="dxa" w:w="20"/>
-              <w:right w:type="dxa" w:w="40"/>
-            </w:tcMar>
-            <w:vAlign w:val="center"/>
-          </w:tcPr>
-          <w:p/>
-        </w:tc>
-        <w:tc>
-          <w:tcPr>
-            <w:tcW w:type="dxa" w:w="988"/>
-            <w:tcMar>
-              <w:top w:type="dxa" w:w="20"/>
-              <w:left w:type="dxa" w:w="60"/>
-              <w:bottom w:type="dxa" w:w="20"/>
-              <w:right w:type="dxa" w:w="40"/>
-            </w:tcMar>
-            <w:vAlign w:val="center"/>
-          </w:tcPr>
-          <w:p/>
+          <w:p>
+            <w:pPr>
+              <w:spacing w:after="0" w:line="220"/>
+              <w:jc w:val="center"/>
+            </w:pPr>
+            <w:r>
+              <w:rPr>
+                <w:b w:val="false"/>
+                <w:bCs w:val="false"/>
+                <w:color w:val="999999"/>
+                <w:sz w:val="16"/>
+                <w:szCs w:val="16"/>
+              </w:rPr>
+              <w:t xml:space="preserve">XXXXX</w:t>
+            </w:r>
+          </w:p>
+        </w:tc>
+        <w:tc>
+          <w:tcPr>
+            <w:tcW w:type="dxa" w:w="988"/>
+            <w:tcMar>
+              <w:top w:type="dxa" w:w="20"/>
+              <w:left w:type="dxa" w:w="60"/>
+              <w:bottom w:type="dxa" w:w="20"/>
+              <w:right w:type="dxa" w:w="40"/>
+            </w:tcMar>
+            <w:vAlign w:val="center"/>
+          </w:tcPr>
+          <w:p>
+            <w:pPr>
+              <w:spacing w:after="0" w:line="220"/>
+              <w:jc w:val="center"/>
+            </w:pPr>
+            <w:r>
+              <w:rPr>
+                <w:b w:val="false"/>
+                <w:bCs w:val="false"/>
+                <w:color w:val="999999"/>
+                <w:sz w:val="16"/>
+                <w:szCs w:val="16"/>
+              </w:rPr>
+              <w:t xml:space="preserve">XXXXX</w:t>
+            </w:r>
+          </w:p>
+        </w:tc>
+        <w:tc>
+          <w:tcPr>
+            <w:tcW w:type="dxa" w:w="988"/>
+            <w:tcMar>
+              <w:top w:type="dxa" w:w="20"/>
+              <w:left w:type="dxa" w:w="60"/>
+              <w:bottom w:type="dxa" w:w="20"/>
+              <w:right w:type="dxa" w:w="40"/>
+            </w:tcMar>
+            <w:vAlign w:val="center"/>
+          </w:tcPr>
+          <w:p>
+            <w:pPr>
+              <w:spacing w:after="0" w:line="220"/>
+              <w:jc w:val="center"/>
+            </w:pPr>
+            <w:r>
+              <w:rPr>
+                <w:b w:val="false"/>
+                <w:bCs w:val="false"/>
+                <w:color w:val="999999"/>
+                <w:sz w:val="16"/>
+                <w:szCs w:val="16"/>
+              </w:rPr>
+              <w:t xml:space="preserve">XXXXX</w:t>
+            </w:r>
+          </w:p>
+        </w:tc>
+        <w:tc>
+          <w:tcPr>
+            <w:tcW w:type="dxa" w:w="988"/>
+            <w:tcMar>
+              <w:top w:type="dxa" w:w="20"/>
+              <w:left w:type="dxa" w:w="60"/>
+              <w:bottom w:type="dxa" w:w="20"/>
+              <w:right w:type="dxa" w:w="40"/>
+            </w:tcMar>
+            <w:vAlign w:val="center"/>
+          </w:tcPr>
+          <w:p>
+            <w:pPr>
+              <w:spacing w:after="0" w:line="220"/>
+              <w:jc w:val="center"/>
+            </w:pPr>
+            <w:r>
+              <w:rPr>
+                <w:b w:val="false"/>
+                <w:bCs w:val="false"/>
+                <w:color w:val="999999"/>
+                <w:sz w:val="16"/>
+                <w:szCs w:val="16"/>
+              </w:rPr>
+              <w:t xml:space="preserve">XXXXX</w:t>
+            </w:r>
+          </w:p>
         </w:tc>
       </w:tr>
       <w:tr>

</xml_diff>

<commit_message>
Matchs Toussaint Gr9-10: releve 29/10 (jeudi)
Horaires confirmes: Thibault (Set Wahis 11.1) jeu 16h30; Florentin (Castle
11.2) jeu 10h30; Maxim B. (Set Wahis M4) jeu 16h00 + Oree gagne mer, ven
15h30; Kalina Oree gagne mer -> jeu 14h00 + Set Wahis D1 ven 18h30.
Pas de nouvelle elimination.

Co-Authored-By: Claude Opus 4.8 <noreply@anthropic.com>
Claude-Session: https://claude.ai/code/session_013WShXcCyBkE1H1x1qzmtZK
</commit_message>
<xml_diff>
--- a/Liste_des_matchs_Toussaint_Gr9-10.docx
+++ b/Liste_des_matchs_Toussaint_Gr9-10.docx
@@ -1350,61 +1350,60 @@
             </w:tcMar>
             <w:vAlign w:val="center"/>
           </w:tcPr>
-          <w:p>
-            <w:pPr>
-              <w:spacing w:after="0" w:line="220"/>
-              <w:jc w:val="center"/>
-            </w:pPr>
-            <w:r>
-              <w:rPr>
-                <w:b w:val="false"/>
-                <w:bCs w:val="false"/>
-                <w:color w:val="C0392B"/>
-                <w:sz w:val="16"/>
-                <w:szCs w:val="16"/>
-              </w:rPr>
-              <w:t xml:space="preserve">NC</w:t>
-            </w:r>
-          </w:p>
-        </w:tc>
-        <w:tc>
-          <w:tcPr>
-            <w:tcW w:type="dxa" w:w="988"/>
-            <w:tcMar>
-              <w:top w:type="dxa" w:w="20"/>
-              <w:left w:type="dxa" w:w="60"/>
-              <w:bottom w:type="dxa" w:w="20"/>
-              <w:right w:type="dxa" w:w="40"/>
-            </w:tcMar>
-            <w:vAlign w:val="center"/>
-          </w:tcPr>
-          <w:p/>
-        </w:tc>
-        <w:tc>
-          <w:tcPr>
-            <w:tcW w:type="dxa" w:w="988"/>
-            <w:tcMar>
-              <w:top w:type="dxa" w:w="20"/>
-              <w:left w:type="dxa" w:w="60"/>
-              <w:bottom w:type="dxa" w:w="20"/>
-              <w:right w:type="dxa" w:w="40"/>
-            </w:tcMar>
-            <w:vAlign w:val="center"/>
-          </w:tcPr>
-          <w:p/>
-        </w:tc>
-        <w:tc>
-          <w:tcPr>
-            <w:tcW w:type="dxa" w:w="988"/>
-            <w:tcMar>
-              <w:top w:type="dxa" w:w="20"/>
-              <w:left w:type="dxa" w:w="60"/>
-              <w:bottom w:type="dxa" w:w="20"/>
-              <w:right w:type="dxa" w:w="40"/>
-            </w:tcMar>
-            <w:vAlign w:val="center"/>
-          </w:tcPr>
-          <w:p/>
+          <w:p/>
+        </w:tc>
+        <w:tc>
+          <w:tcPr>
+            <w:tcW w:type="dxa" w:w="988"/>
+            <w:tcMar>
+              <w:top w:type="dxa" w:w="20"/>
+              <w:left w:type="dxa" w:w="60"/>
+              <w:bottom w:type="dxa" w:w="20"/>
+              <w:right w:type="dxa" w:w="40"/>
+            </w:tcMar>
+            <w:vAlign w:val="center"/>
+          </w:tcPr>
+          <w:p/>
+        </w:tc>
+        <w:tc>
+          <w:tcPr>
+            <w:tcW w:type="dxa" w:w="988"/>
+            <w:tcMar>
+              <w:top w:type="dxa" w:w="20"/>
+              <w:left w:type="dxa" w:w="60"/>
+              <w:bottom w:type="dxa" w:w="20"/>
+              <w:right w:type="dxa" w:w="40"/>
+            </w:tcMar>
+            <w:vAlign w:val="center"/>
+          </w:tcPr>
+          <w:p/>
+        </w:tc>
+        <w:tc>
+          <w:tcPr>
+            <w:tcW w:type="dxa" w:w="988"/>
+            <w:tcMar>
+              <w:top w:type="dxa" w:w="20"/>
+              <w:left w:type="dxa" w:w="60"/>
+              <w:bottom w:type="dxa" w:w="20"/>
+              <w:right w:type="dxa" w:w="40"/>
+            </w:tcMar>
+            <w:vAlign w:val="center"/>
+          </w:tcPr>
+          <w:p>
+            <w:pPr>
+              <w:spacing w:after="0" w:line="220"/>
+              <w:jc w:val="center"/>
+            </w:pPr>
+            <w:r>
+              <w:rPr>
+                <w:b/>
+                <w:bCs/>
+                <w:sz w:val="16"/>
+                <w:szCs w:val="16"/>
+              </w:rPr>
+              <w:t xml:space="preserve">16.30</w:t>
+            </w:r>
+          </w:p>
         </w:tc>
         <w:tc>
           <w:tcPr>
@@ -2228,61 +2227,60 @@
             </w:tcMar>
             <w:vAlign w:val="center"/>
           </w:tcPr>
-          <w:p>
-            <w:pPr>
-              <w:spacing w:after="0" w:line="220"/>
-              <w:jc w:val="center"/>
-            </w:pPr>
-            <w:r>
-              <w:rPr>
-                <w:b w:val="false"/>
-                <w:bCs w:val="false"/>
-                <w:color w:val="C0392B"/>
-                <w:sz w:val="16"/>
-                <w:szCs w:val="16"/>
-              </w:rPr>
-              <w:t xml:space="preserve">NC</w:t>
-            </w:r>
-          </w:p>
-        </w:tc>
-        <w:tc>
-          <w:tcPr>
-            <w:tcW w:type="dxa" w:w="988"/>
-            <w:tcMar>
-              <w:top w:type="dxa" w:w="20"/>
-              <w:left w:type="dxa" w:w="60"/>
-              <w:bottom w:type="dxa" w:w="20"/>
-              <w:right w:type="dxa" w:w="40"/>
-            </w:tcMar>
-            <w:vAlign w:val="center"/>
-          </w:tcPr>
-          <w:p/>
-        </w:tc>
-        <w:tc>
-          <w:tcPr>
-            <w:tcW w:type="dxa" w:w="988"/>
-            <w:tcMar>
-              <w:top w:type="dxa" w:w="20"/>
-              <w:left w:type="dxa" w:w="60"/>
-              <w:bottom w:type="dxa" w:w="20"/>
-              <w:right w:type="dxa" w:w="40"/>
-            </w:tcMar>
-            <w:vAlign w:val="center"/>
-          </w:tcPr>
-          <w:p/>
-        </w:tc>
-        <w:tc>
-          <w:tcPr>
-            <w:tcW w:type="dxa" w:w="988"/>
-            <w:tcMar>
-              <w:top w:type="dxa" w:w="20"/>
-              <w:left w:type="dxa" w:w="60"/>
-              <w:bottom w:type="dxa" w:w="20"/>
-              <w:right w:type="dxa" w:w="40"/>
-            </w:tcMar>
-            <w:vAlign w:val="center"/>
-          </w:tcPr>
-          <w:p/>
+          <w:p/>
+        </w:tc>
+        <w:tc>
+          <w:tcPr>
+            <w:tcW w:type="dxa" w:w="988"/>
+            <w:tcMar>
+              <w:top w:type="dxa" w:w="20"/>
+              <w:left w:type="dxa" w:w="60"/>
+              <w:bottom w:type="dxa" w:w="20"/>
+              <w:right w:type="dxa" w:w="40"/>
+            </w:tcMar>
+            <w:vAlign w:val="center"/>
+          </w:tcPr>
+          <w:p/>
+        </w:tc>
+        <w:tc>
+          <w:tcPr>
+            <w:tcW w:type="dxa" w:w="988"/>
+            <w:tcMar>
+              <w:top w:type="dxa" w:w="20"/>
+              <w:left w:type="dxa" w:w="60"/>
+              <w:bottom w:type="dxa" w:w="20"/>
+              <w:right w:type="dxa" w:w="40"/>
+            </w:tcMar>
+            <w:vAlign w:val="center"/>
+          </w:tcPr>
+          <w:p/>
+        </w:tc>
+        <w:tc>
+          <w:tcPr>
+            <w:tcW w:type="dxa" w:w="988"/>
+            <w:tcMar>
+              <w:top w:type="dxa" w:w="20"/>
+              <w:left w:type="dxa" w:w="60"/>
+              <w:bottom w:type="dxa" w:w="20"/>
+              <w:right w:type="dxa" w:w="40"/>
+            </w:tcMar>
+            <w:vAlign w:val="center"/>
+          </w:tcPr>
+          <w:p>
+            <w:pPr>
+              <w:spacing w:after="0" w:line="220"/>
+              <w:jc w:val="center"/>
+            </w:pPr>
+            <w:r>
+              <w:rPr>
+                <w:b/>
+                <w:bCs/>
+                <w:sz w:val="16"/>
+                <w:szCs w:val="16"/>
+              </w:rPr>
+              <w:t xml:space="preserve">16.00</w:t>
+            </w:r>
+          </w:p>
         </w:tc>
         <w:tc>
           <w:tcPr>
@@ -2896,74 +2894,73 @@
             </w:tcMar>
             <w:vAlign w:val="center"/>
           </w:tcPr>
-          <w:p>
-            <w:pPr>
-              <w:spacing w:after="0" w:line="220"/>
-              <w:jc w:val="center"/>
-            </w:pPr>
-            <w:r>
-              <w:rPr>
-                <w:b w:val="false"/>
-                <w:bCs w:val="false"/>
-                <w:color w:val="C0392B"/>
-                <w:sz w:val="16"/>
-                <w:szCs w:val="16"/>
-              </w:rPr>
-              <w:t xml:space="preserve">NC</w:t>
-            </w:r>
-          </w:p>
-        </w:tc>
-        <w:tc>
-          <w:tcPr>
-            <w:tcW w:type="dxa" w:w="988"/>
-            <w:tcMar>
-              <w:top w:type="dxa" w:w="20"/>
-              <w:left w:type="dxa" w:w="60"/>
-              <w:bottom w:type="dxa" w:w="20"/>
-              <w:right w:type="dxa" w:w="40"/>
-            </w:tcMar>
-            <w:vAlign w:val="center"/>
-          </w:tcPr>
-          <w:p/>
-        </w:tc>
-        <w:tc>
-          <w:tcPr>
-            <w:tcW w:type="dxa" w:w="988"/>
-            <w:tcMar>
-              <w:top w:type="dxa" w:w="20"/>
-              <w:left w:type="dxa" w:w="60"/>
-              <w:bottom w:type="dxa" w:w="20"/>
-              <w:right w:type="dxa" w:w="40"/>
-            </w:tcMar>
-            <w:vAlign w:val="center"/>
-          </w:tcPr>
-          <w:p/>
-        </w:tc>
-        <w:tc>
-          <w:tcPr>
-            <w:tcW w:type="dxa" w:w="988"/>
-            <w:tcMar>
-              <w:top w:type="dxa" w:w="20"/>
-              <w:left w:type="dxa" w:w="60"/>
-              <w:bottom w:type="dxa" w:w="20"/>
-              <w:right w:type="dxa" w:w="40"/>
-            </w:tcMar>
-            <w:vAlign w:val="center"/>
-          </w:tcPr>
-          <w:p/>
-        </w:tc>
-        <w:tc>
-          <w:tcPr>
-            <w:tcW w:type="dxa" w:w="988"/>
-            <w:tcMar>
-              <w:top w:type="dxa" w:w="20"/>
-              <w:left w:type="dxa" w:w="60"/>
-              <w:bottom w:type="dxa" w:w="20"/>
-              <w:right w:type="dxa" w:w="40"/>
-            </w:tcMar>
-            <w:vAlign w:val="center"/>
-          </w:tcPr>
-          <w:p/>
+          <w:p/>
+        </w:tc>
+        <w:tc>
+          <w:tcPr>
+            <w:tcW w:type="dxa" w:w="988"/>
+            <w:tcMar>
+              <w:top w:type="dxa" w:w="20"/>
+              <w:left w:type="dxa" w:w="60"/>
+              <w:bottom w:type="dxa" w:w="20"/>
+              <w:right w:type="dxa" w:w="40"/>
+            </w:tcMar>
+            <w:vAlign w:val="center"/>
+          </w:tcPr>
+          <w:p/>
+        </w:tc>
+        <w:tc>
+          <w:tcPr>
+            <w:tcW w:type="dxa" w:w="988"/>
+            <w:tcMar>
+              <w:top w:type="dxa" w:w="20"/>
+              <w:left w:type="dxa" w:w="60"/>
+              <w:bottom w:type="dxa" w:w="20"/>
+              <w:right w:type="dxa" w:w="40"/>
+            </w:tcMar>
+            <w:vAlign w:val="center"/>
+          </w:tcPr>
+          <w:p/>
+        </w:tc>
+        <w:tc>
+          <w:tcPr>
+            <w:tcW w:type="dxa" w:w="988"/>
+            <w:tcMar>
+              <w:top w:type="dxa" w:w="20"/>
+              <w:left w:type="dxa" w:w="60"/>
+              <w:bottom w:type="dxa" w:w="20"/>
+              <w:right w:type="dxa" w:w="40"/>
+            </w:tcMar>
+            <w:vAlign w:val="center"/>
+          </w:tcPr>
+          <w:p/>
+        </w:tc>
+        <w:tc>
+          <w:tcPr>
+            <w:tcW w:type="dxa" w:w="988"/>
+            <w:tcMar>
+              <w:top w:type="dxa" w:w="20"/>
+              <w:left w:type="dxa" w:w="60"/>
+              <w:bottom w:type="dxa" w:w="20"/>
+              <w:right w:type="dxa" w:w="40"/>
+            </w:tcMar>
+            <w:vAlign w:val="center"/>
+          </w:tcPr>
+          <w:p>
+            <w:pPr>
+              <w:spacing w:after="0" w:line="220"/>
+              <w:jc w:val="center"/>
+            </w:pPr>
+            <w:r>
+              <w:rPr>
+                <w:b/>
+                <w:bCs/>
+                <w:sz w:val="16"/>
+                <w:szCs w:val="16"/>
+              </w:rPr>
+              <w:t xml:space="preserve">18.30</w:t>
+            </w:r>
+          </w:p>
         </w:tc>
         <w:tc>
           <w:tcPr>
@@ -3425,7 +3422,7 @@
                 <w:sz w:val="16"/>
                 <w:szCs w:val="16"/>
               </w:rPr>
-              <w:t xml:space="preserve">10.00</w:t>
+              <w:t xml:space="preserve">10.30</w:t>
             </w:r>
           </w:p>
         </w:tc>
@@ -4824,7 +4821,21 @@
             </w:tcMar>
             <w:vAlign w:val="center"/>
           </w:tcPr>
-          <w:p/>
+          <w:p>
+            <w:pPr>
+              <w:spacing w:after="0" w:line="220"/>
+              <w:jc w:val="center"/>
+            </w:pPr>
+            <w:r>
+              <w:rPr>
+                <w:b/>
+                <w:bCs/>
+                <w:sz w:val="16"/>
+                <w:szCs w:val="16"/>
+              </w:rPr>
+              <w:t xml:space="preserve">15.30</w:t>
+            </w:r>
+          </w:p>
         </w:tc>
         <w:tc>
           <w:tcPr>
@@ -5300,7 +5311,21 @@
             </w:tcMar>
             <w:vAlign w:val="center"/>
           </w:tcPr>
-          <w:p/>
+          <w:p>
+            <w:pPr>
+              <w:spacing w:after="0" w:line="220"/>
+              <w:jc w:val="center"/>
+            </w:pPr>
+            <w:r>
+              <w:rPr>
+                <w:b/>
+                <w:bCs/>
+                <w:sz w:val="16"/>
+                <w:szCs w:val="16"/>
+              </w:rPr>
+              <w:t xml:space="preserve">14.00</w:t>
+            </w:r>
+          </w:p>
         </w:tc>
         <w:tc>
           <w:tcPr>
@@ -5846,7 +5871,7 @@
           <w:sz w:val="15"/>
           <w:szCs w:val="15"/>
         </w:rPr>
-        <w:t xml:space="preserve">NC = match à programmer (horaire non communiqué). XXXXX = éliminé du tableau. Relevé AFT du 28/10/2026 ; tableaux Grade 3 (poules) inclus.</w:t>
+        <w:t xml:space="preserve">NC = match à programmer (horaire non communiqué). XXXXX = éliminé du tableau. Relevé AFT du 29/10/2026 ; tableaux Grade 3 (poules) inclus.</w:t>
       </w:r>
     </w:p>
     <w:sectPr>

</xml_diff>

<commit_message>
Matchs Toussaint Gr9-10: releve 29/10 (soir) - resultats jeudi + vendredi
Elimines (XXXXX): Maxim B. (Set Wahis M4, reste en Oree), Kalina (Oree D1,
reste en Set Wahis). Qualifies: Thibault (Le Parc sam 11h00), Florentin
(Castle ven 12h00), Vytautas (Oree ven 13h30), Gaspard (Castle ven 13h15,
Primerose ven 16h30). Thibault Set Wahis 11.1 jeu 17h00.

Co-Authored-By: Claude Opus 4.8 <noreply@anthropic.com>
Claude-Session: https://claude.ai/code/session_013WShXcCyBkE1H1x1qzmtZK
</commit_message>
<xml_diff>
--- a/Liste_des_matchs_Toussaint_Gr9-10.docx
+++ b/Liste_des_matchs_Toussaint_Gr9-10.docx
@@ -551,7 +551,21 @@
             </w:tcMar>
             <w:vAlign w:val="center"/>
           </w:tcPr>
-          <w:p/>
+          <w:p>
+            <w:pPr>
+              <w:spacing w:after="0" w:line="220"/>
+              <w:jc w:val="center"/>
+            </w:pPr>
+            <w:r>
+              <w:rPr>
+                <w:b/>
+                <w:bCs/>
+                <w:sz w:val="16"/>
+                <w:szCs w:val="16"/>
+              </w:rPr>
+              <w:t xml:space="preserve">11.00</w:t>
+            </w:r>
+          </w:p>
         </w:tc>
         <w:tc>
           <w:tcPr>
@@ -1401,7 +1415,7 @@
                 <w:sz w:val="16"/>
                 <w:szCs w:val="16"/>
               </w:rPr>
-              <w:t xml:space="preserve">16.30</w:t>
+              <w:t xml:space="preserve">17.00</w:t>
             </w:r>
           </w:p>
         </w:tc>
@@ -2293,33 +2307,78 @@
             </w:tcMar>
             <w:vAlign w:val="center"/>
           </w:tcPr>
-          <w:p/>
-        </w:tc>
-        <w:tc>
-          <w:tcPr>
-            <w:tcW w:type="dxa" w:w="988"/>
-            <w:tcMar>
-              <w:top w:type="dxa" w:w="20"/>
-              <w:left w:type="dxa" w:w="60"/>
-              <w:bottom w:type="dxa" w:w="20"/>
-              <w:right w:type="dxa" w:w="40"/>
-            </w:tcMar>
-            <w:vAlign w:val="center"/>
-          </w:tcPr>
-          <w:p/>
-        </w:tc>
-        <w:tc>
-          <w:tcPr>
-            <w:tcW w:type="dxa" w:w="988"/>
-            <w:tcMar>
-              <w:top w:type="dxa" w:w="20"/>
-              <w:left w:type="dxa" w:w="60"/>
-              <w:bottom w:type="dxa" w:w="20"/>
-              <w:right w:type="dxa" w:w="40"/>
-            </w:tcMar>
-            <w:vAlign w:val="center"/>
-          </w:tcPr>
-          <w:p/>
+          <w:p>
+            <w:pPr>
+              <w:spacing w:after="0" w:line="220"/>
+              <w:jc w:val="center"/>
+            </w:pPr>
+            <w:r>
+              <w:rPr>
+                <w:b w:val="false"/>
+                <w:bCs w:val="false"/>
+                <w:color w:val="999999"/>
+                <w:sz w:val="16"/>
+                <w:szCs w:val="16"/>
+              </w:rPr>
+              <w:t xml:space="preserve">XXXXX</w:t>
+            </w:r>
+          </w:p>
+        </w:tc>
+        <w:tc>
+          <w:tcPr>
+            <w:tcW w:type="dxa" w:w="988"/>
+            <w:tcMar>
+              <w:top w:type="dxa" w:w="20"/>
+              <w:left w:type="dxa" w:w="60"/>
+              <w:bottom w:type="dxa" w:w="20"/>
+              <w:right w:type="dxa" w:w="40"/>
+            </w:tcMar>
+            <w:vAlign w:val="center"/>
+          </w:tcPr>
+          <w:p>
+            <w:pPr>
+              <w:spacing w:after="0" w:line="220"/>
+              <w:jc w:val="center"/>
+            </w:pPr>
+            <w:r>
+              <w:rPr>
+                <w:b w:val="false"/>
+                <w:bCs w:val="false"/>
+                <w:color w:val="999999"/>
+                <w:sz w:val="16"/>
+                <w:szCs w:val="16"/>
+              </w:rPr>
+              <w:t xml:space="preserve">XXXXX</w:t>
+            </w:r>
+          </w:p>
+        </w:tc>
+        <w:tc>
+          <w:tcPr>
+            <w:tcW w:type="dxa" w:w="988"/>
+            <w:tcMar>
+              <w:top w:type="dxa" w:w="20"/>
+              <w:left w:type="dxa" w:w="60"/>
+              <w:bottom w:type="dxa" w:w="20"/>
+              <w:right w:type="dxa" w:w="40"/>
+            </w:tcMar>
+            <w:vAlign w:val="center"/>
+          </w:tcPr>
+          <w:p>
+            <w:pPr>
+              <w:spacing w:after="0" w:line="220"/>
+              <w:jc w:val="center"/>
+            </w:pPr>
+            <w:r>
+              <w:rPr>
+                <w:b w:val="false"/>
+                <w:bCs w:val="false"/>
+                <w:color w:val="999999"/>
+                <w:sz w:val="16"/>
+                <w:szCs w:val="16"/>
+              </w:rPr>
+              <w:t xml:space="preserve">XXXXX</w:t>
+            </w:r>
+          </w:p>
         </w:tc>
       </w:tr>
       <w:tr>
@@ -3437,7 +3496,21 @@
             </w:tcMar>
             <w:vAlign w:val="center"/>
           </w:tcPr>
-          <w:p/>
+          <w:p>
+            <w:pPr>
+              <w:spacing w:after="0" w:line="220"/>
+              <w:jc w:val="center"/>
+            </w:pPr>
+            <w:r>
+              <w:rPr>
+                <w:b/>
+                <w:bCs/>
+                <w:sz w:val="16"/>
+                <w:szCs w:val="16"/>
+              </w:rPr>
+              <w:t xml:space="preserve">12.00</w:t>
+            </w:r>
+          </w:p>
         </w:tc>
         <w:tc>
           <w:tcPr>
@@ -4344,7 +4417,21 @@
             </w:tcMar>
             <w:vAlign w:val="center"/>
           </w:tcPr>
-          <w:p/>
+          <w:p>
+            <w:pPr>
+              <w:spacing w:after="0" w:line="220"/>
+              <w:jc w:val="center"/>
+            </w:pPr>
+            <w:r>
+              <w:rPr>
+                <w:b/>
+                <w:bCs/>
+                <w:sz w:val="16"/>
+                <w:szCs w:val="16"/>
+              </w:rPr>
+              <w:t xml:space="preserve">13.15</w:t>
+            </w:r>
+          </w:p>
         </w:tc>
         <w:tc>
           <w:tcPr>
@@ -5161,7 +5248,21 @@
             </w:tcMar>
             <w:vAlign w:val="center"/>
           </w:tcPr>
-          <w:p/>
+          <w:p>
+            <w:pPr>
+              <w:spacing w:after="0" w:line="220"/>
+              <w:jc w:val="center"/>
+            </w:pPr>
+            <w:r>
+              <w:rPr>
+                <w:b/>
+                <w:bCs/>
+                <w:sz w:val="16"/>
+                <w:szCs w:val="16"/>
+              </w:rPr>
+              <w:t xml:space="preserve">13.30</w:t>
+            </w:r>
+          </w:p>
         </w:tc>
         <w:tc>
           <w:tcPr>
@@ -5338,33 +5439,78 @@
             </w:tcMar>
             <w:vAlign w:val="center"/>
           </w:tcPr>
-          <w:p/>
-        </w:tc>
-        <w:tc>
-          <w:tcPr>
-            <w:tcW w:type="dxa" w:w="988"/>
-            <w:tcMar>
-              <w:top w:type="dxa" w:w="20"/>
-              <w:left w:type="dxa" w:w="60"/>
-              <w:bottom w:type="dxa" w:w="20"/>
-              <w:right w:type="dxa" w:w="40"/>
-            </w:tcMar>
-            <w:vAlign w:val="center"/>
-          </w:tcPr>
-          <w:p/>
-        </w:tc>
-        <w:tc>
-          <w:tcPr>
-            <w:tcW w:type="dxa" w:w="988"/>
-            <w:tcMar>
-              <w:top w:type="dxa" w:w="20"/>
-              <w:left w:type="dxa" w:w="60"/>
-              <w:bottom w:type="dxa" w:w="20"/>
-              <w:right w:type="dxa" w:w="40"/>
-            </w:tcMar>
-            <w:vAlign w:val="center"/>
-          </w:tcPr>
-          <w:p/>
+          <w:p>
+            <w:pPr>
+              <w:spacing w:after="0" w:line="220"/>
+              <w:jc w:val="center"/>
+            </w:pPr>
+            <w:r>
+              <w:rPr>
+                <w:b w:val="false"/>
+                <w:bCs w:val="false"/>
+                <w:color w:val="999999"/>
+                <w:sz w:val="16"/>
+                <w:szCs w:val="16"/>
+              </w:rPr>
+              <w:t xml:space="preserve">XXXXX</w:t>
+            </w:r>
+          </w:p>
+        </w:tc>
+        <w:tc>
+          <w:tcPr>
+            <w:tcW w:type="dxa" w:w="988"/>
+            <w:tcMar>
+              <w:top w:type="dxa" w:w="20"/>
+              <w:left w:type="dxa" w:w="60"/>
+              <w:bottom w:type="dxa" w:w="20"/>
+              <w:right w:type="dxa" w:w="40"/>
+            </w:tcMar>
+            <w:vAlign w:val="center"/>
+          </w:tcPr>
+          <w:p>
+            <w:pPr>
+              <w:spacing w:after="0" w:line="220"/>
+              <w:jc w:val="center"/>
+            </w:pPr>
+            <w:r>
+              <w:rPr>
+                <w:b w:val="false"/>
+                <w:bCs w:val="false"/>
+                <w:color w:val="999999"/>
+                <w:sz w:val="16"/>
+                <w:szCs w:val="16"/>
+              </w:rPr>
+              <w:t xml:space="preserve">XXXXX</w:t>
+            </w:r>
+          </w:p>
+        </w:tc>
+        <w:tc>
+          <w:tcPr>
+            <w:tcW w:type="dxa" w:w="988"/>
+            <w:tcMar>
+              <w:top w:type="dxa" w:w="20"/>
+              <w:left w:type="dxa" w:w="60"/>
+              <w:bottom w:type="dxa" w:w="20"/>
+              <w:right w:type="dxa" w:w="40"/>
+            </w:tcMar>
+            <w:vAlign w:val="center"/>
+          </w:tcPr>
+          <w:p>
+            <w:pPr>
+              <w:spacing w:after="0" w:line="220"/>
+              <w:jc w:val="center"/>
+            </w:pPr>
+            <w:r>
+              <w:rPr>
+                <w:b w:val="false"/>
+                <w:bCs w:val="false"/>
+                <w:color w:val="999999"/>
+                <w:sz w:val="16"/>
+                <w:szCs w:val="16"/>
+              </w:rPr>
+              <w:t xml:space="preserve">XXXXX</w:t>
+            </w:r>
+          </w:p>
         </w:tc>
       </w:tr>
     </w:tbl>
@@ -5829,7 +5975,21 @@
             </w:tcMar>
             <w:vAlign w:val="center"/>
           </w:tcPr>
-          <w:p/>
+          <w:p>
+            <w:pPr>
+              <w:spacing w:after="0" w:line="220"/>
+              <w:jc w:val="center"/>
+            </w:pPr>
+            <w:r>
+              <w:rPr>
+                <w:b/>
+                <w:bCs/>
+                <w:sz w:val="16"/>
+                <w:szCs w:val="16"/>
+              </w:rPr>
+              <w:t xml:space="preserve">16.30</w:t>
+            </w:r>
+          </w:p>
         </w:tc>
         <w:tc>
           <w:tcPr>

</xml_diff>

<commit_message>
Matchs Toussaint Gr9-10: releve 30/10 (vendredi) + week-end
Elimines (XXXXX): Thibault (Set Wahis 11.1, reste au Parc), Florentin
(Castle, sorti), Martin (Set Wahis -15.1, reste en Oree), Gaspard
(Primerose, reste en Castle). Qualifies week-end: Maxim B. (Oree sam 10h),
Vytautas (Oree sam 16h), Kalina (Set Wahis sam 15h), Gaspard (Castle dim
10h), Thibault & Maxim G. (Le Parc sam).

Co-Authored-By: Claude Opus 4.8 <noreply@anthropic.com>
Claude-Session: https://claude.ai/code/session_013WShXcCyBkE1H1x1qzmtZK
</commit_message>
<xml_diff>
--- a/Liste_des_matchs_Toussaint_Gr9-10.docx
+++ b/Liste_des_matchs_Toussaint_Gr9-10.docx
@@ -1430,33 +1430,78 @@
             </w:tcMar>
             <w:vAlign w:val="center"/>
           </w:tcPr>
-          <w:p/>
-        </w:tc>
-        <w:tc>
-          <w:tcPr>
-            <w:tcW w:type="dxa" w:w="988"/>
-            <w:tcMar>
-              <w:top w:type="dxa" w:w="20"/>
-              <w:left w:type="dxa" w:w="60"/>
-              <w:bottom w:type="dxa" w:w="20"/>
-              <w:right w:type="dxa" w:w="40"/>
-            </w:tcMar>
-            <w:vAlign w:val="center"/>
-          </w:tcPr>
-          <w:p/>
-        </w:tc>
-        <w:tc>
-          <w:tcPr>
-            <w:tcW w:type="dxa" w:w="988"/>
-            <w:tcMar>
-              <w:top w:type="dxa" w:w="20"/>
-              <w:left w:type="dxa" w:w="60"/>
-              <w:bottom w:type="dxa" w:w="20"/>
-              <w:right w:type="dxa" w:w="40"/>
-            </w:tcMar>
-            <w:vAlign w:val="center"/>
-          </w:tcPr>
-          <w:p/>
+          <w:p>
+            <w:pPr>
+              <w:spacing w:after="0" w:line="220"/>
+              <w:jc w:val="center"/>
+            </w:pPr>
+            <w:r>
+              <w:rPr>
+                <w:b w:val="false"/>
+                <w:bCs w:val="false"/>
+                <w:color w:val="999999"/>
+                <w:sz w:val="16"/>
+                <w:szCs w:val="16"/>
+              </w:rPr>
+              <w:t xml:space="preserve">XXXXX</w:t>
+            </w:r>
+          </w:p>
+        </w:tc>
+        <w:tc>
+          <w:tcPr>
+            <w:tcW w:type="dxa" w:w="988"/>
+            <w:tcMar>
+              <w:top w:type="dxa" w:w="20"/>
+              <w:left w:type="dxa" w:w="60"/>
+              <w:bottom w:type="dxa" w:w="20"/>
+              <w:right w:type="dxa" w:w="40"/>
+            </w:tcMar>
+            <w:vAlign w:val="center"/>
+          </w:tcPr>
+          <w:p>
+            <w:pPr>
+              <w:spacing w:after="0" w:line="220"/>
+              <w:jc w:val="center"/>
+            </w:pPr>
+            <w:r>
+              <w:rPr>
+                <w:b w:val="false"/>
+                <w:bCs w:val="false"/>
+                <w:color w:val="999999"/>
+                <w:sz w:val="16"/>
+                <w:szCs w:val="16"/>
+              </w:rPr>
+              <w:t xml:space="preserve">XXXXX</w:t>
+            </w:r>
+          </w:p>
+        </w:tc>
+        <w:tc>
+          <w:tcPr>
+            <w:tcW w:type="dxa" w:w="988"/>
+            <w:tcMar>
+              <w:top w:type="dxa" w:w="20"/>
+              <w:left w:type="dxa" w:w="60"/>
+              <w:bottom w:type="dxa" w:w="20"/>
+              <w:right w:type="dxa" w:w="40"/>
+            </w:tcMar>
+            <w:vAlign w:val="center"/>
+          </w:tcPr>
+          <w:p>
+            <w:pPr>
+              <w:spacing w:after="0" w:line="220"/>
+              <w:jc w:val="center"/>
+            </w:pPr>
+            <w:r>
+              <w:rPr>
+                <w:b w:val="false"/>
+                <w:bCs w:val="false"/>
+                <w:color w:val="999999"/>
+                <w:sz w:val="16"/>
+                <w:szCs w:val="16"/>
+              </w:rPr>
+              <w:t xml:space="preserve">XXXXX</w:t>
+            </w:r>
+          </w:p>
         </w:tc>
       </w:tr>
       <w:tr>
@@ -2515,33 +2560,78 @@
             </w:tcMar>
             <w:vAlign w:val="center"/>
           </w:tcPr>
-          <w:p/>
-        </w:tc>
-        <w:tc>
-          <w:tcPr>
-            <w:tcW w:type="dxa" w:w="988"/>
-            <w:tcMar>
-              <w:top w:type="dxa" w:w="20"/>
-              <w:left w:type="dxa" w:w="60"/>
-              <w:bottom w:type="dxa" w:w="20"/>
-              <w:right w:type="dxa" w:w="40"/>
-            </w:tcMar>
-            <w:vAlign w:val="center"/>
-          </w:tcPr>
-          <w:p/>
-        </w:tc>
-        <w:tc>
-          <w:tcPr>
-            <w:tcW w:type="dxa" w:w="988"/>
-            <w:tcMar>
-              <w:top w:type="dxa" w:w="20"/>
-              <w:left w:type="dxa" w:w="60"/>
-              <w:bottom w:type="dxa" w:w="20"/>
-              <w:right w:type="dxa" w:w="40"/>
-            </w:tcMar>
-            <w:vAlign w:val="center"/>
-          </w:tcPr>
-          <w:p/>
+          <w:p>
+            <w:pPr>
+              <w:spacing w:after="0" w:line="220"/>
+              <w:jc w:val="center"/>
+            </w:pPr>
+            <w:r>
+              <w:rPr>
+                <w:b w:val="false"/>
+                <w:bCs w:val="false"/>
+                <w:color w:val="999999"/>
+                <w:sz w:val="16"/>
+                <w:szCs w:val="16"/>
+              </w:rPr>
+              <w:t xml:space="preserve">XXXXX</w:t>
+            </w:r>
+          </w:p>
+        </w:tc>
+        <w:tc>
+          <w:tcPr>
+            <w:tcW w:type="dxa" w:w="988"/>
+            <w:tcMar>
+              <w:top w:type="dxa" w:w="20"/>
+              <w:left w:type="dxa" w:w="60"/>
+              <w:bottom w:type="dxa" w:w="20"/>
+              <w:right w:type="dxa" w:w="40"/>
+            </w:tcMar>
+            <w:vAlign w:val="center"/>
+          </w:tcPr>
+          <w:p>
+            <w:pPr>
+              <w:spacing w:after="0" w:line="220"/>
+              <w:jc w:val="center"/>
+            </w:pPr>
+            <w:r>
+              <w:rPr>
+                <w:b w:val="false"/>
+                <w:bCs w:val="false"/>
+                <w:color w:val="999999"/>
+                <w:sz w:val="16"/>
+                <w:szCs w:val="16"/>
+              </w:rPr>
+              <w:t xml:space="preserve">XXXXX</w:t>
+            </w:r>
+          </w:p>
+        </w:tc>
+        <w:tc>
+          <w:tcPr>
+            <w:tcW w:type="dxa" w:w="988"/>
+            <w:tcMar>
+              <w:top w:type="dxa" w:w="20"/>
+              <w:left w:type="dxa" w:w="60"/>
+              <w:bottom w:type="dxa" w:w="20"/>
+              <w:right w:type="dxa" w:w="40"/>
+            </w:tcMar>
+            <w:vAlign w:val="center"/>
+          </w:tcPr>
+          <w:p>
+            <w:pPr>
+              <w:spacing w:after="0" w:line="220"/>
+              <w:jc w:val="center"/>
+            </w:pPr>
+            <w:r>
+              <w:rPr>
+                <w:b w:val="false"/>
+                <w:bCs w:val="false"/>
+                <w:color w:val="999999"/>
+                <w:sz w:val="16"/>
+                <w:szCs w:val="16"/>
+              </w:rPr>
+              <w:t xml:space="preserve">XXXXX</w:t>
+            </w:r>
+          </w:p>
         </w:tc>
       </w:tr>
       <w:tr>
@@ -3032,7 +3122,21 @@
             </w:tcMar>
             <w:vAlign w:val="center"/>
           </w:tcPr>
-          <w:p/>
+          <w:p>
+            <w:pPr>
+              <w:spacing w:after="0" w:line="220"/>
+              <w:jc w:val="center"/>
+            </w:pPr>
+            <w:r>
+              <w:rPr>
+                <w:b/>
+                <w:bCs/>
+                <w:sz w:val="16"/>
+                <w:szCs w:val="16"/>
+              </w:rPr>
+              <w:t xml:space="preserve">15.00</w:t>
+            </w:r>
+          </w:p>
         </w:tc>
         <w:tc>
           <w:tcPr>
@@ -3523,20 +3627,50 @@
             </w:tcMar>
             <w:vAlign w:val="center"/>
           </w:tcPr>
-          <w:p/>
-        </w:tc>
-        <w:tc>
-          <w:tcPr>
-            <w:tcW w:type="dxa" w:w="988"/>
-            <w:tcMar>
-              <w:top w:type="dxa" w:w="20"/>
-              <w:left w:type="dxa" w:w="60"/>
-              <w:bottom w:type="dxa" w:w="20"/>
-              <w:right w:type="dxa" w:w="40"/>
-            </w:tcMar>
-            <w:vAlign w:val="center"/>
-          </w:tcPr>
-          <w:p/>
+          <w:p>
+            <w:pPr>
+              <w:spacing w:after="0" w:line="220"/>
+              <w:jc w:val="center"/>
+            </w:pPr>
+            <w:r>
+              <w:rPr>
+                <w:b w:val="false"/>
+                <w:bCs w:val="false"/>
+                <w:color w:val="999999"/>
+                <w:sz w:val="16"/>
+                <w:szCs w:val="16"/>
+              </w:rPr>
+              <w:t xml:space="preserve">XXXXX</w:t>
+            </w:r>
+          </w:p>
+        </w:tc>
+        <w:tc>
+          <w:tcPr>
+            <w:tcW w:type="dxa" w:w="988"/>
+            <w:tcMar>
+              <w:top w:type="dxa" w:w="20"/>
+              <w:left w:type="dxa" w:w="60"/>
+              <w:bottom w:type="dxa" w:w="20"/>
+              <w:right w:type="dxa" w:w="40"/>
+            </w:tcMar>
+            <w:vAlign w:val="center"/>
+          </w:tcPr>
+          <w:p>
+            <w:pPr>
+              <w:spacing w:after="0" w:line="220"/>
+              <w:jc w:val="center"/>
+            </w:pPr>
+            <w:r>
+              <w:rPr>
+                <w:b w:val="false"/>
+                <w:bCs w:val="false"/>
+                <w:color w:val="999999"/>
+                <w:sz w:val="16"/>
+                <w:szCs w:val="16"/>
+              </w:rPr>
+              <w:t xml:space="preserve">XXXXX</w:t>
+            </w:r>
+          </w:p>
         </w:tc>
       </w:tr>
       <w:tr>
@@ -4457,7 +4591,21 @@
             </w:tcMar>
             <w:vAlign w:val="center"/>
           </w:tcPr>
-          <w:p/>
+          <w:p>
+            <w:pPr>
+              <w:spacing w:after="0" w:line="220"/>
+              <w:jc w:val="center"/>
+            </w:pPr>
+            <w:r>
+              <w:rPr>
+                <w:b/>
+                <w:bCs/>
+                <w:sz w:val="16"/>
+                <w:szCs w:val="16"/>
+              </w:rPr>
+              <w:t xml:space="preserve">10.00</w:t>
+            </w:r>
+          </w:p>
         </w:tc>
       </w:tr>
     </w:tbl>
@@ -4935,7 +5083,21 @@
             </w:tcMar>
             <w:vAlign w:val="center"/>
           </w:tcPr>
-          <w:p/>
+          <w:p>
+            <w:pPr>
+              <w:spacing w:after="0" w:line="220"/>
+              <w:jc w:val="center"/>
+            </w:pPr>
+            <w:r>
+              <w:rPr>
+                <w:b/>
+                <w:bCs/>
+                <w:sz w:val="16"/>
+                <w:szCs w:val="16"/>
+              </w:rPr>
+              <w:t xml:space="preserve">10.00</w:t>
+            </w:r>
+          </w:p>
         </w:tc>
         <w:tc>
           <w:tcPr>
@@ -5275,7 +5437,21 @@
             </w:tcMar>
             <w:vAlign w:val="center"/>
           </w:tcPr>
-          <w:p/>
+          <w:p>
+            <w:pPr>
+              <w:spacing w:after="0" w:line="220"/>
+              <w:jc w:val="center"/>
+            </w:pPr>
+            <w:r>
+              <w:rPr>
+                <w:b/>
+                <w:bCs/>
+                <w:sz w:val="16"/>
+                <w:szCs w:val="16"/>
+              </w:rPr>
+              <w:t xml:space="preserve">16.00</w:t>
+            </w:r>
+          </w:p>
         </w:tc>
         <w:tc>
           <w:tcPr>
@@ -6002,20 +6178,50 @@
             </w:tcMar>
             <w:vAlign w:val="center"/>
           </w:tcPr>
-          <w:p/>
-        </w:tc>
-        <w:tc>
-          <w:tcPr>
-            <w:tcW w:type="dxa" w:w="988"/>
-            <w:tcMar>
-              <w:top w:type="dxa" w:w="20"/>
-              <w:left w:type="dxa" w:w="60"/>
-              <w:bottom w:type="dxa" w:w="20"/>
-              <w:right w:type="dxa" w:w="40"/>
-            </w:tcMar>
-            <w:vAlign w:val="center"/>
-          </w:tcPr>
-          <w:p/>
+          <w:p>
+            <w:pPr>
+              <w:spacing w:after="0" w:line="220"/>
+              <w:jc w:val="center"/>
+            </w:pPr>
+            <w:r>
+              <w:rPr>
+                <w:b w:val="false"/>
+                <w:bCs w:val="false"/>
+                <w:color w:val="999999"/>
+                <w:sz w:val="16"/>
+                <w:szCs w:val="16"/>
+              </w:rPr>
+              <w:t xml:space="preserve">XXXXX</w:t>
+            </w:r>
+          </w:p>
+        </w:tc>
+        <w:tc>
+          <w:tcPr>
+            <w:tcW w:type="dxa" w:w="988"/>
+            <w:tcMar>
+              <w:top w:type="dxa" w:w="20"/>
+              <w:left w:type="dxa" w:w="60"/>
+              <w:bottom w:type="dxa" w:w="20"/>
+              <w:right w:type="dxa" w:w="40"/>
+            </w:tcMar>
+            <w:vAlign w:val="center"/>
+          </w:tcPr>
+          <w:p>
+            <w:pPr>
+              <w:spacing w:after="0" w:line="220"/>
+              <w:jc w:val="center"/>
+            </w:pPr>
+            <w:r>
+              <w:rPr>
+                <w:b w:val="false"/>
+                <w:bCs w:val="false"/>
+                <w:color w:val="999999"/>
+                <w:sz w:val="16"/>
+                <w:szCs w:val="16"/>
+              </w:rPr>
+              <w:t xml:space="preserve">XXXXX</w:t>
+            </w:r>
+          </w:p>
         </w:tc>
       </w:tr>
     </w:tbl>
@@ -6031,7 +6237,7 @@
           <w:sz w:val="15"/>
           <w:szCs w:val="15"/>
         </w:rPr>
-        <w:t xml:space="preserve">NC = match à programmer (horaire non communiqué). XXXXX = éliminé du tableau. Relevé AFT du 29/10/2026 ; tableaux Grade 3 (poules) inclus.</w:t>
+        <w:t xml:space="preserve">NC = match à programmer (horaire non communiqué). XXXXX = éliminé du tableau. Relevé AFT du 30/10/2026 ; tableaux Grade 3 (poules) inclus.</w:t>
       </w:r>
     </w:p>
     <w:sectPr>

</xml_diff>